<commit_message>
Publish approved natural-language simulation review
Replace the prior report with the approved 10-page edition, retain readable body type, use natural pagination, and explain the actual troubleshooting decisions in a more natural voice. Keep all stage2 laptop materials local.
</commit_message>
<xml_diff>
--- a/ACT仿真/reports/ACT仿真训练复现与调参复盘_修订版.docx
+++ b/ACT仿真/reports/ACT仿真训练复现与调参复盘_修订版.docx
@@ -18,7 +18,7 @@
     </w:p>
     <w:p>
       <w:pPr>
-        <w:spacing w:after="140" w:line="360" w:lineRule="exact"/>
+        <w:spacing w:after="100" w:line="360" w:lineRule="exact"/>
       </w:pPr>
       <w:r>
         <w:rPr>
@@ -32,7 +32,7 @@
     </w:p>
     <w:p>
       <w:pPr>
-        <w:spacing w:after="140" w:line="360" w:lineRule="exact"/>
+        <w:spacing w:after="100" w:line="360" w:lineRule="exact"/>
       </w:pPr>
       <w:r>
         <w:rPr>
@@ -41,12 +41,12 @@
           <w:color w:val="000000"/>
           <w:sz w:val="23"/>
         </w:rPr>
-        <w:t>这份记录回答一个具体问题：已经下载了B601的公开ACT模型，为什么它仍然抓不起我们在MuJoCo中摆放的红块，我们又怎样把它逐步改进到能够处理新的摆放位置。</w:t>
+        <w:t>这个项目想做的事很直接：把B601公开ACT模型接进MuJoCo，先跑通红块入灰盒，再考虑自己的机械臂。真正做起来，却先后遇到抓不起来、靠近后不闭爪、原位成功但挪位失败。这里按实际经过，讲我们查了什么、为什么改，以及哪些尝试没有带来预期结果。</w:t>
       </w:r>
     </w:p>
     <w:p>
       <w:pPr>
-        <w:spacing w:after="140" w:line="360" w:lineRule="exact"/>
+        <w:spacing w:after="100" w:line="360" w:lineRule="exact"/>
       </w:pPr>
       <w:r>
         <w:rPr>
@@ -55,13 +55,22 @@
           <w:color w:val="000000"/>
           <w:sz w:val="23"/>
         </w:rPr>
-        <w:t>起初，我们把机械臂型号相近、任务看起来相似，当成了可直接迁移的条件。实际闭环中，场景外观、观察与动作的对应、夹爪动作相位和位置覆盖都会影响结果。后续工作因此分成几步：先让物理任务成立，再解决单点执行，接着扩充位置示范，最后以完整抓放结果选择模型。</w:t>
+        <w:t>任务看起来相似，画面和动作的对应关系却未必相同。我们先让夹爪在物理仿真里抓住红块，再查执行循环、补位置示范，最后把训练指标和完整抓放放在一起看。</w:t>
       </w:r>
     </w:p>
     <w:p>
       <w:pPr>
-        <w:spacing w:after="140" w:line="360" w:lineRule="exact"/>
+        <w:spacing w:after="100" w:line="360" w:lineRule="exact"/>
       </w:pPr>
+      <w:r>
+        <w:rPr>
+          <w:rFonts w:ascii="Arial" w:hAnsi="Arial" w:eastAsia="Microsoft YaHei"/>
+          <w:b w:val="0"/>
+          <w:color w:val="000000"/>
+          <w:sz w:val="23"/>
+        </w:rPr>
+        <w:t xml:space="preserve">最后选用的是连续5000步实验中的 </w:t>
+      </w:r>
       <w:r>
         <w:rPr>
           <w:rFonts w:ascii="Arial" w:hAnsi="Arial" w:eastAsia="Microsoft YaHei"/>
@@ -69,7 +78,7 @@
           <w:color w:val="000000"/>
           <w:sz w:val="23"/>
         </w:rPr>
-        <w:t>本阶段最终结果</w:t>
+        <w:t>step3000＋ensemble1</w:t>
       </w:r>
       <w:r>
         <w:rPr>
@@ -78,11 +87,12 @@
           <w:color w:val="000000"/>
           <w:sz w:val="23"/>
         </w:rPr>
-        <w:t>是连续5000步实验中的step3000搭配ensemble1：原位1/1、四个验证位置4/4；冻结选择后，预先保留八点8/8，用户随后另加一点1/1。它证明固定仿真条件内的局部XY适应能力；物体、相机和动力学仍然固定。</w:t>
+        <w:t>：原位1/1、四个验证位置4/4；选定后再测预先保留的八个位置，得到8/8。后来又临时加了一点，单次成功1/1。这些成绩和后面的失败记录一起，构成了这次复盘的依据。</w:t>
       </w:r>
     </w:p>
     <w:p>
       <w:pPr>
+        <w:keepNext/>
         <w:spacing w:line="240" w:lineRule="auto" w:after="40"/>
         <w:jc w:val="center"/>
       </w:pPr>
@@ -123,6 +133,8 @@
     </w:p>
     <w:p>
       <w:pPr>
+        <w:keepLines/>
+        <w:spacing w:line="280" w:lineRule="exact"/>
         <w:jc w:val="center"/>
       </w:pPr>
       <w:r>
@@ -137,7 +149,7 @@
     </w:p>
     <w:p>
       <w:pPr>
-        <w:spacing w:after="140" w:line="360" w:lineRule="exact"/>
+        <w:spacing w:after="100" w:line="360" w:lineRule="exact"/>
       </w:pPr>
       <w:r>
         <w:rPr>
@@ -146,12 +158,12 @@
           <w:color w:val="000000"/>
           <w:sz w:val="23"/>
         </w:rPr>
-        <w:t>ACT接收两路RGB和七维关节状态，直接预测未来100行七维动作。它没有单独输出“红块识别成功”的检测结果。示范动作在训练时提供监督，推理时只读取观察；图中的接触动力学产生下一份观察，而不是把示范轨迹直接交给策略执行。</w:t>
+        <w:t>图中的循环贯穿后面的排错：ACT接收两路RGB和七维关节状态，预测未来100行七维动作；执行后，运动和接触又改变下一帧画面。示范动作只在训练时充当答案，推理时由模型自己预测。它没有单独输出“红块识别成功”的检测结果，我们因此要把画面、预测和实际接触一起看。</w:t>
       </w:r>
     </w:p>
     <w:p>
       <w:pPr>
-        <w:spacing w:after="140" w:line="360" w:lineRule="exact"/>
+        <w:spacing w:after="100" w:line="360" w:lineRule="exact"/>
       </w:pPr>
       <w:r>
         <w:rPr>
@@ -160,12 +172,12 @@
           <w:color w:val="000000"/>
           <w:sz w:val="23"/>
         </w:rPr>
-        <w:t>全文先按实际迭代顺序解释为什么失败、为什么改动，再展开数据、损失函数、超参数和验证方法。episode指一次完整示范，batch指一次更新选取的观察起点数，training step指一次参数更新；它们与机械臂的控制频率不同。</w:t>
+        <w:t>前两节先讲排错经过，再展开数据、损失和参数。episode是一次完整示范，batch是一次更新选取的观察起点数，training step是一次参数更新；30 Hz则是动作频率。</w:t>
       </w:r>
     </w:p>
     <w:p>
       <w:pPr>
-        <w:spacing w:after="140" w:line="360" w:lineRule="exact"/>
+        <w:spacing w:after="100" w:line="360" w:lineRule="exact"/>
       </w:pPr>
       <w:r>
         <w:rPr>
@@ -214,13 +226,12 @@
           <w:color w:val="000000"/>
           <w:sz w:val="20"/>
         </w:rPr>
-        <w:t>。本报告不含视频附件或视频链接。</w:t>
+        <w:t>。</w:t>
       </w:r>
     </w:p>
     <w:p>
       <w:pPr>
         <w:pStyle w:val="Heading1"/>
-        <w:pageBreakBefore/>
       </w:pPr>
       <w:r>
         <w:rPr>
@@ -243,12 +254,12 @@
           <w:color w:val="000000"/>
           <w:sz w:val="25"/>
         </w:rPr>
-        <w:t>最初采用的路线</w:t>
+        <w:t>先让仿真里的抓取成立</w:t>
       </w:r>
     </w:p>
     <w:p>
       <w:pPr>
-        <w:spacing w:after="140" w:line="360" w:lineRule="exact"/>
+        <w:spacing w:after="100" w:line="360" w:lineRule="exact"/>
       </w:pPr>
       <w:r>
         <w:rPr>
@@ -257,12 +268,12 @@
           <w:color w:val="000000"/>
           <w:sz w:val="23"/>
         </w:rPr>
-        <w:t>我们先使用公开的B601真实演示和ACT权重，再在本地真实数据上续训1000步，并把模型接入重建的仿真环境。最初希望沿用已有模型完成“抓红块并放进灰盒”，减少重新采集和训练的成本。</w:t>
+        <w:t>我们下载公开的B601真实演示和ACT权重，在本机用这份数据续训1000步，再接入重建的仿真，希望借助已有模型减少从头采集和训练的工作。</w:t>
       </w:r>
     </w:p>
     <w:p>
       <w:pPr>
-        <w:spacing w:after="140" w:line="360" w:lineRule="exact"/>
+        <w:spacing w:after="100" w:line="360" w:lineRule="exact"/>
       </w:pPr>
       <w:r>
         <w:rPr>
@@ -271,12 +282,12 @@
           <w:color w:val="000000"/>
           <w:sz w:val="23"/>
         </w:rPr>
-        <w:t>第一轮只显示关节姿态与预测轨迹，物体没有真实抓起。这类qpos回放能够检查角度和模型姿态，却不能证明夹爪通过接触把物体带起来。我们因此补上了接触动力学、关节跟踪和任务评分，让成功与失败都有可检查的物理定义。</w:t>
+        <w:t>但第一轮只是在显示关节姿态与预测轨迹，红块并没有被夹起来。qpos回放适合检查角度和姿态，真正抓取还要靠手指与物体的接触。于是我们补上接触动力学、关节跟踪和任务评分，开始检查物体是否被抬起、是否入盒、最后是否放稳。</w:t>
       </w:r>
     </w:p>
     <w:p>
       <w:pPr>
-        <w:spacing w:after="140" w:line="360" w:lineRule="exact"/>
+        <w:spacing w:after="100" w:line="360" w:lineRule="exact"/>
       </w:pPr>
       <w:r>
         <w:rPr>
@@ -285,7 +296,35 @@
           <w:color w:val="000000"/>
           <w:sz w:val="23"/>
         </w:rPr>
-        <w:t>物理闭环建立后，公开原始权重和真实数据续训1000步的权重，在重建场景的原位试次仍均未完成抓放。这个结果首先暴露了迁移条件没有对齐；它不能单凭一段失败动画就证明ACT没有看图，或证明原模型已经忘掉了抓取。</w:t>
+        <w:t>加上物理之后，公开原始权重和真实数据续训1000步的权重，在原位仍没有完成抓放。我们先把注意力放回仿真本身：相机看到的内容、关节角度的含义、夹爪开度和接触条件，是否真的与来源数据对得上？直接继续训练，暂时回答不了这些问题。</w:t>
+      </w:r>
+    </w:p>
+    <w:p>
+      <w:pPr>
+        <w:spacing w:after="100" w:line="360" w:lineRule="exact"/>
+      </w:pPr>
+      <w:r>
+        <w:rPr>
+          <w:rFonts w:ascii="Arial" w:hAnsi="Arial" w:eastAsia="Microsoft YaHei"/>
+          <w:b w:val="0"/>
+          <w:color w:val="000000"/>
+          <w:sz w:val="23"/>
+        </w:rPr>
+        <w:t>我们先固定道具尺寸和两路相机，再核对公开关节角度、夹爪开度与仿真坐标。从公开episode 0的实测状态出发，生成403帧物理教师，并调整放置时的松爪目标。这一次教师完成了抓取和入盒，我们才有了把握：至少在这套场景与控制器里，任务本身做得成。接下来要解决的是让ACT学会做。</w:t>
+      </w:r>
+    </w:p>
+    <w:p>
+      <w:pPr>
+        <w:spacing w:after="100" w:line="360" w:lineRule="exact"/>
+      </w:pPr>
+      <w:r>
+        <w:rPr>
+          <w:rFonts w:ascii="Arial" w:hAnsi="Arial" w:eastAsia="Microsoft YaHei"/>
+          <w:b w:val="0"/>
+          <w:color w:val="000000"/>
+          <w:sz w:val="23"/>
+        </w:rPr>
+        <w:t>有了这条成功示范，我们在真实数据续训1000步的权重上再训练300步，记作sim300。batch为2、学习率1e-5，参数为FP32，前向使用BF16 autocast。这300步学习的，是当前仿真里的画面、状态与动作怎样对应。</w:t>
       </w:r>
     </w:p>
     <w:p>
@@ -299,12 +338,12 @@
           <w:color w:val="000000"/>
           <w:sz w:val="25"/>
         </w:rPr>
-        <w:t>复盘后先改什么</w:t>
+        <w:t>靠近以后为什么没有闭爪</w:t>
       </w:r>
     </w:p>
     <w:p>
       <w:pPr>
-        <w:spacing w:after="140" w:line="360" w:lineRule="exact"/>
+        <w:spacing w:after="100" w:line="360" w:lineRule="exact"/>
       </w:pPr>
       <w:r>
         <w:rPr>
@@ -313,12 +352,12 @@
           <w:color w:val="000000"/>
           <w:sz w:val="23"/>
         </w:rPr>
-        <w:t>我们先固定平顶40×40×20 mm红块、120×120×50 mm灰盒与相机，再核对公开关节角度、夹爪开度和仿真坐标。接着从公开episode 0的实测状态生成403帧物理教师，并调整放置时的松爪目标。教师完整抓放成功，说明这套场景与控制器具备完成任务的基本条件。</w:t>
+        <w:t>适配之后，机械臂会靠近目标，却迟迟不闭爪。我们没有立刻再加训练，而是翻出模型预测的整段动作：闭爪其实在动作块较后的位置。问题是，当时只执行前10步就重新计算，后面的闭爪动作一次次被丢掉了。</w:t>
       </w:r>
     </w:p>
     <w:p>
       <w:pPr>
-        <w:spacing w:after="140" w:line="360" w:lineRule="exact"/>
+        <w:spacing w:after="100" w:line="360" w:lineRule="exact"/>
       </w:pPr>
       <w:r>
         <w:rPr>
@@ -327,26 +366,12 @@
           <w:color w:val="000000"/>
           <w:sz w:val="23"/>
         </w:rPr>
-        <w:t>有了成立的教师，才继续进行单点sim300适配：在已有真实续训1000步权重上新增300次更新，batch为2、学习率1e-5，参数保持FP32，前向采用BF16 autocast。这个阶段让模型学习重建后的观察和动作关系。</w:t>
+        <w:t>同一模型、同一场景，恢复为100步执行后，原位抓放成功，红块抬升约94.69 mm。这次有清楚的前后对照：模型已经给出了后续动作，是执行循环没让它走到那里。</w:t>
       </w:r>
     </w:p>
     <w:p>
       <w:pPr>
-        <w:pStyle w:val="Heading2"/>
-      </w:pPr>
-      <w:r>
-        <w:rPr>
-          <w:rFonts w:ascii="Arial" w:hAnsi="Arial" w:eastAsia="Microsoft YaHei"/>
-          <w:b/>
-          <w:color w:val="000000"/>
-          <w:sz w:val="25"/>
-        </w:rPr>
-        <w:t>第一次明确定位到执行循环问题</w:t>
-      </w:r>
-    </w:p>
-    <w:p>
-      <w:pPr>
-        <w:spacing w:after="140" w:line="360" w:lineRule="exact"/>
+        <w:spacing w:after="100" w:line="360" w:lineRule="exact"/>
       </w:pPr>
       <w:r>
         <w:rPr>
@@ -355,50 +380,12 @@
           <w:color w:val="000000"/>
           <w:sz w:val="23"/>
         </w:rPr>
-        <w:t>适配后仍出现“靠近目标却迟迟不闭爪”。检查保存的动作块发现，闭爪在预测块较后的位置；当时每次只执行前10步就重新计算，后面的闭爪动作被反复丢弃。</w:t>
-      </w:r>
-    </w:p>
-    <w:p>
-      <w:pPr>
-        <w:spacing w:after="140" w:line="360" w:lineRule="exact"/>
-      </w:pPr>
-      <w:r>
-        <w:rPr>
-          <w:rFonts w:ascii="Arial" w:hAnsi="Arial" w:eastAsia="Microsoft YaHei"/>
-          <w:b w:val="0"/>
-          <w:color w:val="000000"/>
-          <w:sz w:val="23"/>
-        </w:rPr>
-        <w:t>保持同一模型和同一场景，将执行长度恢复为100步后，原位抓放成功，红块抬升约94.69 mm。这一改动有直接的前后证据：故障出在动作相位与执行队列的配合，而不应先靠增加训练步数解决。</w:t>
-      </w:r>
-    </w:p>
-    <w:p>
-      <w:pPr>
-        <w:spacing w:after="140" w:line="360" w:lineRule="exact"/>
-      </w:pPr>
-      <w:r>
-        <w:rPr>
-          <w:rFonts w:ascii="Arial" w:hAnsi="Arial" w:eastAsia="Microsoft YaHei"/>
-          <w:b/>
-          <w:color w:val="000000"/>
-          <w:sz w:val="23"/>
-        </w:rPr>
-        <w:t>这一轮得到的判断</w:t>
-      </w:r>
-      <w:r>
-        <w:rPr>
-          <w:rFonts w:ascii="Arial" w:hAnsi="Arial" w:eastAsia="Microsoft YaHei"/>
-          <w:b w:val="0"/>
-          <w:color w:val="000000"/>
-          <w:sz w:val="23"/>
-        </w:rPr>
-        <w:t>是：能预测动作与能完成动作并不是同一件事。复现时必须同时核对模型输出和控制循环。不过，100步成功只适用于当时的单点策略，不能推广为所有ACT都必须一次执行100步。</w:t>
+        <w:t>这件事让我们后来排错时多问了一句：是模型没有预测，还是预测了却没执行到？不过，100步解决的是当时那份单点策略的问题，不能由此推成所有ACT都应该一次执行100步。</w:t>
       </w:r>
     </w:p>
     <w:p>
       <w:pPr>
         <w:pStyle w:val="Heading1"/>
-        <w:pageBreakBefore/>
       </w:pPr>
       <w:r>
         <w:rPr>
@@ -426,7 +413,7 @@
     </w:p>
     <w:p>
       <w:pPr>
-        <w:spacing w:after="140" w:line="360" w:lineRule="exact"/>
+        <w:spacing w:after="100" w:line="360" w:lineRule="exact"/>
       </w:pPr>
       <w:r>
         <w:rPr>
@@ -435,12 +422,12 @@
           <w:color w:val="000000"/>
           <w:sz w:val="23"/>
         </w:rPr>
-        <w:t>原位成功后，我们冻结sim300，在五个新位置检查。结果为0/5，说明单条固定位置示范没有解决位置变化。相同初始关节状态下，图像变化确实会引起预测变化，所以现象更准确地说是“响应了观察，但没形成可靠抓放”，而不是已经证实网络完全忽略视觉。</w:t>
+        <w:t>原位能抓住了，下一步自然是把方块挪一挪。我们固定sim300和其他条件，只换方块的XY位置，五点结果是0/5。这里的单条示范，指最后新增的仿真示范；模型之前还学过公开真实数据。已有经验迁到这个重建场景后，仍然只在局部位置上奏效。</w:t>
       </w:r>
     </w:p>
     <w:p>
       <w:pPr>
-        <w:spacing w:after="140" w:line="360" w:lineRule="exact"/>
+        <w:spacing w:after="100" w:line="360" w:lineRule="exact"/>
       </w:pPr>
       <w:r>
         <w:rPr>
@@ -449,7 +436,21 @@
           <w:color w:val="000000"/>
           <w:sz w:val="23"/>
         </w:rPr>
-        <w:t>这次失败改变了训练目标。我们不再只追求原位动画成功，而是让抓取位置发生受控变化，并把完整位置回合分成训练、验证和最终测试。这样才能区分记住熟悉路径与对新位置作出有效调整。</w:t>
+        <w:t>检查首份预测时，相同初始关节状态配上不同位置的图像，输出确实变了，只是还没有变成有效抓放。后来把公开权重、真实续训1000步和sim300放进同一套六位置流程，前两者原位及其余五点均失败，sim300只有原位成功。这更支持“迁移只在局部成立”的判断，而不是直接认定最后300步把原来的能力忘掉了。</w:t>
+      </w:r>
+    </w:p>
+    <w:p>
+      <w:pPr>
+        <w:spacing w:after="100" w:line="360" w:lineRule="exact"/>
+      </w:pPr>
+      <w:r>
+        <w:rPr>
+          <w:rFonts w:ascii="Arial" w:hAnsi="Arial" w:eastAsia="Microsoft YaHei"/>
+          <w:b w:val="0"/>
+          <w:color w:val="000000"/>
+          <w:sz w:val="23"/>
+        </w:rPr>
+        <w:t>接下来的目标因此很具体：给模型更多位置上正确的抓放示范，并留出完整位置回合，看看它能否调整路径，而不只是重复熟悉的一条。</w:t>
       </w:r>
     </w:p>
     <w:p>
@@ -468,7 +469,7 @@
     </w:p>
     <w:p>
       <w:pPr>
-        <w:spacing w:after="140" w:line="360" w:lineRule="exact"/>
+        <w:spacing w:after="100" w:line="360" w:lineRule="exact"/>
       </w:pPr>
       <w:r>
         <w:rPr>
@@ -477,7 +478,7 @@
           <w:color w:val="000000"/>
           <w:sz w:val="23"/>
         </w:rPr>
-        <w:t>教师扩成25个训练位置和4个验证位置。随后几条分支尝试更长适配、数据整理以及恢复专家，保存结果如下。它们是各自独立的分支，不能把更新次数累加成一次连续训练。</w:t>
+        <w:t>我们把教师扩成25个训练位置和4个验证位置，随后试了延长适配、整理数据和补恢复示范。几条分支的结果放在一起看，更容易看清哪些改动没有带来预期改善；它们各自训练，更新次数分开计算。</w:t>
       </w:r>
     </w:p>
     <w:tbl>
@@ -509,8 +510,8 @@
             <w:tcW w:type="dxa" w:w="1814"/>
             <w:vAlign w:val="center"/>
             <w:tcMar>
-              <w:top w:w="100" w:type="dxa"/>
-              <w:bottom w:w="100" w:type="dxa"/>
+              <w:top w:w="80" w:type="dxa"/>
+              <w:bottom w:w="80" w:type="dxa"/>
               <w:left w:w="100" w:type="dxa"/>
               <w:right w:w="100" w:type="dxa"/>
             </w:tcMar>
@@ -518,6 +519,7 @@
           </w:tcPr>
           <w:p>
             <w:pPr>
+              <w:keepNext/>
               <w:spacing w:after="30" w:line="280" w:lineRule="exact"/>
             </w:pPr>
             <w:r>
@@ -536,8 +538,8 @@
             <w:tcW w:type="dxa" w:w="2835"/>
             <w:vAlign w:val="center"/>
             <w:tcMar>
-              <w:top w:w="100" w:type="dxa"/>
-              <w:bottom w:w="100" w:type="dxa"/>
+              <w:top w:w="80" w:type="dxa"/>
+              <w:bottom w:w="80" w:type="dxa"/>
               <w:left w:w="100" w:type="dxa"/>
               <w:right w:w="100" w:type="dxa"/>
             </w:tcMar>
@@ -545,6 +547,7 @@
           </w:tcPr>
           <w:p>
             <w:pPr>
+              <w:keepNext/>
               <w:spacing w:after="30" w:line="280" w:lineRule="exact"/>
             </w:pPr>
             <w:r>
@@ -563,8 +566,8 @@
             <w:tcW w:type="dxa" w:w="4876"/>
             <w:vAlign w:val="center"/>
             <w:tcMar>
-              <w:top w:w="100" w:type="dxa"/>
-              <w:bottom w:w="100" w:type="dxa"/>
+              <w:top w:w="80" w:type="dxa"/>
+              <w:bottom w:w="80" w:type="dxa"/>
               <w:left w:w="100" w:type="dxa"/>
               <w:right w:w="100" w:type="dxa"/>
             </w:tcMar>
@@ -572,6 +575,7 @@
           </w:tcPr>
           <w:p>
             <w:pPr>
+              <w:keepNext/>
               <w:spacing w:after="30" w:line="280" w:lineRule="exact"/>
             </w:pPr>
             <w:r>
@@ -581,7 +585,7 @@
                 <w:color w:val="000000"/>
                 <w:sz w:val="20"/>
               </w:rPr>
-              <w:t>保存的物理结果</w:t>
+              <w:t>实际抓放结果</w:t>
             </w:r>
           </w:p>
         </w:tc>
@@ -595,14 +599,15 @@
             <w:tcW w:type="dxa" w:w="1814"/>
             <w:vAlign w:val="center"/>
             <w:tcMar>
-              <w:top w:w="100" w:type="dxa"/>
-              <w:bottom w:w="100" w:type="dxa"/>
+              <w:top w:w="80" w:type="dxa"/>
+              <w:bottom w:w="80" w:type="dxa"/>
               <w:left w:w="100" w:type="dxa"/>
               <w:right w:w="100" w:type="dxa"/>
             </w:tcMar>
           </w:tcPr>
           <w:p>
             <w:pPr>
+              <w:keepNext w:val="0"/>
               <w:spacing w:after="30" w:line="280" w:lineRule="exact"/>
             </w:pPr>
             <w:r>
@@ -621,14 +626,15 @@
             <w:tcW w:type="dxa" w:w="2835"/>
             <w:vAlign w:val="center"/>
             <w:tcMar>
-              <w:top w:w="100" w:type="dxa"/>
-              <w:bottom w:w="100" w:type="dxa"/>
+              <w:top w:w="80" w:type="dxa"/>
+              <w:bottom w:w="80" w:type="dxa"/>
               <w:left w:w="100" w:type="dxa"/>
               <w:right w:w="100" w:type="dxa"/>
             </w:tcMar>
           </w:tcPr>
           <w:p>
             <w:pPr>
+              <w:keepNext w:val="0"/>
               <w:spacing w:after="30" w:line="280" w:lineRule="exact"/>
             </w:pPr>
             <w:r>
@@ -647,14 +653,15 @@
             <w:tcW w:type="dxa" w:w="4876"/>
             <w:vAlign w:val="center"/>
             <w:tcMar>
-              <w:top w:w="100" w:type="dxa"/>
-              <w:bottom w:w="100" w:type="dxa"/>
+              <w:top w:w="80" w:type="dxa"/>
+              <w:bottom w:w="80" w:type="dxa"/>
               <w:left w:w="100" w:type="dxa"/>
               <w:right w:w="100" w:type="dxa"/>
             </w:tcMar>
           </w:tcPr>
           <w:p>
             <w:pPr>
+              <w:keepNext w:val="0"/>
               <w:spacing w:after="30" w:line="280" w:lineRule="exact"/>
             </w:pPr>
             <w:r>
@@ -678,14 +685,15 @@
             <w:tcW w:type="dxa" w:w="1814"/>
             <w:vAlign w:val="center"/>
             <w:tcMar>
-              <w:top w:w="100" w:type="dxa"/>
-              <w:bottom w:w="100" w:type="dxa"/>
+              <w:top w:w="80" w:type="dxa"/>
+              <w:bottom w:w="80" w:type="dxa"/>
               <w:left w:w="100" w:type="dxa"/>
               <w:right w:w="100" w:type="dxa"/>
             </w:tcMar>
           </w:tcPr>
           <w:p>
             <w:pPr>
+              <w:keepNext w:val="0"/>
               <w:spacing w:after="30" w:line="280" w:lineRule="exact"/>
             </w:pPr>
             <w:r>
@@ -704,14 +712,15 @@
             <w:tcW w:type="dxa" w:w="2835"/>
             <w:vAlign w:val="center"/>
             <w:tcMar>
-              <w:top w:w="100" w:type="dxa"/>
-              <w:bottom w:w="100" w:type="dxa"/>
+              <w:top w:w="80" w:type="dxa"/>
+              <w:bottom w:w="80" w:type="dxa"/>
               <w:left w:w="100" w:type="dxa"/>
               <w:right w:w="100" w:type="dxa"/>
             </w:tcMar>
           </w:tcPr>
           <w:p>
             <w:pPr>
+              <w:keepNext w:val="0"/>
               <w:spacing w:after="30" w:line="280" w:lineRule="exact"/>
             </w:pPr>
             <w:r>
@@ -730,14 +739,15 @@
             <w:tcW w:type="dxa" w:w="4876"/>
             <w:vAlign w:val="center"/>
             <w:tcMar>
-              <w:top w:w="100" w:type="dxa"/>
-              <w:bottom w:w="100" w:type="dxa"/>
+              <w:top w:w="80" w:type="dxa"/>
+              <w:bottom w:w="80" w:type="dxa"/>
               <w:left w:w="100" w:type="dxa"/>
               <w:right w:w="100" w:type="dxa"/>
             </w:tcMar>
           </w:tcPr>
           <w:p>
             <w:pPr>
+              <w:keepNext w:val="0"/>
               <w:spacing w:after="30" w:line="280" w:lineRule="exact"/>
             </w:pPr>
             <w:r>
@@ -761,14 +771,15 @@
             <w:tcW w:type="dxa" w:w="1814"/>
             <w:vAlign w:val="center"/>
             <w:tcMar>
-              <w:top w:w="100" w:type="dxa"/>
-              <w:bottom w:w="100" w:type="dxa"/>
+              <w:top w:w="80" w:type="dxa"/>
+              <w:bottom w:w="80" w:type="dxa"/>
               <w:left w:w="100" w:type="dxa"/>
               <w:right w:w="100" w:type="dxa"/>
             </w:tcMar>
           </w:tcPr>
           <w:p>
             <w:pPr>
+              <w:keepNext w:val="0"/>
               <w:spacing w:after="30" w:line="280" w:lineRule="exact"/>
             </w:pPr>
             <w:r>
@@ -787,14 +798,15 @@
             <w:tcW w:type="dxa" w:w="2835"/>
             <w:vAlign w:val="center"/>
             <w:tcMar>
-              <w:top w:w="100" w:type="dxa"/>
-              <w:bottom w:w="100" w:type="dxa"/>
+              <w:top w:w="80" w:type="dxa"/>
+              <w:bottom w:w="80" w:type="dxa"/>
               <w:left w:w="100" w:type="dxa"/>
               <w:right w:w="100" w:type="dxa"/>
             </w:tcMar>
           </w:tcPr>
           <w:p>
             <w:pPr>
+              <w:keepNext w:val="0"/>
               <w:spacing w:after="30" w:line="280" w:lineRule="exact"/>
             </w:pPr>
             <w:r>
@@ -813,14 +825,15 @@
             <w:tcW w:type="dxa" w:w="4876"/>
             <w:vAlign w:val="center"/>
             <w:tcMar>
-              <w:top w:w="100" w:type="dxa"/>
-              <w:bottom w:w="100" w:type="dxa"/>
+              <w:top w:w="80" w:type="dxa"/>
+              <w:bottom w:w="80" w:type="dxa"/>
               <w:left w:w="100" w:type="dxa"/>
               <w:right w:w="100" w:type="dxa"/>
             </w:tcMar>
           </w:tcPr>
           <w:p>
             <w:pPr>
+              <w:keepNext w:val="0"/>
               <w:spacing w:after="30" w:line="280" w:lineRule="exact"/>
             </w:pPr>
             <w:r>
@@ -844,14 +857,15 @@
             <w:tcW w:type="dxa" w:w="1814"/>
             <w:vAlign w:val="center"/>
             <w:tcMar>
-              <w:top w:w="100" w:type="dxa"/>
-              <w:bottom w:w="100" w:type="dxa"/>
+              <w:top w:w="80" w:type="dxa"/>
+              <w:bottom w:w="80" w:type="dxa"/>
               <w:left w:w="100" w:type="dxa"/>
               <w:right w:w="100" w:type="dxa"/>
             </w:tcMar>
           </w:tcPr>
           <w:p>
             <w:pPr>
+              <w:keepNext w:val="0"/>
               <w:spacing w:after="30" w:line="280" w:lineRule="exact"/>
             </w:pPr>
             <w:r>
@@ -870,14 +884,15 @@
             <w:tcW w:type="dxa" w:w="2835"/>
             <w:vAlign w:val="center"/>
             <w:tcMar>
-              <w:top w:w="100" w:type="dxa"/>
-              <w:bottom w:w="100" w:type="dxa"/>
+              <w:top w:w="80" w:type="dxa"/>
+              <w:bottom w:w="80" w:type="dxa"/>
               <w:left w:w="100" w:type="dxa"/>
               <w:right w:w="100" w:type="dxa"/>
             </w:tcMar>
           </w:tcPr>
           <w:p>
             <w:pPr>
+              <w:keepNext w:val="0"/>
               <w:spacing w:after="30" w:line="280" w:lineRule="exact"/>
             </w:pPr>
             <w:r>
@@ -896,14 +911,15 @@
             <w:tcW w:type="dxa" w:w="4876"/>
             <w:vAlign w:val="center"/>
             <w:tcMar>
-              <w:top w:w="100" w:type="dxa"/>
-              <w:bottom w:w="100" w:type="dxa"/>
+              <w:top w:w="80" w:type="dxa"/>
+              <w:bottom w:w="80" w:type="dxa"/>
               <w:left w:w="100" w:type="dxa"/>
               <w:right w:w="100" w:type="dxa"/>
             </w:tcMar>
           </w:tcPr>
           <w:p>
             <w:pPr>
+              <w:keepNext w:val="0"/>
               <w:spacing w:after="30" w:line="280" w:lineRule="exact"/>
             </w:pPr>
             <w:r>
@@ -921,12 +937,7 @@
     </w:tbl>
     <w:p>
       <w:pPr>
-        <w:spacing w:after="20" w:line="120" w:lineRule="auto"/>
-      </w:pPr>
-    </w:p>
-    <w:p>
-      <w:pPr>
-        <w:spacing w:after="140" w:line="360" w:lineRule="exact"/>
+        <w:spacing w:after="100" w:line="360" w:lineRule="exact"/>
       </w:pPr>
       <w:r>
         <w:rPr>
@@ -935,7 +946,35 @@
           <w:color w:val="000000"/>
           <w:sz w:val="23"/>
         </w:rPr>
-        <w:t>v2末期的离线动作MAE已降到约1.535度，物理抓放却仍为0/4。我们的判断是，示范状态上的动作拟合不能代替闭环行为：策略稍微偏离教师后，下一帧画面与状态就会变化，后续的对准、闭爪和抬升可能一起偏离。恢复专家自身能成功，也不等于学生已经学会恢复。</w:t>
+        <w:t>v1一度把四位置验证改善到2/4，但在当轮提前保留的六点仍是0/6。这里与前面的0/5是两组位置：那五个旧诊断点，v1后来得到1/5。我们把两组分开记，避免只挑成功的一点来说明进步。</w:t>
+      </w:r>
+    </w:p>
+    <w:p>
+      <w:pPr>
+        <w:spacing w:after="100" w:line="360" w:lineRule="exact"/>
+      </w:pPr>
+      <w:r>
+        <w:rPr>
+          <w:rFonts w:ascii="Arial" w:hAnsi="Arial" w:eastAsia="Microsoft YaHei"/>
+          <w:b w:val="0"/>
+          <w:color w:val="000000"/>
+          <w:sz w:val="23"/>
+        </w:rPr>
+        <w:t>更值得注意的是v2：离线动作MAE已经降到约1.535度，四位置抓放却退回0/4。对照轨迹时，合拢阶段出现约18～20 mm的Y方向残差，空夹后下一段又要求张爪。这是与教师对应阶段的路径差，尚不能直接当作视觉定位误差，但它指出了实际失败发生在哪里。</w:t>
+      </w:r>
+    </w:p>
+    <w:p>
+      <w:pPr>
+        <w:spacing w:after="100" w:line="360" w:lineRule="exact"/>
+      </w:pPr>
+      <w:r>
+        <w:rPr>
+          <w:rFonts w:ascii="Arial" w:hAnsi="Arial" w:eastAsia="Microsoft YaHei"/>
+          <w:b w:val="0"/>
+          <w:color w:val="000000"/>
+          <w:sz w:val="23"/>
+        </w:rPr>
+        <w:t>我们的理解也随之改变：在教师给定的状态上答得更准，未必能处理自己执行后出现的新状态。我们又补了22条成功恢复专家，所评估模型仍是0/4。这些尝试至少提醒我们，继续降离线误差，或给专家多做一些成功动作，都还没有解决学生的闭环问题。</w:t>
       </w:r>
     </w:p>
     <w:p>
@@ -949,12 +988,12 @@
           <w:color w:val="000000"/>
           <w:sz w:val="25"/>
         </w:rPr>
-        <w:t>新一轮采用的处理方法</w:t>
+        <w:t>重新组织一轮训练和验证</w:t>
       </w:r>
     </w:p>
     <w:p>
       <w:pPr>
-        <w:spacing w:after="140" w:line="360" w:lineRule="exact"/>
+        <w:spacing w:after="100" w:line="360" w:lineRule="exact"/>
       </w:pPr>
       <w:r>
         <w:rPr>
@@ -963,12 +1002,12 @@
           <w:color w:val="000000"/>
           <w:sz w:val="23"/>
         </w:rPr>
-        <w:t>最后从sim300重新开始连续5000步实验，实际batch改为8、学习率改为1e-5，每1000步保存模型。训练完成后，把每个候选放进同一套原位和四位置验证，比较chunk100与逐帧重算的ensemble1，而不再只看训练loss。</w:t>
+        <w:t>这时我们没有继续接着失败分支往下训，而是回到sim300，重新做一条连续5000步实验：batch改为8、学习率改为1e-5，每1000步保留模型。每份候选都放回同一套原位和四位置流程，同时比较chunk100与逐帧重算、融合重叠预测的ensemble1。这样，选的既是权重，也是它实际怎样执行。</w:t>
       </w:r>
     </w:p>
     <w:p>
       <w:pPr>
-        <w:spacing w:after="140" w:line="360" w:lineRule="exact"/>
+        <w:spacing w:after="100" w:line="360" w:lineRule="exact"/>
       </w:pPr>
       <w:r>
         <w:rPr>
@@ -977,12 +1016,12 @@
           <w:color w:val="000000"/>
           <w:sz w:val="23"/>
         </w:rPr>
-        <w:t>最终step2000与step3000的ensemble1均为4/4；按预定同分规则，验证误差更低的step3000被选中，再冻结模型与执行模式检查八个新位置，得到8/8。</w:t>
+        <w:t>这轮有两份候选完成了四点验证：step2000和step3000搭配ensemble1都为4/4。我们按提前写好的规则选择验证误差更低的step3000，之后才检查八个保留位置。选模过程和最终结果见第6、8节。</w:t>
       </w:r>
     </w:p>
     <w:p>
       <w:pPr>
-        <w:spacing w:after="140" w:line="360" w:lineRule="exact"/>
+        <w:spacing w:after="100" w:line="360" w:lineRule="exact"/>
       </w:pPr>
       <w:r>
         <w:rPr>
@@ -991,13 +1030,12 @@
           <w:color w:val="000000"/>
           <w:sz w:val="23"/>
         </w:rPr>
-        <w:t>这里同时改变了训练预算、batch、学习率和反馈方式，没有做完整的逐项消融。因此可以说“这套联合方案在本任务中有效”，不能说某一个参数已被证明是成功的唯一原因。选定分支为公开权重→真实续训1000→sim300→新分支step3000，累计仿真适配3300步，优化器状态重新建立。</w:t>
+        <w:t>这轮同时调整了训练预算、batch、学习率和反馈方式，没有做完整的逐项消融。结果说明这套组合在当前任务中有效，还不能把功劳单独归给某一个参数。最终权重的来源是公开权重→真实续训1000→sim300→新分支step3000，累计仿真适配3300步；这一分支加载权重后重新建立优化器状态。</w:t>
       </w:r>
     </w:p>
     <w:p>
       <w:pPr>
         <w:pStyle w:val="Heading1"/>
-        <w:pageBreakBefore/>
       </w:pPr>
       <w:r>
         <w:rPr>
@@ -1011,7 +1049,7 @@
     </w:p>
     <w:p>
       <w:pPr>
-        <w:spacing w:after="140" w:line="360" w:lineRule="exact"/>
+        <w:spacing w:after="100" w:line="360" w:lineRule="exact"/>
       </w:pPr>
       <w:r>
         <w:rPr>
@@ -1020,12 +1058,12 @@
           <w:color w:val="000000"/>
           <w:sz w:val="23"/>
         </w:rPr>
-        <w:t>前两轮排错说明，数据既要覆盖位置变化，也要在图像、状态和动作之间建立正确对应。本节把教师如何生成、哪些位置用于训练、哪些位置留给验证说清楚。</w:t>
+        <w:t>前面多次提到“补示范”，这里把它摊开讲。真正要补的不是更多红块图片，而是在不同位置看到这样的画面时，机械臂应该怎样接近、闭爪、抬起和放下。</w:t>
       </w:r>
     </w:p>
     <w:p>
       <w:pPr>
-        <w:spacing w:after="140" w:line="360" w:lineRule="exact"/>
+        <w:spacing w:after="100" w:line="360" w:lineRule="exact"/>
       </w:pPr>
       <w:r>
         <w:rPr>
@@ -1034,12 +1072,12 @@
           <w:color w:val="000000"/>
           <w:sz w:val="23"/>
         </w:rPr>
-        <w:t>场景固定为平顶红块40×40×20 mm、灰盒外120×120×50 mm、壁和底各4 mm；顶部与腕部相机也固定。尺寸是本项目约定，不是原数据作者公布的实物规格。固定条件后，才能判断后续成绩变化来自什么。</w:t>
+        <w:t>平顶红块定为40×40×20 mm，灰盒外尺寸120×120×50 mm，壁和底各4 mm，两路相机也固定。这是本项目选定的尺寸，并非来源实物的测量值。之后不再随结果改大小，省得把任务变容易误当成算法进步。</w:t>
       </w:r>
     </w:p>
     <w:p>
       <w:pPr>
-        <w:spacing w:after="140" w:line="360" w:lineRule="exact"/>
+        <w:spacing w:after="100" w:line="360" w:lineRule="exact"/>
       </w:pPr>
       <w:r>
         <w:rPr>
@@ -1048,12 +1086,12 @@
           <w:color w:val="000000"/>
           <w:sz w:val="23"/>
         </w:rPr>
-        <w:t>先由物理教师完成403帧、30 Hz的成功抓放。动作由公开episode 0的实测state转换，并为40 mm红块调整放置时松爪，而非照搬原action列。教师成功只证明任务可完成，还不能算ACT会抓取。</w:t>
+        <w:t>403帧、30 Hz的物理教师，用公开episode 0的实测state转换成目标动作，再为40 mm红块调整放置松爪，并未直接照搬原action列。</w:t>
       </w:r>
     </w:p>
     <w:p>
       <w:pPr>
-        <w:spacing w:after="140" w:line="360" w:lineRule="exact"/>
+        <w:spacing w:after="100" w:line="360" w:lineRule="exact"/>
       </w:pPr>
       <w:r>
         <w:rPr>
@@ -1062,7 +1100,7 @@
           <w:color w:val="000000"/>
           <w:sz w:val="23"/>
         </w:rPr>
-        <w:t>随后用六关节Jacobian IK，把同一路径的接近、抓取和抬升阶段平移到25个位置，运输阶段平滑回到同一放置路径。这25条是合成位置变体，夹爪时序沿用源示范，不是25次独立人工示范。</w:t>
+        <w:t>随后用六关节Jacobian IK，把这条路径的接近、抓取和抬升部分移到25个位置，运输阶段再平滑接回同一放置路径。这样每个位置都有对应的动作答案。夹爪时序仍沿用源示范，所以这些是25条合成位置变体，不是25次独立人工操作。</w:t>
       </w:r>
     </w:p>
     <w:tbl>
@@ -1094,8 +1132,8 @@
             <w:tcW w:type="dxa" w:w="1361"/>
             <w:vAlign w:val="center"/>
             <w:tcMar>
-              <w:top w:w="100" w:type="dxa"/>
-              <w:bottom w:w="100" w:type="dxa"/>
+              <w:top w:w="80" w:type="dxa"/>
+              <w:bottom w:w="80" w:type="dxa"/>
               <w:left w:w="100" w:type="dxa"/>
               <w:right w:w="100" w:type="dxa"/>
             </w:tcMar>
@@ -1103,6 +1141,7 @@
           </w:tcPr>
           <w:p>
             <w:pPr>
+              <w:keepNext/>
               <w:spacing w:after="30" w:line="280" w:lineRule="exact"/>
             </w:pPr>
             <w:r>
@@ -1121,8 +1160,8 @@
             <w:tcW w:type="dxa" w:w="5272"/>
             <w:vAlign w:val="center"/>
             <w:tcMar>
-              <w:top w:w="100" w:type="dxa"/>
-              <w:bottom w:w="100" w:type="dxa"/>
+              <w:top w:w="80" w:type="dxa"/>
+              <w:bottom w:w="80" w:type="dxa"/>
               <w:left w:w="100" w:type="dxa"/>
               <w:right w:w="100" w:type="dxa"/>
             </w:tcMar>
@@ -1130,6 +1169,7 @@
           </w:tcPr>
           <w:p>
             <w:pPr>
+              <w:keepNext/>
               <w:spacing w:after="30" w:line="280" w:lineRule="exact"/>
             </w:pPr>
             <w:r>
@@ -1148,8 +1188,8 @@
             <w:tcW w:type="dxa" w:w="2891"/>
             <w:vAlign w:val="center"/>
             <w:tcMar>
-              <w:top w:w="100" w:type="dxa"/>
-              <w:bottom w:w="100" w:type="dxa"/>
+              <w:top w:w="80" w:type="dxa"/>
+              <w:bottom w:w="80" w:type="dxa"/>
               <w:left w:w="100" w:type="dxa"/>
               <w:right w:w="100" w:type="dxa"/>
             </w:tcMar>
@@ -1157,6 +1197,7 @@
           </w:tcPr>
           <w:p>
             <w:pPr>
+              <w:keepNext/>
               <w:spacing w:after="30" w:line="280" w:lineRule="exact"/>
             </w:pPr>
             <w:r>
@@ -1180,14 +1221,15 @@
             <w:tcW w:type="dxa" w:w="1361"/>
             <w:vAlign w:val="center"/>
             <w:tcMar>
-              <w:top w:w="100" w:type="dxa"/>
-              <w:bottom w:w="100" w:type="dxa"/>
+              <w:top w:w="80" w:type="dxa"/>
+              <w:bottom w:w="80" w:type="dxa"/>
               <w:left w:w="100" w:type="dxa"/>
               <w:right w:w="100" w:type="dxa"/>
             </w:tcMar>
           </w:tcPr>
           <w:p>
             <w:pPr>
+              <w:keepNext w:val="0"/>
               <w:spacing w:after="30" w:line="280" w:lineRule="exact"/>
             </w:pPr>
             <w:r>
@@ -1206,14 +1248,15 @@
             <w:tcW w:type="dxa" w:w="5272"/>
             <w:vAlign w:val="center"/>
             <w:tcMar>
-              <w:top w:w="100" w:type="dxa"/>
-              <w:bottom w:w="100" w:type="dxa"/>
+              <w:top w:w="80" w:type="dxa"/>
+              <w:bottom w:w="80" w:type="dxa"/>
               <w:left w:w="100" w:type="dxa"/>
               <w:right w:w="100" w:type="dxa"/>
             </w:tcMar>
           </w:tcPr>
           <w:p>
             <w:pPr>
+              <w:keepNext w:val="0"/>
               <w:spacing w:after="30" w:line="280" w:lineRule="exact"/>
             </w:pPr>
             <w:r>
@@ -1232,14 +1275,15 @@
             <w:tcW w:type="dxa" w:w="2891"/>
             <w:vAlign w:val="center"/>
             <w:tcMar>
-              <w:top w:w="100" w:type="dxa"/>
-              <w:bottom w:w="100" w:type="dxa"/>
+              <w:top w:w="80" w:type="dxa"/>
+              <w:bottom w:w="80" w:type="dxa"/>
               <w:left w:w="100" w:type="dxa"/>
               <w:right w:w="100" w:type="dxa"/>
             </w:tcMar>
           </w:tcPr>
           <w:p>
             <w:pPr>
+              <w:keepNext w:val="0"/>
               <w:spacing w:after="30" w:line="280" w:lineRule="exact"/>
             </w:pPr>
             <w:r>
@@ -1263,14 +1307,15 @@
             <w:tcW w:type="dxa" w:w="1361"/>
             <w:vAlign w:val="center"/>
             <w:tcMar>
-              <w:top w:w="100" w:type="dxa"/>
-              <w:bottom w:w="100" w:type="dxa"/>
+              <w:top w:w="80" w:type="dxa"/>
+              <w:bottom w:w="80" w:type="dxa"/>
               <w:left w:w="100" w:type="dxa"/>
               <w:right w:w="100" w:type="dxa"/>
             </w:tcMar>
           </w:tcPr>
           <w:p>
             <w:pPr>
+              <w:keepNext w:val="0"/>
               <w:spacing w:after="30" w:line="280" w:lineRule="exact"/>
             </w:pPr>
             <w:r>
@@ -1289,14 +1334,15 @@
             <w:tcW w:type="dxa" w:w="5272"/>
             <w:vAlign w:val="center"/>
             <w:tcMar>
-              <w:top w:w="100" w:type="dxa"/>
-              <w:bottom w:w="100" w:type="dxa"/>
+              <w:top w:w="80" w:type="dxa"/>
+              <w:bottom w:w="80" w:type="dxa"/>
               <w:left w:w="100" w:type="dxa"/>
               <w:right w:w="100" w:type="dxa"/>
             </w:tcMar>
           </w:tcPr>
           <w:p>
             <w:pPr>
+              <w:keepNext w:val="0"/>
               <w:spacing w:after="30" w:line="280" w:lineRule="exact"/>
             </w:pPr>
             <w:r>
@@ -1315,14 +1361,15 @@
             <w:tcW w:type="dxa" w:w="2891"/>
             <w:vAlign w:val="center"/>
             <w:tcMar>
-              <w:top w:w="100" w:type="dxa"/>
-              <w:bottom w:w="100" w:type="dxa"/>
+              <w:top w:w="80" w:type="dxa"/>
+              <w:bottom w:w="80" w:type="dxa"/>
               <w:left w:w="100" w:type="dxa"/>
               <w:right w:w="100" w:type="dxa"/>
             </w:tcMar>
           </w:tcPr>
           <w:p>
             <w:pPr>
+              <w:keepNext w:val="0"/>
               <w:spacing w:after="30" w:line="280" w:lineRule="exact"/>
             </w:pPr>
             <w:r>
@@ -1346,14 +1393,15 @@
             <w:tcW w:type="dxa" w:w="1361"/>
             <w:vAlign w:val="center"/>
             <w:tcMar>
-              <w:top w:w="100" w:type="dxa"/>
-              <w:bottom w:w="100" w:type="dxa"/>
+              <w:top w:w="80" w:type="dxa"/>
+              <w:bottom w:w="80" w:type="dxa"/>
               <w:left w:w="100" w:type="dxa"/>
               <w:right w:w="100" w:type="dxa"/>
             </w:tcMar>
           </w:tcPr>
           <w:p>
             <w:pPr>
+              <w:keepNext w:val="0"/>
               <w:spacing w:after="30" w:line="280" w:lineRule="exact"/>
             </w:pPr>
             <w:r>
@@ -1372,14 +1420,15 @@
             <w:tcW w:type="dxa" w:w="5272"/>
             <w:vAlign w:val="center"/>
             <w:tcMar>
-              <w:top w:w="100" w:type="dxa"/>
-              <w:bottom w:w="100" w:type="dxa"/>
+              <w:top w:w="80" w:type="dxa"/>
+              <w:bottom w:w="80" w:type="dxa"/>
               <w:left w:w="100" w:type="dxa"/>
               <w:right w:w="100" w:type="dxa"/>
             </w:tcMar>
           </w:tcPr>
           <w:p>
             <w:pPr>
+              <w:keepNext w:val="0"/>
               <w:spacing w:after="30" w:line="280" w:lineRule="exact"/>
             </w:pPr>
             <w:r>
@@ -1398,14 +1447,15 @@
             <w:tcW w:type="dxa" w:w="2891"/>
             <w:vAlign w:val="center"/>
             <w:tcMar>
-              <w:top w:w="100" w:type="dxa"/>
-              <w:bottom w:w="100" w:type="dxa"/>
+              <w:top w:w="80" w:type="dxa"/>
+              <w:bottom w:w="80" w:type="dxa"/>
               <w:left w:w="100" w:type="dxa"/>
               <w:right w:w="100" w:type="dxa"/>
             </w:tcMar>
           </w:tcPr>
           <w:p>
             <w:pPr>
+              <w:keepNext w:val="0"/>
               <w:spacing w:after="30" w:line="280" w:lineRule="exact"/>
             </w:pPr>
             <w:r>
@@ -1423,11 +1473,7 @@
     </w:tbl>
     <w:p>
       <w:pPr>
-        <w:spacing w:after="20" w:line="120" w:lineRule="auto"/>
-      </w:pPr>
-    </w:p>
-    <w:p>
-      <w:pPr>
+        <w:keepNext/>
         <w:spacing w:line="240" w:lineRule="auto" w:after="40"/>
         <w:jc w:val="center"/>
       </w:pPr>
@@ -1468,6 +1514,8 @@
     </w:p>
     <w:p>
       <w:pPr>
+        <w:keepLines/>
+        <w:spacing w:line="280" w:lineRule="exact"/>
         <w:jc w:val="center"/>
       </w:pPr>
       <w:r>
@@ -1482,7 +1530,7 @@
     </w:p>
     <w:p>
       <w:pPr>
-        <w:spacing w:after="140" w:line="360" w:lineRule="exact"/>
+        <w:spacing w:after="100" w:line="360" w:lineRule="exact"/>
       </w:pPr>
       <w:r>
         <w:rPr>
@@ -1491,12 +1539,12 @@
           <w:color w:val="000000"/>
           <w:sz w:val="23"/>
         </w:rPr>
-        <w:t>训练时按完整位置划分回合，不能把同一轨迹的相邻帧随机分进训练和验证。渲染图像使用保存的动作前qpos，配对同一时刻的实际state和教师action；否则网络看到的画面与它要学的动作会错位。</w:t>
+        <w:t>一个位置的完整回合放在同一组，避免相邻帧混入训练和验证。另一个容易漏掉的细节是时间对应：图像用动作前qpos渲染，state和教师action也取同一时刻。画面晚一拍、动作早一拍，学到的对应就会错位。</w:t>
       </w:r>
     </w:p>
     <w:p>
       <w:pPr>
-        <w:spacing w:after="140" w:line="360" w:lineRule="exact"/>
+        <w:spacing w:after="100" w:line="360" w:lineRule="exact"/>
       </w:pPr>
       <w:r>
         <w:rPr>
@@ -1571,7 +1619,6 @@
     <w:p>
       <w:pPr>
         <w:pStyle w:val="Heading1"/>
-        <w:pageBreakBefore/>
       </w:pPr>
       <w:r>
         <w:rPr>
@@ -1585,7 +1632,7 @@
     </w:p>
     <w:p>
       <w:pPr>
-        <w:spacing w:after="140" w:line="360" w:lineRule="exact"/>
+        <w:spacing w:after="100" w:line="360" w:lineRule="exact"/>
       </w:pPr>
       <w:r>
         <w:rPr>
@@ -1594,12 +1641,12 @@
           <w:color w:val="000000"/>
           <w:sz w:val="23"/>
         </w:rPr>
-        <w:t>长训每次从10,075个训练帧起点中随机取8个不同起点，跨更新允许重复。每个起点只读取当前观察，未来动作标签不跨episode。batch的状态形状为[8,7]，两路RGB各为[8,3,480,640]，动作标签为[8,100,7]。</w:t>
+        <w:t>一次更新拿什么来学？从10,075个训练帧起点中随机取8个不同起点，读取当前观察与后续动作答案。跨更新允许重复，标签不跨episode。一个batch的状态为[8,7]，两路RGB各为[8,3,480,640]，动作标签为[8,100,7]。</w:t>
       </w:r>
     </w:p>
     <w:p>
       <w:pPr>
-        <w:spacing w:after="140" w:line="360" w:lineRule="exact"/>
+        <w:spacing w:after="100" w:line="360" w:lineRule="exact"/>
       </w:pPr>
       <w:r>
         <w:rPr>
@@ -1608,7 +1655,7 @@
           <w:color w:val="000000"/>
           <w:sz w:val="23"/>
         </w:rPr>
-        <w:t>到回合尾部不足100行动作时，复制最后一行补齐，并用action_is_pad标记。复制出来的行不参与L1分子，也不参与分母。例如403帧回合的最后一帧，只有1行动作有效，不能把另外99行补齐值也算进损失。</w:t>
+        <w:t>回合尾部凑不满100行动作时，复制最后一行补齐，并用action_is_pad标记；计算L1时，分子和分母都排除这些补齐行。例如403帧回合的最后一帧只有1行有效答案，其余99行只是为了把张量形状补齐。</w:t>
       </w:r>
     </w:p>
     <w:p>
@@ -1627,7 +1674,7 @@
     </w:p>
     <w:p>
       <w:pPr>
-        <w:spacing w:after="140" w:line="360" w:lineRule="exact"/>
+        <w:spacing w:after="100" w:line="360" w:lineRule="exact"/>
       </w:pPr>
       <w:r>
         <w:rPr>
@@ -1641,7 +1688,7 @@
     </w:p>
     <w:p>
       <w:pPr>
-        <w:spacing w:after="140" w:line="360" w:lineRule="exact"/>
+        <w:spacing w:after="100" w:line="360" w:lineRule="exact"/>
       </w:pPr>
       <w:r>
         <w:rPr>
@@ -1655,7 +1702,7 @@
     </w:p>
     <w:p>
       <w:pPr>
-        <w:spacing w:after="140" w:line="360" w:lineRule="exact"/>
+        <w:spacing w:after="100" w:line="360" w:lineRule="exact"/>
       </w:pPr>
       <w:r>
         <w:rPr>
@@ -1664,12 +1711,12 @@
           <w:color w:val="000000"/>
           <w:sz w:val="23"/>
         </w:rPr>
-        <w:t>训练时编码器会读取示范动作来估计潜变量分布；推理时不读取动作标签，使用零潜变量。因而训练loss与推理时的验证MAE不是同一种测量，不能拿两个数直接比较大小。</w:t>
+        <w:t>训练时，编码器会读取示范动作来估计潜变量分布；推理时拿不到这份答案，使用零潜变量。这也是后面把训练loss和验证MAE分别画出的原因：两者看的不是同一件事，数值大小不能直接相比。</w:t>
       </w:r>
     </w:p>
     <w:p>
       <w:pPr>
-        <w:spacing w:after="140" w:line="360" w:lineRule="exact"/>
+        <w:spacing w:after="100" w:line="360" w:lineRule="exact"/>
       </w:pPr>
       <w:r>
         <w:rPr>
@@ -1678,7 +1725,7 @@
           <w:color w:val="000000"/>
           <w:sz w:val="23"/>
         </w:rPr>
-        <w:t>step3000当步的实际例子：L1约0.0319235、KL约0.000051342，因此总loss约为0.0324369。这里的L1已经标准化，</w:t>
+        <w:t>拿step3000当步举例：L1约0.0319235，KL约0.000051342，总loss因此约为0.0324369。这里的L1已经标准化，</w:t>
       </w:r>
       <w:r>
         <w:rPr>
@@ -1687,7 +1734,7 @@
           <w:color w:val="000000"/>
           <w:sz w:val="23"/>
         </w:rPr>
-        <w:t>0.03不表示0.03度，也不表示3%的抓取失败率</w:t>
+        <w:t>0.03不是0.03度，也不是3%的抓取失败率</w:t>
       </w:r>
       <w:r>
         <w:rPr>
@@ -1696,7 +1743,7 @@
           <w:color w:val="000000"/>
           <w:sz w:val="23"/>
         </w:rPr>
-        <w:t>。AdamW的weight decay是解耦参数衰减，不另外加进CSV的loss数值。</w:t>
+        <w:t>。AdamW另做解耦参数衰减，weight decay没有再加进CSV里的loss。</w:t>
       </w:r>
     </w:p>
     <w:p>
@@ -1715,7 +1762,7 @@
     </w:p>
     <w:p>
       <w:pPr>
-        <w:spacing w:after="140" w:line="360" w:lineRule="exact"/>
+        <w:spacing w:after="100" w:line="360" w:lineRule="exact"/>
       </w:pPr>
       <w:r>
         <w:rPr>
@@ -1729,7 +1776,7 @@
     </w:p>
     <w:p>
       <w:pPr>
-        <w:spacing w:after="140" w:line="360" w:lineRule="exact"/>
+        <w:spacing w:after="100" w:line="360" w:lineRule="exact"/>
       </w:pPr>
       <w:r>
         <w:rPr>
@@ -1743,7 +1790,7 @@
     </w:p>
     <w:p>
       <w:pPr>
-        <w:spacing w:after="140" w:line="360" w:lineRule="exact"/>
+        <w:spacing w:after="100" w:line="360" w:lineRule="exact"/>
       </w:pPr>
       <w:r>
         <w:rPr>
@@ -1757,7 +1804,7 @@
     </w:p>
     <w:p>
       <w:pPr>
-        <w:spacing w:after="140" w:line="360" w:lineRule="exact"/>
+        <w:spacing w:after="100" w:line="360" w:lineRule="exact"/>
       </w:pPr>
       <w:r>
         <w:rPr>
@@ -1771,7 +1818,7 @@
     </w:p>
     <w:p>
       <w:pPr>
-        <w:spacing w:after="140" w:line="360" w:lineRule="exact"/>
+        <w:spacing w:after="100" w:line="360" w:lineRule="exact"/>
       </w:pPr>
       <w:r>
         <w:rPr>
@@ -1780,12 +1827,12 @@
           <w:color w:val="000000"/>
           <w:sz w:val="23"/>
         </w:rPr>
-        <w:t>每次验证结束后，下一次反向传播前都恢复训练模式，避免把验证时的eval状态带入后续训练。来源处理器和统计文件保持原样，没有在每个checkpoint重新拟合。</w:t>
+        <w:t>验证时会切到eval状态，下一次反向传播前再恢复训练模式。来源模型的处理器和统计文件则一直保留，不随checkpoint重新拟合，保证训练与推理使用同一套归一化。</w:t>
       </w:r>
     </w:p>
     <w:p>
       <w:pPr>
-        <w:spacing w:after="140" w:line="360" w:lineRule="exact"/>
+        <w:spacing w:after="100" w:line="360" w:lineRule="exact"/>
       </w:pPr>
       <w:r>
         <w:rPr>
@@ -1840,7 +1887,6 @@
     <w:p>
       <w:pPr>
         <w:pStyle w:val="Heading1"/>
-        <w:pageBreakBefore/>
       </w:pPr>
       <w:r>
         <w:rPr>
@@ -1854,7 +1900,7 @@
     </w:p>
     <w:p>
       <w:pPr>
-        <w:spacing w:after="140" w:line="360" w:lineRule="exact"/>
+        <w:spacing w:after="100" w:line="360" w:lineRule="exact"/>
       </w:pPr>
       <w:r>
         <w:rPr>
@@ -1863,7 +1909,7 @@
           <w:color w:val="000000"/>
           <w:sz w:val="23"/>
         </w:rPr>
-        <w:t>下表写的是连续5000步实验的实际运行值。不要仅抄模型config.json：它保存的optimizer_lr与optimizer_lr_backbone均为1e-6，但本次脚本直接新建一个AdamW参数组，实际所有可训练参数统一使用1e-5。</w:t>
+        <w:t>参数要核对优化器实际用了什么。config.json里的optimizer_lr与optimizer_lr_backbone均为1e-6，但这次脚本重新建立AdamW参数组，所有可训练参数统一使用1e-5。下表记录实际运行值。</w:t>
       </w:r>
     </w:p>
     <w:tbl>
@@ -1895,8 +1941,8 @@
             <w:tcW w:type="dxa" w:w="1871"/>
             <w:vAlign w:val="center"/>
             <w:tcMar>
-              <w:top w:w="100" w:type="dxa"/>
-              <w:bottom w:w="100" w:type="dxa"/>
+              <w:top w:w="80" w:type="dxa"/>
+              <w:bottom w:w="80" w:type="dxa"/>
               <w:left w:w="100" w:type="dxa"/>
               <w:right w:w="100" w:type="dxa"/>
             </w:tcMar>
@@ -1904,6 +1950,7 @@
           </w:tcPr>
           <w:p>
             <w:pPr>
+              <w:keepNext/>
               <w:spacing w:after="30" w:line="280" w:lineRule="exact"/>
             </w:pPr>
             <w:r>
@@ -1922,8 +1969,8 @@
             <w:tcW w:type="dxa" w:w="2268"/>
             <w:vAlign w:val="center"/>
             <w:tcMar>
-              <w:top w:w="100" w:type="dxa"/>
-              <w:bottom w:w="100" w:type="dxa"/>
+              <w:top w:w="80" w:type="dxa"/>
+              <w:bottom w:w="80" w:type="dxa"/>
               <w:left w:w="100" w:type="dxa"/>
               <w:right w:w="100" w:type="dxa"/>
             </w:tcMar>
@@ -1931,6 +1978,7 @@
           </w:tcPr>
           <w:p>
             <w:pPr>
+              <w:keepNext/>
               <w:spacing w:after="30" w:line="280" w:lineRule="exact"/>
             </w:pPr>
             <w:r>
@@ -1949,8 +1997,8 @@
             <w:tcW w:type="dxa" w:w="5386"/>
             <w:vAlign w:val="center"/>
             <w:tcMar>
-              <w:top w:w="100" w:type="dxa"/>
-              <w:bottom w:w="100" w:type="dxa"/>
+              <w:top w:w="80" w:type="dxa"/>
+              <w:bottom w:w="80" w:type="dxa"/>
               <w:left w:w="100" w:type="dxa"/>
               <w:right w:w="100" w:type="dxa"/>
             </w:tcMar>
@@ -1958,6 +2006,7 @@
           </w:tcPr>
           <w:p>
             <w:pPr>
+              <w:keepNext/>
               <w:spacing w:after="30" w:line="280" w:lineRule="exact"/>
             </w:pPr>
             <w:r>
@@ -1981,14 +2030,15 @@
             <w:tcW w:type="dxa" w:w="1871"/>
             <w:vAlign w:val="center"/>
             <w:tcMar>
-              <w:top w:w="100" w:type="dxa"/>
-              <w:bottom w:w="100" w:type="dxa"/>
+              <w:top w:w="80" w:type="dxa"/>
+              <w:bottom w:w="80" w:type="dxa"/>
               <w:left w:w="100" w:type="dxa"/>
               <w:right w:w="100" w:type="dxa"/>
             </w:tcMar>
           </w:tcPr>
           <w:p>
             <w:pPr>
+              <w:keepNext w:val="0"/>
               <w:spacing w:after="30" w:line="280" w:lineRule="exact"/>
             </w:pPr>
             <w:r>
@@ -2007,14 +2057,15 @@
             <w:tcW w:type="dxa" w:w="2268"/>
             <w:vAlign w:val="center"/>
             <w:tcMar>
-              <w:top w:w="100" w:type="dxa"/>
-              <w:bottom w:w="100" w:type="dxa"/>
+              <w:top w:w="80" w:type="dxa"/>
+              <w:bottom w:w="80" w:type="dxa"/>
               <w:left w:w="100" w:type="dxa"/>
               <w:right w:w="100" w:type="dxa"/>
             </w:tcMar>
           </w:tcPr>
           <w:p>
             <w:pPr>
+              <w:keepNext w:val="0"/>
               <w:spacing w:after="30" w:line="280" w:lineRule="exact"/>
             </w:pPr>
             <w:r>
@@ -2033,14 +2084,15 @@
             <w:tcW w:type="dxa" w:w="5386"/>
             <w:vAlign w:val="center"/>
             <w:tcMar>
-              <w:top w:w="100" w:type="dxa"/>
-              <w:bottom w:w="100" w:type="dxa"/>
+              <w:top w:w="80" w:type="dxa"/>
+              <w:bottom w:w="80" w:type="dxa"/>
               <w:left w:w="100" w:type="dxa"/>
               <w:right w:w="100" w:type="dxa"/>
             </w:tcMar>
           </w:tcPr>
           <w:p>
             <w:pPr>
+              <w:keepNext w:val="0"/>
               <w:spacing w:after="30" w:line="280" w:lineRule="exact"/>
             </w:pPr>
             <w:r>
@@ -2064,14 +2116,15 @@
             <w:tcW w:type="dxa" w:w="1871"/>
             <w:vAlign w:val="center"/>
             <w:tcMar>
-              <w:top w:w="100" w:type="dxa"/>
-              <w:bottom w:w="100" w:type="dxa"/>
+              <w:top w:w="80" w:type="dxa"/>
+              <w:bottom w:w="80" w:type="dxa"/>
               <w:left w:w="100" w:type="dxa"/>
               <w:right w:w="100" w:type="dxa"/>
             </w:tcMar>
           </w:tcPr>
           <w:p>
             <w:pPr>
+              <w:keepNext w:val="0"/>
               <w:spacing w:after="30" w:line="280" w:lineRule="exact"/>
             </w:pPr>
             <w:r>
@@ -2090,14 +2143,15 @@
             <w:tcW w:type="dxa" w:w="2268"/>
             <w:vAlign w:val="center"/>
             <w:tcMar>
-              <w:top w:w="100" w:type="dxa"/>
-              <w:bottom w:w="100" w:type="dxa"/>
+              <w:top w:w="80" w:type="dxa"/>
+              <w:bottom w:w="80" w:type="dxa"/>
               <w:left w:w="100" w:type="dxa"/>
               <w:right w:w="100" w:type="dxa"/>
             </w:tcMar>
           </w:tcPr>
           <w:p>
             <w:pPr>
+              <w:keepNext w:val="0"/>
               <w:spacing w:after="30" w:line="280" w:lineRule="exact"/>
             </w:pPr>
             <w:r>
@@ -2116,14 +2170,15 @@
             <w:tcW w:type="dxa" w:w="5386"/>
             <w:vAlign w:val="center"/>
             <w:tcMar>
-              <w:top w:w="100" w:type="dxa"/>
-              <w:bottom w:w="100" w:type="dxa"/>
+              <w:top w:w="80" w:type="dxa"/>
+              <w:bottom w:w="80" w:type="dxa"/>
               <w:left w:w="100" w:type="dxa"/>
               <w:right w:w="100" w:type="dxa"/>
             </w:tcMar>
           </w:tcPr>
           <w:p>
             <w:pPr>
+              <w:keepNext w:val="0"/>
               <w:spacing w:after="30" w:line="280" w:lineRule="exact"/>
             </w:pPr>
             <w:r>
@@ -2147,14 +2202,15 @@
             <w:tcW w:type="dxa" w:w="1871"/>
             <w:vAlign w:val="center"/>
             <w:tcMar>
-              <w:top w:w="100" w:type="dxa"/>
-              <w:bottom w:w="100" w:type="dxa"/>
+              <w:top w:w="80" w:type="dxa"/>
+              <w:bottom w:w="80" w:type="dxa"/>
               <w:left w:w="100" w:type="dxa"/>
               <w:right w:w="100" w:type="dxa"/>
             </w:tcMar>
           </w:tcPr>
           <w:p>
             <w:pPr>
+              <w:keepNext w:val="0"/>
               <w:spacing w:after="30" w:line="280" w:lineRule="exact"/>
             </w:pPr>
             <w:r>
@@ -2173,14 +2229,15 @@
             <w:tcW w:type="dxa" w:w="2268"/>
             <w:vAlign w:val="center"/>
             <w:tcMar>
-              <w:top w:w="100" w:type="dxa"/>
-              <w:bottom w:w="100" w:type="dxa"/>
+              <w:top w:w="80" w:type="dxa"/>
+              <w:bottom w:w="80" w:type="dxa"/>
               <w:left w:w="100" w:type="dxa"/>
               <w:right w:w="100" w:type="dxa"/>
             </w:tcMar>
           </w:tcPr>
           <w:p>
             <w:pPr>
+              <w:keepNext w:val="0"/>
               <w:spacing w:after="30" w:line="280" w:lineRule="exact"/>
             </w:pPr>
             <w:r>
@@ -2199,14 +2256,15 @@
             <w:tcW w:type="dxa" w:w="5386"/>
             <w:vAlign w:val="center"/>
             <w:tcMar>
-              <w:top w:w="100" w:type="dxa"/>
-              <w:bottom w:w="100" w:type="dxa"/>
+              <w:top w:w="80" w:type="dxa"/>
+              <w:bottom w:w="80" w:type="dxa"/>
               <w:left w:w="100" w:type="dxa"/>
               <w:right w:w="100" w:type="dxa"/>
             </w:tcMar>
           </w:tcPr>
           <w:p>
             <w:pPr>
+              <w:keepNext w:val="0"/>
               <w:spacing w:after="30" w:line="280" w:lineRule="exact"/>
             </w:pPr>
             <w:r>
@@ -2230,14 +2288,15 @@
             <w:tcW w:type="dxa" w:w="1871"/>
             <w:vAlign w:val="center"/>
             <w:tcMar>
-              <w:top w:w="100" w:type="dxa"/>
-              <w:bottom w:w="100" w:type="dxa"/>
+              <w:top w:w="80" w:type="dxa"/>
+              <w:bottom w:w="80" w:type="dxa"/>
               <w:left w:w="100" w:type="dxa"/>
               <w:right w:w="100" w:type="dxa"/>
             </w:tcMar>
           </w:tcPr>
           <w:p>
             <w:pPr>
+              <w:keepNext w:val="0"/>
               <w:spacing w:after="30" w:line="280" w:lineRule="exact"/>
             </w:pPr>
             <w:r>
@@ -2256,14 +2315,15 @@
             <w:tcW w:type="dxa" w:w="2268"/>
             <w:vAlign w:val="center"/>
             <w:tcMar>
-              <w:top w:w="100" w:type="dxa"/>
-              <w:bottom w:w="100" w:type="dxa"/>
+              <w:top w:w="80" w:type="dxa"/>
+              <w:bottom w:w="80" w:type="dxa"/>
               <w:left w:w="100" w:type="dxa"/>
               <w:right w:w="100" w:type="dxa"/>
             </w:tcMar>
           </w:tcPr>
           <w:p>
             <w:pPr>
+              <w:keepNext w:val="0"/>
               <w:spacing w:after="30" w:line="280" w:lineRule="exact"/>
             </w:pPr>
             <w:r>
@@ -2282,14 +2342,15 @@
             <w:tcW w:type="dxa" w:w="5386"/>
             <w:vAlign w:val="center"/>
             <w:tcMar>
-              <w:top w:w="100" w:type="dxa"/>
-              <w:bottom w:w="100" w:type="dxa"/>
+              <w:top w:w="80" w:type="dxa"/>
+              <w:bottom w:w="80" w:type="dxa"/>
               <w:left w:w="100" w:type="dxa"/>
               <w:right w:w="100" w:type="dxa"/>
             </w:tcMar>
           </w:tcPr>
           <w:p>
             <w:pPr>
+              <w:keepNext w:val="0"/>
               <w:spacing w:after="30" w:line="280" w:lineRule="exact"/>
             </w:pPr>
             <w:r>
@@ -2313,14 +2374,15 @@
             <w:tcW w:type="dxa" w:w="1871"/>
             <w:vAlign w:val="center"/>
             <w:tcMar>
-              <w:top w:w="100" w:type="dxa"/>
-              <w:bottom w:w="100" w:type="dxa"/>
+              <w:top w:w="80" w:type="dxa"/>
+              <w:bottom w:w="80" w:type="dxa"/>
               <w:left w:w="100" w:type="dxa"/>
               <w:right w:w="100" w:type="dxa"/>
             </w:tcMar>
           </w:tcPr>
           <w:p>
             <w:pPr>
+              <w:keepNext w:val="0"/>
               <w:spacing w:after="30" w:line="280" w:lineRule="exact"/>
             </w:pPr>
             <w:r>
@@ -2339,14 +2401,15 @@
             <w:tcW w:type="dxa" w:w="2268"/>
             <w:vAlign w:val="center"/>
             <w:tcMar>
-              <w:top w:w="100" w:type="dxa"/>
-              <w:bottom w:w="100" w:type="dxa"/>
+              <w:top w:w="80" w:type="dxa"/>
+              <w:bottom w:w="80" w:type="dxa"/>
               <w:left w:w="100" w:type="dxa"/>
               <w:right w:w="100" w:type="dxa"/>
             </w:tcMar>
           </w:tcPr>
           <w:p>
             <w:pPr>
+              <w:keepNext w:val="0"/>
               <w:spacing w:after="30" w:line="280" w:lineRule="exact"/>
             </w:pPr>
             <w:r>
@@ -2365,14 +2428,15 @@
             <w:tcW w:type="dxa" w:w="5386"/>
             <w:vAlign w:val="center"/>
             <w:tcMar>
-              <w:top w:w="100" w:type="dxa"/>
-              <w:bottom w:w="100" w:type="dxa"/>
+              <w:top w:w="80" w:type="dxa"/>
+              <w:bottom w:w="80" w:type="dxa"/>
               <w:left w:w="100" w:type="dxa"/>
               <w:right w:w="100" w:type="dxa"/>
             </w:tcMar>
           </w:tcPr>
           <w:p>
             <w:pPr>
+              <w:keepNext w:val="0"/>
               <w:spacing w:after="30" w:line="280" w:lineRule="exact"/>
             </w:pPr>
             <w:r>
@@ -2396,14 +2460,15 @@
             <w:tcW w:type="dxa" w:w="1871"/>
             <w:vAlign w:val="center"/>
             <w:tcMar>
-              <w:top w:w="100" w:type="dxa"/>
-              <w:bottom w:w="100" w:type="dxa"/>
+              <w:top w:w="80" w:type="dxa"/>
+              <w:bottom w:w="80" w:type="dxa"/>
               <w:left w:w="100" w:type="dxa"/>
               <w:right w:w="100" w:type="dxa"/>
             </w:tcMar>
           </w:tcPr>
           <w:p>
             <w:pPr>
+              <w:keepNext w:val="0"/>
               <w:spacing w:after="30" w:line="280" w:lineRule="exact"/>
             </w:pPr>
             <w:r>
@@ -2422,14 +2487,15 @@
             <w:tcW w:type="dxa" w:w="2268"/>
             <w:vAlign w:val="center"/>
             <w:tcMar>
-              <w:top w:w="100" w:type="dxa"/>
-              <w:bottom w:w="100" w:type="dxa"/>
+              <w:top w:w="80" w:type="dxa"/>
+              <w:bottom w:w="80" w:type="dxa"/>
               <w:left w:w="100" w:type="dxa"/>
               <w:right w:w="100" w:type="dxa"/>
             </w:tcMar>
           </w:tcPr>
           <w:p>
             <w:pPr>
+              <w:keepNext w:val="0"/>
               <w:spacing w:after="30" w:line="280" w:lineRule="exact"/>
             </w:pPr>
             <w:r>
@@ -2448,14 +2514,15 @@
             <w:tcW w:type="dxa" w:w="5386"/>
             <w:vAlign w:val="center"/>
             <w:tcMar>
-              <w:top w:w="100" w:type="dxa"/>
-              <w:bottom w:w="100" w:type="dxa"/>
+              <w:top w:w="80" w:type="dxa"/>
+              <w:bottom w:w="80" w:type="dxa"/>
               <w:left w:w="100" w:type="dxa"/>
               <w:right w:w="100" w:type="dxa"/>
             </w:tcMar>
           </w:tcPr>
           <w:p>
             <w:pPr>
+              <w:keepNext w:val="0"/>
               <w:spacing w:after="30" w:line="280" w:lineRule="exact"/>
             </w:pPr>
             <w:r>
@@ -2479,14 +2546,15 @@
             <w:tcW w:type="dxa" w:w="1871"/>
             <w:vAlign w:val="center"/>
             <w:tcMar>
-              <w:top w:w="100" w:type="dxa"/>
-              <w:bottom w:w="100" w:type="dxa"/>
+              <w:top w:w="80" w:type="dxa"/>
+              <w:bottom w:w="80" w:type="dxa"/>
               <w:left w:w="100" w:type="dxa"/>
               <w:right w:w="100" w:type="dxa"/>
             </w:tcMar>
           </w:tcPr>
           <w:p>
             <w:pPr>
+              <w:keepNext w:val="0"/>
               <w:spacing w:after="30" w:line="280" w:lineRule="exact"/>
             </w:pPr>
             <w:r>
@@ -2505,14 +2573,15 @@
             <w:tcW w:type="dxa" w:w="2268"/>
             <w:vAlign w:val="center"/>
             <w:tcMar>
-              <w:top w:w="100" w:type="dxa"/>
-              <w:bottom w:w="100" w:type="dxa"/>
+              <w:top w:w="80" w:type="dxa"/>
+              <w:bottom w:w="80" w:type="dxa"/>
               <w:left w:w="100" w:type="dxa"/>
               <w:right w:w="100" w:type="dxa"/>
             </w:tcMar>
           </w:tcPr>
           <w:p>
             <w:pPr>
+              <w:keepNext w:val="0"/>
               <w:spacing w:after="30" w:line="280" w:lineRule="exact"/>
             </w:pPr>
             <w:r>
@@ -2531,14 +2600,15 @@
             <w:tcW w:type="dxa" w:w="5386"/>
             <w:vAlign w:val="center"/>
             <w:tcMar>
-              <w:top w:w="100" w:type="dxa"/>
-              <w:bottom w:w="100" w:type="dxa"/>
+              <w:top w:w="80" w:type="dxa"/>
+              <w:bottom w:w="80" w:type="dxa"/>
               <w:left w:w="100" w:type="dxa"/>
               <w:right w:w="100" w:type="dxa"/>
             </w:tcMar>
           </w:tcPr>
           <w:p>
             <w:pPr>
+              <w:keepNext w:val="0"/>
               <w:spacing w:after="30" w:line="280" w:lineRule="exact"/>
             </w:pPr>
             <w:r>
@@ -2562,14 +2632,15 @@
             <w:tcW w:type="dxa" w:w="1871"/>
             <w:vAlign w:val="center"/>
             <w:tcMar>
-              <w:top w:w="100" w:type="dxa"/>
-              <w:bottom w:w="100" w:type="dxa"/>
+              <w:top w:w="80" w:type="dxa"/>
+              <w:bottom w:w="80" w:type="dxa"/>
               <w:left w:w="100" w:type="dxa"/>
               <w:right w:w="100" w:type="dxa"/>
             </w:tcMar>
           </w:tcPr>
           <w:p>
             <w:pPr>
+              <w:keepNext w:val="0"/>
               <w:spacing w:after="30" w:line="280" w:lineRule="exact"/>
             </w:pPr>
             <w:r>
@@ -2588,14 +2659,15 @@
             <w:tcW w:type="dxa" w:w="2268"/>
             <w:vAlign w:val="center"/>
             <w:tcMar>
-              <w:top w:w="100" w:type="dxa"/>
-              <w:bottom w:w="100" w:type="dxa"/>
+              <w:top w:w="80" w:type="dxa"/>
+              <w:bottom w:w="80" w:type="dxa"/>
               <w:left w:w="100" w:type="dxa"/>
               <w:right w:w="100" w:type="dxa"/>
             </w:tcMar>
           </w:tcPr>
           <w:p>
             <w:pPr>
+              <w:keepNext w:val="0"/>
               <w:spacing w:after="30" w:line="280" w:lineRule="exact"/>
             </w:pPr>
             <w:r>
@@ -2614,14 +2686,15 @@
             <w:tcW w:type="dxa" w:w="5386"/>
             <w:vAlign w:val="center"/>
             <w:tcMar>
-              <w:top w:w="100" w:type="dxa"/>
-              <w:bottom w:w="100" w:type="dxa"/>
+              <w:top w:w="80" w:type="dxa"/>
+              <w:bottom w:w="80" w:type="dxa"/>
               <w:left w:w="100" w:type="dxa"/>
               <w:right w:w="100" w:type="dxa"/>
             </w:tcMar>
           </w:tcPr>
           <w:p>
             <w:pPr>
+              <w:keepNext w:val="0"/>
               <w:spacing w:after="30" w:line="280" w:lineRule="exact"/>
             </w:pPr>
             <w:r>
@@ -2645,14 +2718,15 @@
             <w:tcW w:type="dxa" w:w="1871"/>
             <w:vAlign w:val="center"/>
             <w:tcMar>
-              <w:top w:w="100" w:type="dxa"/>
-              <w:bottom w:w="100" w:type="dxa"/>
+              <w:top w:w="80" w:type="dxa"/>
+              <w:bottom w:w="80" w:type="dxa"/>
               <w:left w:w="100" w:type="dxa"/>
               <w:right w:w="100" w:type="dxa"/>
             </w:tcMar>
           </w:tcPr>
           <w:p>
             <w:pPr>
+              <w:keepNext w:val="0"/>
               <w:spacing w:after="30" w:line="280" w:lineRule="exact"/>
             </w:pPr>
             <w:r>
@@ -2671,14 +2745,15 @@
             <w:tcW w:type="dxa" w:w="2268"/>
             <w:vAlign w:val="center"/>
             <w:tcMar>
-              <w:top w:w="100" w:type="dxa"/>
-              <w:bottom w:w="100" w:type="dxa"/>
+              <w:top w:w="80" w:type="dxa"/>
+              <w:bottom w:w="80" w:type="dxa"/>
               <w:left w:w="100" w:type="dxa"/>
               <w:right w:w="100" w:type="dxa"/>
             </w:tcMar>
           </w:tcPr>
           <w:p>
             <w:pPr>
+              <w:keepNext w:val="0"/>
               <w:spacing w:after="30" w:line="280" w:lineRule="exact"/>
             </w:pPr>
             <w:r>
@@ -2697,14 +2772,15 @@
             <w:tcW w:type="dxa" w:w="5386"/>
             <w:vAlign w:val="center"/>
             <w:tcMar>
-              <w:top w:w="100" w:type="dxa"/>
-              <w:bottom w:w="100" w:type="dxa"/>
+              <w:top w:w="80" w:type="dxa"/>
+              <w:bottom w:w="80" w:type="dxa"/>
               <w:left w:w="100" w:type="dxa"/>
               <w:right w:w="100" w:type="dxa"/>
             </w:tcMar>
           </w:tcPr>
           <w:p>
             <w:pPr>
+              <w:keepNext w:val="0"/>
               <w:spacing w:after="30" w:line="280" w:lineRule="exact"/>
             </w:pPr>
             <w:r>
@@ -2728,14 +2804,15 @@
             <w:tcW w:type="dxa" w:w="1871"/>
             <w:vAlign w:val="center"/>
             <w:tcMar>
-              <w:top w:w="100" w:type="dxa"/>
-              <w:bottom w:w="100" w:type="dxa"/>
+              <w:top w:w="80" w:type="dxa"/>
+              <w:bottom w:w="80" w:type="dxa"/>
               <w:left w:w="100" w:type="dxa"/>
               <w:right w:w="100" w:type="dxa"/>
             </w:tcMar>
           </w:tcPr>
           <w:p>
             <w:pPr>
+              <w:keepNext w:val="0"/>
               <w:spacing w:after="30" w:line="280" w:lineRule="exact"/>
             </w:pPr>
             <w:r>
@@ -2754,14 +2831,15 @@
             <w:tcW w:type="dxa" w:w="2268"/>
             <w:vAlign w:val="center"/>
             <w:tcMar>
-              <w:top w:w="100" w:type="dxa"/>
-              <w:bottom w:w="100" w:type="dxa"/>
+              <w:top w:w="80" w:type="dxa"/>
+              <w:bottom w:w="80" w:type="dxa"/>
               <w:left w:w="100" w:type="dxa"/>
               <w:right w:w="100" w:type="dxa"/>
             </w:tcMar>
           </w:tcPr>
           <w:p>
             <w:pPr>
+              <w:keepNext w:val="0"/>
               <w:spacing w:after="30" w:line="280" w:lineRule="exact"/>
             </w:pPr>
             <w:r>
@@ -2780,14 +2858,15 @@
             <w:tcW w:type="dxa" w:w="5386"/>
             <w:vAlign w:val="center"/>
             <w:tcMar>
-              <w:top w:w="100" w:type="dxa"/>
-              <w:bottom w:w="100" w:type="dxa"/>
+              <w:top w:w="80" w:type="dxa"/>
+              <w:bottom w:w="80" w:type="dxa"/>
               <w:left w:w="100" w:type="dxa"/>
               <w:right w:w="100" w:type="dxa"/>
             </w:tcMar>
           </w:tcPr>
           <w:p>
             <w:pPr>
+              <w:keepNext w:val="0"/>
               <w:spacing w:after="30" w:line="280" w:lineRule="exact"/>
             </w:pPr>
             <w:r>
@@ -2805,12 +2884,7 @@
     </w:tbl>
     <w:p>
       <w:pPr>
-        <w:spacing w:after="20" w:line="120" w:lineRule="auto"/>
-      </w:pPr>
-    </w:p>
-    <w:p>
-      <w:pPr>
-        <w:spacing w:after="140" w:line="360" w:lineRule="exact"/>
+        <w:spacing w:after="100" w:line="360" w:lineRule="exact"/>
       </w:pPr>
       <w:r>
         <w:rPr>
@@ -2819,7 +2893,7 @@
           <w:color w:val="000000"/>
           <w:sz w:val="23"/>
         </w:rPr>
-        <w:t>本轮没有冻结整个视觉骨干。ResNet18的可训练卷积参数和Transformer一起更新，学习率相同；FrozenBatchNorm2d不等于整个backbone冻结。原模型dropout为0.1、潜变量32维，网络结构没有另行改造。</w:t>
+        <w:t>我们沿用原网络结构，dropout为0.1、潜变量32维。ResNet18中可训练的卷积参数与Transformer一起更新，学习率相同；名字里的FrozenBatchNorm2d只说明这类归一化层的处理，并不表示整个视觉骨干被冻结。</w:t>
       </w:r>
     </w:p>
     <w:p>
@@ -2838,7 +2912,7 @@
     </w:p>
     <w:p>
       <w:pPr>
-        <w:spacing w:after="140" w:line="360" w:lineRule="exact"/>
+        <w:spacing w:after="100" w:line="360" w:lineRule="exact"/>
       </w:pPr>
       <w:r>
         <w:rPr>
@@ -2847,12 +2921,12 @@
           <w:color w:val="000000"/>
           <w:sz w:val="23"/>
         </w:rPr>
-        <w:t>训练5000 steps是5000次参数更新。batch为8时，共抽取40,000个观察窗口，窗口彼此可以重叠；不是新增40,000条示范。本脚本随机抽样，没有严格的逐回合epoch遍历。</w:t>
+        <w:t>训练5000 steps，就是做5000次参数更新。batch为8，合计抽取40,000个观察窗口，其中可以重复、也可以重叠，原始示范仍只有那25个训练回合。脚本采用随机抽样，没有严格逐回合遍历的epoch。</w:t>
       </w:r>
     </w:p>
     <w:p>
       <w:pPr>
-        <w:spacing w:after="140" w:line="360" w:lineRule="exact"/>
+        <w:spacing w:after="100" w:line="360" w:lineRule="exact"/>
       </w:pPr>
       <w:r>
         <w:rPr>
@@ -2861,12 +2935,12 @@
           <w:color w:val="000000"/>
           <w:sz w:val="23"/>
         </w:rPr>
-        <w:t>数据与动作频率为30 Hz，一帧约33.33 ms。100个动作槽约覆盖3.33秒；这与优化器学习率无关。MuJoCo物理子步为1 ms，每个动作槽内推进约33或34个子步。最后一项是物理积分分辨率，不能当成ACT网络每秒推理1000次。</w:t>
+        <w:t>再看机械臂这边：数据与动作频率为30 Hz，一帧约33.33 ms，100个动作槽约覆盖3.33秒。MuJoCo内部还以1 ms物理子步推进，每个动作槽约33或34个子步。这些子步用于计算运动和接触，ACT的查询频率则由第7节的执行模式决定。</w:t>
       </w:r>
     </w:p>
     <w:p>
       <w:pPr>
-        <w:spacing w:after="140" w:line="360" w:lineRule="exact"/>
+        <w:spacing w:after="100" w:line="360" w:lineRule="exact"/>
       </w:pPr>
       <w:r>
         <w:rPr>
@@ -2921,7 +2995,6 @@
     <w:p>
       <w:pPr>
         <w:pStyle w:val="Heading1"/>
-        <w:pageBreakBefore/>
       </w:pPr>
       <w:r>
         <w:rPr>
@@ -2935,7 +3008,7 @@
     </w:p>
     <w:p>
       <w:pPr>
-        <w:spacing w:after="140" w:line="360" w:lineRule="exact"/>
+        <w:spacing w:after="100" w:line="360" w:lineRule="exact"/>
       </w:pPr>
       <w:r>
         <w:rPr>
@@ -2944,11 +3017,12 @@
           <w:color w:val="000000"/>
           <w:sz w:val="23"/>
         </w:rPr>
-        <w:t>新分支实际完成5000次更新，全程batch8、OOM为0。循环连同验证和保存约1201.8秒，峰值CUDA allocated约3766.5 MiB；本机为8 GB显存。这个时间依赖本机、已有权重和本次数据，不是从零训练ACT的普遍耗时。</w:t>
+        <w:t>这条新分支完整跑了5000次更新，全程batch 8，没有出现OOM。训练循环连同验证和保存约用1201.8秒，峰值CUDA allocated约3766.5 MiB，本机显存为8 GB。约20分钟说的是已有权重、已有缓存下的这次适配，不是从零训练ACT所需的时间。</w:t>
       </w:r>
     </w:p>
     <w:p>
       <w:pPr>
+        <w:keepNext/>
         <w:spacing w:line="240" w:lineRule="auto" w:after="40"/>
         <w:jc w:val="center"/>
       </w:pPr>
@@ -2989,6 +3063,8 @@
     </w:p>
     <w:p>
       <w:pPr>
+        <w:keepLines/>
+        <w:spacing w:line="280" w:lineRule="exact"/>
         <w:jc w:val="center"/>
       </w:pPr>
       <w:r>
@@ -3031,8 +3107,8 @@
             <w:tcW w:type="dxa" w:w="1417"/>
             <w:vAlign w:val="center"/>
             <w:tcMar>
-              <w:top w:w="100" w:type="dxa"/>
-              <w:bottom w:w="100" w:type="dxa"/>
+              <w:top w:w="80" w:type="dxa"/>
+              <w:bottom w:w="80" w:type="dxa"/>
               <w:left w:w="100" w:type="dxa"/>
               <w:right w:w="100" w:type="dxa"/>
             </w:tcMar>
@@ -3040,6 +3116,7 @@
           </w:tcPr>
           <w:p>
             <w:pPr>
+              <w:keepNext/>
               <w:spacing w:after="30" w:line="280" w:lineRule="exact"/>
               <w:jc w:val="center"/>
             </w:pPr>
@@ -3059,8 +3136,8 @@
             <w:tcW w:type="dxa" w:w="2891"/>
             <w:vAlign w:val="center"/>
             <w:tcMar>
-              <w:top w:w="100" w:type="dxa"/>
-              <w:bottom w:w="100" w:type="dxa"/>
+              <w:top w:w="80" w:type="dxa"/>
+              <w:bottom w:w="80" w:type="dxa"/>
               <w:left w:w="100" w:type="dxa"/>
               <w:right w:w="100" w:type="dxa"/>
             </w:tcMar>
@@ -3068,6 +3145,7 @@
           </w:tcPr>
           <w:p>
             <w:pPr>
+              <w:keepNext/>
               <w:spacing w:after="30" w:line="280" w:lineRule="exact"/>
             </w:pPr>
             <w:r>
@@ -3086,8 +3164,8 @@
             <w:tcW w:type="dxa" w:w="2608"/>
             <w:vAlign w:val="center"/>
             <w:tcMar>
-              <w:top w:w="100" w:type="dxa"/>
-              <w:bottom w:w="100" w:type="dxa"/>
+              <w:top w:w="80" w:type="dxa"/>
+              <w:bottom w:w="80" w:type="dxa"/>
               <w:left w:w="100" w:type="dxa"/>
               <w:right w:w="100" w:type="dxa"/>
             </w:tcMar>
@@ -3095,6 +3173,7 @@
           </w:tcPr>
           <w:p>
             <w:pPr>
+              <w:keepNext/>
               <w:spacing w:after="30" w:line="280" w:lineRule="exact"/>
             </w:pPr>
             <w:r>
@@ -3113,8 +3192,8 @@
             <w:tcW w:type="dxa" w:w="2608"/>
             <w:vAlign w:val="center"/>
             <w:tcMar>
-              <w:top w:w="100" w:type="dxa"/>
-              <w:bottom w:w="100" w:type="dxa"/>
+              <w:top w:w="80" w:type="dxa"/>
+              <w:bottom w:w="80" w:type="dxa"/>
               <w:left w:w="100" w:type="dxa"/>
               <w:right w:w="100" w:type="dxa"/>
             </w:tcMar>
@@ -3122,6 +3201,7 @@
           </w:tcPr>
           <w:p>
             <w:pPr>
+              <w:keepNext/>
               <w:spacing w:after="30" w:line="280" w:lineRule="exact"/>
             </w:pPr>
             <w:r>
@@ -3145,14 +3225,15 @@
             <w:tcW w:type="dxa" w:w="1417"/>
             <w:vAlign w:val="center"/>
             <w:tcMar>
-              <w:top w:w="100" w:type="dxa"/>
-              <w:bottom w:w="100" w:type="dxa"/>
+              <w:top w:w="80" w:type="dxa"/>
+              <w:bottom w:w="80" w:type="dxa"/>
               <w:left w:w="100" w:type="dxa"/>
               <w:right w:w="100" w:type="dxa"/>
             </w:tcMar>
           </w:tcPr>
           <w:p>
             <w:pPr>
+              <w:keepNext w:val="0"/>
               <w:spacing w:after="30" w:line="280" w:lineRule="exact"/>
               <w:jc w:val="center"/>
             </w:pPr>
@@ -3172,14 +3253,15 @@
             <w:tcW w:type="dxa" w:w="2891"/>
             <w:vAlign w:val="center"/>
             <w:tcMar>
-              <w:top w:w="100" w:type="dxa"/>
-              <w:bottom w:w="100" w:type="dxa"/>
+              <w:top w:w="80" w:type="dxa"/>
+              <w:bottom w:w="80" w:type="dxa"/>
               <w:left w:w="100" w:type="dxa"/>
               <w:right w:w="100" w:type="dxa"/>
             </w:tcMar>
           </w:tcPr>
           <w:p>
             <w:pPr>
+              <w:keepNext w:val="0"/>
               <w:spacing w:after="30" w:line="280" w:lineRule="exact"/>
             </w:pPr>
             <w:r>
@@ -3198,14 +3280,15 @@
             <w:tcW w:type="dxa" w:w="2608"/>
             <w:vAlign w:val="center"/>
             <w:tcMar>
-              <w:top w:w="100" w:type="dxa"/>
-              <w:bottom w:w="100" w:type="dxa"/>
+              <w:top w:w="80" w:type="dxa"/>
+              <w:bottom w:w="80" w:type="dxa"/>
               <w:left w:w="100" w:type="dxa"/>
               <w:right w:w="100" w:type="dxa"/>
             </w:tcMar>
           </w:tcPr>
           <w:p>
             <w:pPr>
+              <w:keepNext w:val="0"/>
               <w:spacing w:after="30" w:line="280" w:lineRule="exact"/>
             </w:pPr>
             <w:r>
@@ -3224,14 +3307,15 @@
             <w:tcW w:type="dxa" w:w="2608"/>
             <w:vAlign w:val="center"/>
             <w:tcMar>
-              <w:top w:w="100" w:type="dxa"/>
-              <w:bottom w:w="100" w:type="dxa"/>
+              <w:top w:w="80" w:type="dxa"/>
+              <w:bottom w:w="80" w:type="dxa"/>
               <w:left w:w="100" w:type="dxa"/>
               <w:right w:w="100" w:type="dxa"/>
             </w:tcMar>
           </w:tcPr>
           <w:p>
             <w:pPr>
+              <w:keepNext w:val="0"/>
               <w:spacing w:after="30" w:line="280" w:lineRule="exact"/>
             </w:pPr>
             <w:r>
@@ -3255,14 +3339,15 @@
             <w:tcW w:type="dxa" w:w="1417"/>
             <w:vAlign w:val="center"/>
             <w:tcMar>
-              <w:top w:w="100" w:type="dxa"/>
-              <w:bottom w:w="100" w:type="dxa"/>
+              <w:top w:w="80" w:type="dxa"/>
+              <w:bottom w:w="80" w:type="dxa"/>
               <w:left w:w="100" w:type="dxa"/>
               <w:right w:w="100" w:type="dxa"/>
             </w:tcMar>
           </w:tcPr>
           <w:p>
             <w:pPr>
+              <w:keepNext w:val="0"/>
               <w:spacing w:after="30" w:line="280" w:lineRule="exact"/>
               <w:jc w:val="center"/>
             </w:pPr>
@@ -3282,14 +3367,15 @@
             <w:tcW w:type="dxa" w:w="2891"/>
             <w:vAlign w:val="center"/>
             <w:tcMar>
-              <w:top w:w="100" w:type="dxa"/>
-              <w:bottom w:w="100" w:type="dxa"/>
+              <w:top w:w="80" w:type="dxa"/>
+              <w:bottom w:w="80" w:type="dxa"/>
               <w:left w:w="100" w:type="dxa"/>
               <w:right w:w="100" w:type="dxa"/>
             </w:tcMar>
           </w:tcPr>
           <w:p>
             <w:pPr>
+              <w:keepNext w:val="0"/>
               <w:spacing w:after="30" w:line="280" w:lineRule="exact"/>
             </w:pPr>
             <w:r>
@@ -3308,14 +3394,15 @@
             <w:tcW w:type="dxa" w:w="2608"/>
             <w:vAlign w:val="center"/>
             <w:tcMar>
-              <w:top w:w="100" w:type="dxa"/>
-              <w:bottom w:w="100" w:type="dxa"/>
+              <w:top w:w="80" w:type="dxa"/>
+              <w:bottom w:w="80" w:type="dxa"/>
               <w:left w:w="100" w:type="dxa"/>
               <w:right w:w="100" w:type="dxa"/>
             </w:tcMar>
           </w:tcPr>
           <w:p>
             <w:pPr>
+              <w:keepNext w:val="0"/>
               <w:spacing w:after="30" w:line="280" w:lineRule="exact"/>
             </w:pPr>
             <w:r>
@@ -3334,14 +3421,15 @@
             <w:tcW w:type="dxa" w:w="2608"/>
             <w:vAlign w:val="center"/>
             <w:tcMar>
-              <w:top w:w="100" w:type="dxa"/>
-              <w:bottom w:w="100" w:type="dxa"/>
+              <w:top w:w="80" w:type="dxa"/>
+              <w:bottom w:w="80" w:type="dxa"/>
               <w:left w:w="100" w:type="dxa"/>
               <w:right w:w="100" w:type="dxa"/>
             </w:tcMar>
           </w:tcPr>
           <w:p>
             <w:pPr>
+              <w:keepNext w:val="0"/>
               <w:spacing w:after="30" w:line="280" w:lineRule="exact"/>
             </w:pPr>
             <w:r>
@@ -3365,14 +3453,15 @@
             <w:tcW w:type="dxa" w:w="1417"/>
             <w:vAlign w:val="center"/>
             <w:tcMar>
-              <w:top w:w="100" w:type="dxa"/>
-              <w:bottom w:w="100" w:type="dxa"/>
+              <w:top w:w="80" w:type="dxa"/>
+              <w:bottom w:w="80" w:type="dxa"/>
               <w:left w:w="100" w:type="dxa"/>
               <w:right w:w="100" w:type="dxa"/>
             </w:tcMar>
           </w:tcPr>
           <w:p>
             <w:pPr>
+              <w:keepNext w:val="0"/>
               <w:spacing w:after="30" w:line="280" w:lineRule="exact"/>
               <w:jc w:val="center"/>
             </w:pPr>
@@ -3392,14 +3481,15 @@
             <w:tcW w:type="dxa" w:w="2891"/>
             <w:vAlign w:val="center"/>
             <w:tcMar>
-              <w:top w:w="100" w:type="dxa"/>
-              <w:bottom w:w="100" w:type="dxa"/>
+              <w:top w:w="80" w:type="dxa"/>
+              <w:bottom w:w="80" w:type="dxa"/>
               <w:left w:w="100" w:type="dxa"/>
               <w:right w:w="100" w:type="dxa"/>
             </w:tcMar>
           </w:tcPr>
           <w:p>
             <w:pPr>
+              <w:keepNext w:val="0"/>
               <w:spacing w:after="30" w:line="280" w:lineRule="exact"/>
             </w:pPr>
             <w:r>
@@ -3418,14 +3508,15 @@
             <w:tcW w:type="dxa" w:w="2608"/>
             <w:vAlign w:val="center"/>
             <w:tcMar>
-              <w:top w:w="100" w:type="dxa"/>
-              <w:bottom w:w="100" w:type="dxa"/>
+              <w:top w:w="80" w:type="dxa"/>
+              <w:bottom w:w="80" w:type="dxa"/>
               <w:left w:w="100" w:type="dxa"/>
               <w:right w:w="100" w:type="dxa"/>
             </w:tcMar>
           </w:tcPr>
           <w:p>
             <w:pPr>
+              <w:keepNext w:val="0"/>
               <w:spacing w:after="30" w:line="280" w:lineRule="exact"/>
             </w:pPr>
             <w:r>
@@ -3444,14 +3535,15 @@
             <w:tcW w:type="dxa" w:w="2608"/>
             <w:vAlign w:val="center"/>
             <w:tcMar>
-              <w:top w:w="100" w:type="dxa"/>
-              <w:bottom w:w="100" w:type="dxa"/>
+              <w:top w:w="80" w:type="dxa"/>
+              <w:bottom w:w="80" w:type="dxa"/>
               <w:left w:w="100" w:type="dxa"/>
               <w:right w:w="100" w:type="dxa"/>
             </w:tcMar>
           </w:tcPr>
           <w:p>
             <w:pPr>
+              <w:keepNext w:val="0"/>
               <w:spacing w:after="30" w:line="280" w:lineRule="exact"/>
             </w:pPr>
             <w:r>
@@ -3475,14 +3567,15 @@
             <w:tcW w:type="dxa" w:w="1417"/>
             <w:vAlign w:val="center"/>
             <w:tcMar>
-              <w:top w:w="100" w:type="dxa"/>
-              <w:bottom w:w="100" w:type="dxa"/>
+              <w:top w:w="80" w:type="dxa"/>
+              <w:bottom w:w="80" w:type="dxa"/>
               <w:left w:w="100" w:type="dxa"/>
               <w:right w:w="100" w:type="dxa"/>
             </w:tcMar>
           </w:tcPr>
           <w:p>
             <w:pPr>
+              <w:keepNext w:val="0"/>
               <w:spacing w:after="30" w:line="280" w:lineRule="exact"/>
               <w:jc w:val="center"/>
             </w:pPr>
@@ -3502,14 +3595,15 @@
             <w:tcW w:type="dxa" w:w="2891"/>
             <w:vAlign w:val="center"/>
             <w:tcMar>
-              <w:top w:w="100" w:type="dxa"/>
-              <w:bottom w:w="100" w:type="dxa"/>
+              <w:top w:w="80" w:type="dxa"/>
+              <w:bottom w:w="80" w:type="dxa"/>
               <w:left w:w="100" w:type="dxa"/>
               <w:right w:w="100" w:type="dxa"/>
             </w:tcMar>
           </w:tcPr>
           <w:p>
             <w:pPr>
+              <w:keepNext w:val="0"/>
               <w:spacing w:after="30" w:line="280" w:lineRule="exact"/>
             </w:pPr>
             <w:r>
@@ -3528,14 +3622,15 @@
             <w:tcW w:type="dxa" w:w="2608"/>
             <w:vAlign w:val="center"/>
             <w:tcMar>
-              <w:top w:w="100" w:type="dxa"/>
-              <w:bottom w:w="100" w:type="dxa"/>
+              <w:top w:w="80" w:type="dxa"/>
+              <w:bottom w:w="80" w:type="dxa"/>
               <w:left w:w="100" w:type="dxa"/>
               <w:right w:w="100" w:type="dxa"/>
             </w:tcMar>
           </w:tcPr>
           <w:p>
             <w:pPr>
+              <w:keepNext w:val="0"/>
               <w:spacing w:after="30" w:line="280" w:lineRule="exact"/>
             </w:pPr>
             <w:r>
@@ -3554,14 +3649,15 @@
             <w:tcW w:type="dxa" w:w="2608"/>
             <w:vAlign w:val="center"/>
             <w:tcMar>
-              <w:top w:w="100" w:type="dxa"/>
-              <w:bottom w:w="100" w:type="dxa"/>
+              <w:top w:w="80" w:type="dxa"/>
+              <w:bottom w:w="80" w:type="dxa"/>
               <w:left w:w="100" w:type="dxa"/>
               <w:right w:w="100" w:type="dxa"/>
             </w:tcMar>
           </w:tcPr>
           <w:p>
             <w:pPr>
+              <w:keepNext w:val="0"/>
               <w:spacing w:after="30" w:line="280" w:lineRule="exact"/>
             </w:pPr>
             <w:r>
@@ -3585,14 +3681,15 @@
             <w:tcW w:type="dxa" w:w="1417"/>
             <w:vAlign w:val="center"/>
             <w:tcMar>
-              <w:top w:w="100" w:type="dxa"/>
-              <w:bottom w:w="100" w:type="dxa"/>
+              <w:top w:w="80" w:type="dxa"/>
+              <w:bottom w:w="80" w:type="dxa"/>
               <w:left w:w="100" w:type="dxa"/>
               <w:right w:w="100" w:type="dxa"/>
             </w:tcMar>
           </w:tcPr>
           <w:p>
             <w:pPr>
+              <w:keepNext w:val="0"/>
               <w:spacing w:after="30" w:line="280" w:lineRule="exact"/>
               <w:jc w:val="center"/>
             </w:pPr>
@@ -3612,14 +3709,15 @@
             <w:tcW w:type="dxa" w:w="2891"/>
             <w:vAlign w:val="center"/>
             <w:tcMar>
-              <w:top w:w="100" w:type="dxa"/>
-              <w:bottom w:w="100" w:type="dxa"/>
+              <w:top w:w="80" w:type="dxa"/>
+              <w:bottom w:w="80" w:type="dxa"/>
               <w:left w:w="100" w:type="dxa"/>
               <w:right w:w="100" w:type="dxa"/>
             </w:tcMar>
           </w:tcPr>
           <w:p>
             <w:pPr>
+              <w:keepNext w:val="0"/>
               <w:spacing w:after="30" w:line="280" w:lineRule="exact"/>
             </w:pPr>
             <w:r>
@@ -3638,14 +3736,15 @@
             <w:tcW w:type="dxa" w:w="2608"/>
             <w:vAlign w:val="center"/>
             <w:tcMar>
-              <w:top w:w="100" w:type="dxa"/>
-              <w:bottom w:w="100" w:type="dxa"/>
+              <w:top w:w="80" w:type="dxa"/>
+              <w:bottom w:w="80" w:type="dxa"/>
               <w:left w:w="100" w:type="dxa"/>
               <w:right w:w="100" w:type="dxa"/>
             </w:tcMar>
           </w:tcPr>
           <w:p>
             <w:pPr>
+              <w:keepNext w:val="0"/>
               <w:spacing w:after="30" w:line="280" w:lineRule="exact"/>
             </w:pPr>
             <w:r>
@@ -3664,14 +3763,15 @@
             <w:tcW w:type="dxa" w:w="2608"/>
             <w:vAlign w:val="center"/>
             <w:tcMar>
-              <w:top w:w="100" w:type="dxa"/>
-              <w:bottom w:w="100" w:type="dxa"/>
+              <w:top w:w="80" w:type="dxa"/>
+              <w:bottom w:w="80" w:type="dxa"/>
               <w:left w:w="100" w:type="dxa"/>
               <w:right w:w="100" w:type="dxa"/>
             </w:tcMar>
           </w:tcPr>
           <w:p>
             <w:pPr>
+              <w:keepNext w:val="0"/>
               <w:spacing w:after="30" w:line="280" w:lineRule="exact"/>
             </w:pPr>
             <w:r>
@@ -3689,12 +3789,7 @@
     </w:tbl>
     <w:p>
       <w:pPr>
-        <w:spacing w:after="20" w:line="120" w:lineRule="auto"/>
-      </w:pPr>
-    </w:p>
-    <w:p>
-      <w:pPr>
-        <w:spacing w:after="140" w:line="360" w:lineRule="exact"/>
+        <w:spacing w:after="100" w:line="360" w:lineRule="exact"/>
       </w:pPr>
       <w:r>
         <w:rPr>
@@ -3703,12 +3798,12 @@
           <w:color w:val="000000"/>
           <w:sz w:val="23"/>
         </w:rPr>
-        <w:t>训练loss继续降低，验证误差却先升后降，再次升高。因此看到5000步loss最低，不能直接宣布它是最好策略。表中的训练值是100步均值；不是当步loss，也不含物理成功率。</w:t>
+        <w:t>如果只盯着训练loss，看到5000步会觉得还在进步。但验证误差在3000步以后又升了起来。表中训练值是最近100步的均值，说明模型对训练样本拟合得更好了；它没有告诉我们新位置是否更好抓。这正是保留中间模型的用处。</w:t>
       </w:r>
     </w:p>
     <w:p>
       <w:pPr>
-        <w:spacing w:after="140" w:line="360" w:lineRule="exact"/>
+        <w:spacing w:after="100" w:line="360" w:lineRule="exact"/>
       </w:pPr>
       <w:r>
         <w:rPr>
@@ -3717,7 +3812,7 @@
           <w:color w:val="000000"/>
           <w:sz w:val="23"/>
         </w:rPr>
-        <w:t>验证时，每个完整验证回合取0、100、201、301、402五个观察锚点，让模型只根据观察预测，再与后续动作比较。每个回合有401行有效目标，排除padding后计算误差，再对4回合等权平均。它能筛查动作拟合，但仍需要物理闭环验收。</w:t>
+        <w:t>离线验证时，我们在每个完整验证回合取0、100、201、301、402五个观察锚点，让模型预测，再与后续动作比较。每回合有401行有效目标，排除padding后计算误差，最后对4回合等权平均。这个数帮助筛选候选，候选接下来还要在仿真中真正做完抓放。</w:t>
       </w:r>
     </w:p>
     <w:p>
@@ -3736,7 +3831,7 @@
     </w:p>
     <w:p>
       <w:pPr>
-        <w:spacing w:after="140" w:line="360" w:lineRule="exact"/>
+        <w:spacing w:after="100" w:line="360" w:lineRule="exact"/>
       </w:pPr>
       <w:r>
         <w:rPr>
@@ -3745,12 +3840,12 @@
           <w:color w:val="000000"/>
           <w:sz w:val="23"/>
         </w:rPr>
-        <w:t>先要求同执行模式的原位成功，再比较4个验证位置的完整抓放数，其次比较稳态抓持数，最后用标准化MAE处理同分。step2000与step3000的ensemble1都成功4/4；step3000误差更低，按预定规则被选中。</w:t>
+        <w:t>我们提前定下了选择顺序：先看同执行模式的原位能否成功，再比4个验证位置的完整抓放数，其次比稳态抓持数，仍相同才看标准化MAE。step2000和step3000搭配ensemble1都是4/4，step3000的误差更低，因此被选中。</w:t>
       </w:r>
     </w:p>
     <w:p>
       <w:pPr>
-        <w:spacing w:after="140" w:line="360" w:lineRule="exact"/>
+        <w:spacing w:after="100" w:line="360" w:lineRule="exact"/>
       </w:pPr>
       <w:r>
         <w:rPr>
@@ -3759,13 +3854,12 @@
           <w:color w:val="000000"/>
           <w:sz w:val="23"/>
         </w:rPr>
-        <w:t>选定后冻结模型与模式，再运行最终8点；测试不参与训练或选模。step5000夹爪目标越界，保留原始失败，不通过clip或放宽边界制造成功。</w:t>
+        <w:t>另一边，step5000因为夹爪目标越界，被保护检查中断。我们保留这个结果，没有裁剪输出或放宽界限让它继续。最后留下step3000与ensemble1，固定这份选择，再去测试八个保留位置。</w:t>
       </w:r>
     </w:p>
     <w:p>
       <w:pPr>
         <w:pStyle w:val="Heading1"/>
-        <w:pageBreakBefore/>
       </w:pPr>
       <w:r>
         <w:rPr>
@@ -3779,7 +3873,7 @@
     </w:p>
     <w:p>
       <w:pPr>
-        <w:spacing w:after="140" w:line="360" w:lineRule="exact"/>
+        <w:spacing w:after="100" w:line="360" w:lineRule="exact"/>
       </w:pPr>
       <w:r>
         <w:rPr>
@@ -3788,7 +3882,7 @@
           <w:color w:val="000000"/>
           <w:sz w:val="23"/>
         </w:rPr>
-        <w:t>同一权重配不同执行模式，结果可能差很多。训练得到的动作块必须接入含义一致的控制循环；只换权重、仍沿用旧执行队列，不能保证重现成绩。</w:t>
+        <w:t>单点时那次“不闭爪”已经提醒过我们，权重只是策略的一部分。一个动作块预测出来以后，执行多少步、什么时候重新看图、怎样融合前后预测，都可能改变最后结果。这次我们把两种执行方式放在一起比较。</w:t>
       </w:r>
     </w:p>
     <w:tbl>
@@ -3820,8 +3914,8 @@
             <w:tcW w:type="dxa" w:w="1814"/>
             <w:vAlign w:val="center"/>
             <w:tcMar>
-              <w:top w:w="100" w:type="dxa"/>
-              <w:bottom w:w="100" w:type="dxa"/>
+              <w:top w:w="80" w:type="dxa"/>
+              <w:bottom w:w="80" w:type="dxa"/>
               <w:left w:w="100" w:type="dxa"/>
               <w:right w:w="100" w:type="dxa"/>
             </w:tcMar>
@@ -3829,6 +3923,7 @@
           </w:tcPr>
           <w:p>
             <w:pPr>
+              <w:keepNext/>
               <w:spacing w:after="30" w:line="280" w:lineRule="exact"/>
             </w:pPr>
             <w:r>
@@ -3847,8 +3942,8 @@
             <w:tcW w:type="dxa" w:w="2835"/>
             <w:vAlign w:val="center"/>
             <w:tcMar>
-              <w:top w:w="100" w:type="dxa"/>
-              <w:bottom w:w="100" w:type="dxa"/>
+              <w:top w:w="80" w:type="dxa"/>
+              <w:bottom w:w="80" w:type="dxa"/>
               <w:left w:w="100" w:type="dxa"/>
               <w:right w:w="100" w:type="dxa"/>
             </w:tcMar>
@@ -3856,6 +3951,7 @@
           </w:tcPr>
           <w:p>
             <w:pPr>
+              <w:keepNext/>
               <w:spacing w:after="30" w:line="280" w:lineRule="exact"/>
             </w:pPr>
             <w:r>
@@ -3874,8 +3970,8 @@
             <w:tcW w:type="dxa" w:w="4876"/>
             <w:vAlign w:val="center"/>
             <w:tcMar>
-              <w:top w:w="100" w:type="dxa"/>
-              <w:bottom w:w="100" w:type="dxa"/>
+              <w:top w:w="80" w:type="dxa"/>
+              <w:bottom w:w="80" w:type="dxa"/>
               <w:left w:w="100" w:type="dxa"/>
               <w:right w:w="100" w:type="dxa"/>
             </w:tcMar>
@@ -3883,6 +3979,7 @@
           </w:tcPr>
           <w:p>
             <w:pPr>
+              <w:keepNext/>
               <w:spacing w:after="30" w:line="280" w:lineRule="exact"/>
             </w:pPr>
             <w:r>
@@ -3906,14 +4003,15 @@
             <w:tcW w:type="dxa" w:w="1814"/>
             <w:vAlign w:val="center"/>
             <w:tcMar>
-              <w:top w:w="100" w:type="dxa"/>
-              <w:bottom w:w="100" w:type="dxa"/>
+              <w:top w:w="80" w:type="dxa"/>
+              <w:bottom w:w="80" w:type="dxa"/>
               <w:left w:w="100" w:type="dxa"/>
               <w:right w:w="100" w:type="dxa"/>
             </w:tcMar>
           </w:tcPr>
           <w:p>
             <w:pPr>
+              <w:keepNext w:val="0"/>
               <w:spacing w:after="30" w:line="280" w:lineRule="exact"/>
             </w:pPr>
             <w:r>
@@ -3932,14 +4030,15 @@
             <w:tcW w:type="dxa" w:w="2835"/>
             <w:vAlign w:val="center"/>
             <w:tcMar>
-              <w:top w:w="100" w:type="dxa"/>
-              <w:bottom w:w="100" w:type="dxa"/>
+              <w:top w:w="80" w:type="dxa"/>
+              <w:bottom w:w="80" w:type="dxa"/>
               <w:left w:w="100" w:type="dxa"/>
               <w:right w:w="100" w:type="dxa"/>
             </w:tcMar>
           </w:tcPr>
           <w:p>
             <w:pPr>
+              <w:keepNext w:val="0"/>
               <w:spacing w:after="30" w:line="280" w:lineRule="exact"/>
             </w:pPr>
             <w:r>
@@ -3958,14 +4057,15 @@
             <w:tcW w:type="dxa" w:w="4876"/>
             <w:vAlign w:val="center"/>
             <w:tcMar>
-              <w:top w:w="100" w:type="dxa"/>
-              <w:bottom w:w="100" w:type="dxa"/>
+              <w:top w:w="80" w:type="dxa"/>
+              <w:bottom w:w="80" w:type="dxa"/>
               <w:left w:w="100" w:type="dxa"/>
               <w:right w:w="100" w:type="dxa"/>
             </w:tcMar>
           </w:tcPr>
           <w:p>
             <w:pPr>
+              <w:keepNext w:val="0"/>
               <w:spacing w:after="30" w:line="280" w:lineRule="exact"/>
             </w:pPr>
             <w:r>
@@ -3989,14 +4089,15 @@
             <w:tcW w:type="dxa" w:w="1814"/>
             <w:vAlign w:val="center"/>
             <w:tcMar>
-              <w:top w:w="100" w:type="dxa"/>
-              <w:bottom w:w="100" w:type="dxa"/>
+              <w:top w:w="80" w:type="dxa"/>
+              <w:bottom w:w="80" w:type="dxa"/>
               <w:left w:w="100" w:type="dxa"/>
               <w:right w:w="100" w:type="dxa"/>
             </w:tcMar>
           </w:tcPr>
           <w:p>
             <w:pPr>
+              <w:keepNext w:val="0"/>
               <w:spacing w:after="30" w:line="280" w:lineRule="exact"/>
             </w:pPr>
             <w:r>
@@ -4015,14 +4116,15 @@
             <w:tcW w:type="dxa" w:w="2835"/>
             <w:vAlign w:val="center"/>
             <w:tcMar>
-              <w:top w:w="100" w:type="dxa"/>
-              <w:bottom w:w="100" w:type="dxa"/>
+              <w:top w:w="80" w:type="dxa"/>
+              <w:bottom w:w="80" w:type="dxa"/>
               <w:left w:w="100" w:type="dxa"/>
               <w:right w:w="100" w:type="dxa"/>
             </w:tcMar>
           </w:tcPr>
           <w:p>
             <w:pPr>
+              <w:keepNext w:val="0"/>
               <w:spacing w:after="30" w:line="280" w:lineRule="exact"/>
             </w:pPr>
             <w:r>
@@ -4041,14 +4143,15 @@
             <w:tcW w:type="dxa" w:w="4876"/>
             <w:vAlign w:val="center"/>
             <w:tcMar>
-              <w:top w:w="100" w:type="dxa"/>
-              <w:bottom w:w="100" w:type="dxa"/>
+              <w:top w:w="80" w:type="dxa"/>
+              <w:bottom w:w="80" w:type="dxa"/>
               <w:left w:w="100" w:type="dxa"/>
               <w:right w:w="100" w:type="dxa"/>
             </w:tcMar>
           </w:tcPr>
           <w:p>
             <w:pPr>
+              <w:keepNext w:val="0"/>
               <w:spacing w:after="30" w:line="280" w:lineRule="exact"/>
             </w:pPr>
             <w:r>
@@ -4066,12 +4169,7 @@
     </w:tbl>
     <w:p>
       <w:pPr>
-        <w:spacing w:after="20" w:line="120" w:lineRule="auto"/>
-      </w:pPr>
-    </w:p>
-    <w:p>
-      <w:pPr>
-        <w:spacing w:after="140" w:line="360" w:lineRule="exact"/>
+        <w:spacing w:after="100" w:line="360" w:lineRule="exact"/>
       </w:pPr>
       <w:r>
         <w:rPr>
@@ -4080,7 +4178,7 @@
           <w:color w:val="000000"/>
           <w:sz w:val="23"/>
         </w:rPr>
-        <w:t>ensemble1将覆盖当前时刻的多份预测加权。沿用旧预测在前的exp(−0.01×序号)规则；满100份重叠预测时，最新一份权重约0.585%，来源平均年龄约57.70帧。它兼顾平滑，但有反馈滞后，不能把“每帧重算”理解成完全执行最新预测的第一行动作。</w:t>
+        <w:t>ensemble1每帧都会重新预测，再把覆盖当前时刻的多份预测加权。它沿用旧预测在前的exp(−0.01×序号)规则；满100份重叠预测时，最新一份权重约0.585%，来源平均年龄约57.70帧。因此动作更平滑，同时也带着旧预测的滞后，并非每次直接执行最新预测的第一行。</w:t>
       </w:r>
     </w:p>
     <w:tbl>
@@ -4112,8 +4210,8 @@
             <w:tcW w:type="dxa" w:w="1814"/>
             <w:vAlign w:val="center"/>
             <w:tcMar>
-              <w:top w:w="100" w:type="dxa"/>
-              <w:bottom w:w="100" w:type="dxa"/>
+              <w:top w:w="80" w:type="dxa"/>
+              <w:bottom w:w="80" w:type="dxa"/>
               <w:left w:w="100" w:type="dxa"/>
               <w:right w:w="100" w:type="dxa"/>
             </w:tcMar>
@@ -4121,6 +4219,7 @@
           </w:tcPr>
           <w:p>
             <w:pPr>
+              <w:keepNext/>
               <w:spacing w:after="30" w:line="280" w:lineRule="exact"/>
             </w:pPr>
             <w:r>
@@ -4139,8 +4238,8 @@
             <w:tcW w:type="dxa" w:w="2835"/>
             <w:vAlign w:val="center"/>
             <w:tcMar>
-              <w:top w:w="100" w:type="dxa"/>
-              <w:bottom w:w="100" w:type="dxa"/>
+              <w:top w:w="80" w:type="dxa"/>
+              <w:bottom w:w="80" w:type="dxa"/>
               <w:left w:w="100" w:type="dxa"/>
               <w:right w:w="100" w:type="dxa"/>
             </w:tcMar>
@@ -4148,6 +4247,7 @@
           </w:tcPr>
           <w:p>
             <w:pPr>
+              <w:keepNext/>
               <w:spacing w:after="30" w:line="280" w:lineRule="exact"/>
             </w:pPr>
             <w:r>
@@ -4166,8 +4266,8 @@
             <w:tcW w:type="dxa" w:w="4876"/>
             <w:vAlign w:val="center"/>
             <w:tcMar>
-              <w:top w:w="100" w:type="dxa"/>
-              <w:bottom w:w="100" w:type="dxa"/>
+              <w:top w:w="80" w:type="dxa"/>
+              <w:bottom w:w="80" w:type="dxa"/>
               <w:left w:w="100" w:type="dxa"/>
               <w:right w:w="100" w:type="dxa"/>
             </w:tcMar>
@@ -4175,6 +4275,7 @@
           </w:tcPr>
           <w:p>
             <w:pPr>
+              <w:keepNext/>
               <w:spacing w:after="30" w:line="280" w:lineRule="exact"/>
             </w:pPr>
             <w:r>
@@ -4198,14 +4299,15 @@
             <w:tcW w:type="dxa" w:w="1814"/>
             <w:vAlign w:val="center"/>
             <w:tcMar>
-              <w:top w:w="100" w:type="dxa"/>
-              <w:bottom w:w="100" w:type="dxa"/>
+              <w:top w:w="80" w:type="dxa"/>
+              <w:bottom w:w="80" w:type="dxa"/>
               <w:left w:w="100" w:type="dxa"/>
               <w:right w:w="100" w:type="dxa"/>
             </w:tcMar>
           </w:tcPr>
           <w:p>
             <w:pPr>
+              <w:keepNext w:val="0"/>
               <w:spacing w:after="30" w:line="280" w:lineRule="exact"/>
             </w:pPr>
             <w:r>
@@ -4224,14 +4326,15 @@
             <w:tcW w:type="dxa" w:w="2835"/>
             <w:vAlign w:val="center"/>
             <w:tcMar>
-              <w:top w:w="100" w:type="dxa"/>
-              <w:bottom w:w="100" w:type="dxa"/>
+              <w:top w:w="80" w:type="dxa"/>
+              <w:bottom w:w="80" w:type="dxa"/>
               <w:left w:w="100" w:type="dxa"/>
               <w:right w:w="100" w:type="dxa"/>
             </w:tcMar>
           </w:tcPr>
           <w:p>
             <w:pPr>
+              <w:keepNext w:val="0"/>
               <w:spacing w:after="30" w:line="280" w:lineRule="exact"/>
             </w:pPr>
             <w:r>
@@ -4250,14 +4353,15 @@
             <w:tcW w:type="dxa" w:w="4876"/>
             <w:vAlign w:val="center"/>
             <w:tcMar>
-              <w:top w:w="100" w:type="dxa"/>
-              <w:bottom w:w="100" w:type="dxa"/>
+              <w:top w:w="80" w:type="dxa"/>
+              <w:bottom w:w="80" w:type="dxa"/>
               <w:left w:w="100" w:type="dxa"/>
               <w:right w:w="100" w:type="dxa"/>
             </w:tcMar>
           </w:tcPr>
           <w:p>
             <w:pPr>
+              <w:keepNext w:val="0"/>
               <w:spacing w:after="30" w:line="280" w:lineRule="exact"/>
             </w:pPr>
             <w:r>
@@ -4281,14 +4385,15 @@
             <w:tcW w:type="dxa" w:w="1814"/>
             <w:vAlign w:val="center"/>
             <w:tcMar>
-              <w:top w:w="100" w:type="dxa"/>
-              <w:bottom w:w="100" w:type="dxa"/>
+              <w:top w:w="80" w:type="dxa"/>
+              <w:bottom w:w="80" w:type="dxa"/>
               <w:left w:w="100" w:type="dxa"/>
               <w:right w:w="100" w:type="dxa"/>
             </w:tcMar>
           </w:tcPr>
           <w:p>
             <w:pPr>
+              <w:keepNext w:val="0"/>
               <w:spacing w:after="30" w:line="280" w:lineRule="exact"/>
             </w:pPr>
             <w:r>
@@ -4307,14 +4412,15 @@
             <w:tcW w:type="dxa" w:w="2835"/>
             <w:vAlign w:val="center"/>
             <w:tcMar>
-              <w:top w:w="100" w:type="dxa"/>
-              <w:bottom w:w="100" w:type="dxa"/>
+              <w:top w:w="80" w:type="dxa"/>
+              <w:bottom w:w="80" w:type="dxa"/>
               <w:left w:w="100" w:type="dxa"/>
               <w:right w:w="100" w:type="dxa"/>
             </w:tcMar>
           </w:tcPr>
           <w:p>
             <w:pPr>
+              <w:keepNext w:val="0"/>
               <w:spacing w:after="30" w:line="280" w:lineRule="exact"/>
             </w:pPr>
             <w:r>
@@ -4333,14 +4439,15 @@
             <w:tcW w:type="dxa" w:w="4876"/>
             <w:vAlign w:val="center"/>
             <w:tcMar>
-              <w:top w:w="100" w:type="dxa"/>
-              <w:bottom w:w="100" w:type="dxa"/>
+              <w:top w:w="80" w:type="dxa"/>
+              <w:bottom w:w="80" w:type="dxa"/>
               <w:left w:w="100" w:type="dxa"/>
               <w:right w:w="100" w:type="dxa"/>
             </w:tcMar>
           </w:tcPr>
           <w:p>
             <w:pPr>
+              <w:keepNext w:val="0"/>
               <w:spacing w:after="30" w:line="280" w:lineRule="exact"/>
             </w:pPr>
             <w:r>
@@ -4364,14 +4471,15 @@
             <w:tcW w:type="dxa" w:w="1814"/>
             <w:vAlign w:val="center"/>
             <w:tcMar>
-              <w:top w:w="100" w:type="dxa"/>
-              <w:bottom w:w="100" w:type="dxa"/>
+              <w:top w:w="80" w:type="dxa"/>
+              <w:bottom w:w="80" w:type="dxa"/>
               <w:left w:w="100" w:type="dxa"/>
               <w:right w:w="100" w:type="dxa"/>
             </w:tcMar>
           </w:tcPr>
           <w:p>
             <w:pPr>
+              <w:keepNext w:val="0"/>
               <w:spacing w:after="30" w:line="280" w:lineRule="exact"/>
             </w:pPr>
             <w:r>
@@ -4390,14 +4498,15 @@
             <w:tcW w:type="dxa" w:w="2835"/>
             <w:vAlign w:val="center"/>
             <w:tcMar>
-              <w:top w:w="100" w:type="dxa"/>
-              <w:bottom w:w="100" w:type="dxa"/>
+              <w:top w:w="80" w:type="dxa"/>
+              <w:bottom w:w="80" w:type="dxa"/>
               <w:left w:w="100" w:type="dxa"/>
               <w:right w:w="100" w:type="dxa"/>
             </w:tcMar>
           </w:tcPr>
           <w:p>
             <w:pPr>
+              <w:keepNext w:val="0"/>
               <w:spacing w:after="30" w:line="280" w:lineRule="exact"/>
             </w:pPr>
             <w:r>
@@ -4416,14 +4525,15 @@
             <w:tcW w:type="dxa" w:w="4876"/>
             <w:vAlign w:val="center"/>
             <w:tcMar>
-              <w:top w:w="100" w:type="dxa"/>
-              <w:bottom w:w="100" w:type="dxa"/>
+              <w:top w:w="80" w:type="dxa"/>
+              <w:bottom w:w="80" w:type="dxa"/>
               <w:left w:w="100" w:type="dxa"/>
               <w:right w:w="100" w:type="dxa"/>
             </w:tcMar>
           </w:tcPr>
           <w:p>
             <w:pPr>
+              <w:keepNext w:val="0"/>
               <w:spacing w:after="30" w:line="280" w:lineRule="exact"/>
             </w:pPr>
             <w:r>
@@ -4447,14 +4557,15 @@
             <w:tcW w:type="dxa" w:w="1814"/>
             <w:vAlign w:val="center"/>
             <w:tcMar>
-              <w:top w:w="100" w:type="dxa"/>
-              <w:bottom w:w="100" w:type="dxa"/>
+              <w:top w:w="80" w:type="dxa"/>
+              <w:bottom w:w="80" w:type="dxa"/>
               <w:left w:w="100" w:type="dxa"/>
               <w:right w:w="100" w:type="dxa"/>
             </w:tcMar>
           </w:tcPr>
           <w:p>
             <w:pPr>
+              <w:keepNext w:val="0"/>
               <w:spacing w:after="30" w:line="280" w:lineRule="exact"/>
             </w:pPr>
             <w:r>
@@ -4473,14 +4584,15 @@
             <w:tcW w:type="dxa" w:w="2835"/>
             <w:vAlign w:val="center"/>
             <w:tcMar>
-              <w:top w:w="100" w:type="dxa"/>
-              <w:bottom w:w="100" w:type="dxa"/>
+              <w:top w:w="80" w:type="dxa"/>
+              <w:bottom w:w="80" w:type="dxa"/>
               <w:left w:w="100" w:type="dxa"/>
               <w:right w:w="100" w:type="dxa"/>
             </w:tcMar>
           </w:tcPr>
           <w:p>
             <w:pPr>
+              <w:keepNext w:val="0"/>
               <w:spacing w:after="30" w:line="280" w:lineRule="exact"/>
             </w:pPr>
             <w:r>
@@ -4499,14 +4611,15 @@
             <w:tcW w:type="dxa" w:w="4876"/>
             <w:vAlign w:val="center"/>
             <w:tcMar>
-              <w:top w:w="100" w:type="dxa"/>
-              <w:bottom w:w="100" w:type="dxa"/>
+              <w:top w:w="80" w:type="dxa"/>
+              <w:bottom w:w="80" w:type="dxa"/>
               <w:left w:w="100" w:type="dxa"/>
               <w:right w:w="100" w:type="dxa"/>
             </w:tcMar>
           </w:tcPr>
           <w:p>
             <w:pPr>
+              <w:keepNext w:val="0"/>
               <w:spacing w:after="30" w:line="280" w:lineRule="exact"/>
             </w:pPr>
             <w:r>
@@ -4530,14 +4643,15 @@
             <w:tcW w:type="dxa" w:w="1814"/>
             <w:vAlign w:val="center"/>
             <w:tcMar>
-              <w:top w:w="100" w:type="dxa"/>
-              <w:bottom w:w="100" w:type="dxa"/>
+              <w:top w:w="80" w:type="dxa"/>
+              <w:bottom w:w="80" w:type="dxa"/>
               <w:left w:w="100" w:type="dxa"/>
               <w:right w:w="100" w:type="dxa"/>
             </w:tcMar>
           </w:tcPr>
           <w:p>
             <w:pPr>
+              <w:keepNext w:val="0"/>
               <w:spacing w:after="30" w:line="280" w:lineRule="exact"/>
             </w:pPr>
             <w:r>
@@ -4556,14 +4670,15 @@
             <w:tcW w:type="dxa" w:w="2835"/>
             <w:vAlign w:val="center"/>
             <w:tcMar>
-              <w:top w:w="100" w:type="dxa"/>
-              <w:bottom w:w="100" w:type="dxa"/>
+              <w:top w:w="80" w:type="dxa"/>
+              <w:bottom w:w="80" w:type="dxa"/>
               <w:left w:w="100" w:type="dxa"/>
               <w:right w:w="100" w:type="dxa"/>
             </w:tcMar>
           </w:tcPr>
           <w:p>
             <w:pPr>
+              <w:keepNext w:val="0"/>
               <w:spacing w:after="30" w:line="280" w:lineRule="exact"/>
             </w:pPr>
             <w:r>
@@ -4582,14 +4697,15 @@
             <w:tcW w:type="dxa" w:w="4876"/>
             <w:vAlign w:val="center"/>
             <w:tcMar>
-              <w:top w:w="100" w:type="dxa"/>
-              <w:bottom w:w="100" w:type="dxa"/>
+              <w:top w:w="80" w:type="dxa"/>
+              <w:bottom w:w="80" w:type="dxa"/>
               <w:left w:w="100" w:type="dxa"/>
               <w:right w:w="100" w:type="dxa"/>
             </w:tcMar>
           </w:tcPr>
           <w:p>
             <w:pPr>
+              <w:keepNext w:val="0"/>
               <w:spacing w:after="30" w:line="280" w:lineRule="exact"/>
             </w:pPr>
             <w:r>
@@ -4613,14 +4729,15 @@
             <w:tcW w:type="dxa" w:w="1814"/>
             <w:vAlign w:val="center"/>
             <w:tcMar>
-              <w:top w:w="100" w:type="dxa"/>
-              <w:bottom w:w="100" w:type="dxa"/>
+              <w:top w:w="80" w:type="dxa"/>
+              <w:bottom w:w="80" w:type="dxa"/>
               <w:left w:w="100" w:type="dxa"/>
               <w:right w:w="100" w:type="dxa"/>
             </w:tcMar>
           </w:tcPr>
           <w:p>
             <w:pPr>
+              <w:keepNext w:val="0"/>
               <w:spacing w:after="30" w:line="280" w:lineRule="exact"/>
             </w:pPr>
             <w:r>
@@ -4639,14 +4756,15 @@
             <w:tcW w:type="dxa" w:w="2835"/>
             <w:vAlign w:val="center"/>
             <w:tcMar>
-              <w:top w:w="100" w:type="dxa"/>
-              <w:bottom w:w="100" w:type="dxa"/>
+              <w:top w:w="80" w:type="dxa"/>
+              <w:bottom w:w="80" w:type="dxa"/>
               <w:left w:w="100" w:type="dxa"/>
               <w:right w:w="100" w:type="dxa"/>
             </w:tcMar>
           </w:tcPr>
           <w:p>
             <w:pPr>
+              <w:keepNext w:val="0"/>
               <w:spacing w:after="30" w:line="280" w:lineRule="exact"/>
             </w:pPr>
             <w:r>
@@ -4665,14 +4783,15 @@
             <w:tcW w:type="dxa" w:w="4876"/>
             <w:vAlign w:val="center"/>
             <w:tcMar>
-              <w:top w:w="100" w:type="dxa"/>
-              <w:bottom w:w="100" w:type="dxa"/>
+              <w:top w:w="80" w:type="dxa"/>
+              <w:bottom w:w="80" w:type="dxa"/>
               <w:left w:w="100" w:type="dxa"/>
               <w:right w:w="100" w:type="dxa"/>
             </w:tcMar>
           </w:tcPr>
           <w:p>
             <w:pPr>
+              <w:keepNext w:val="0"/>
               <w:spacing w:after="30" w:line="280" w:lineRule="exact"/>
             </w:pPr>
             <w:r>
@@ -4690,12 +4809,7 @@
     </w:tbl>
     <w:p>
       <w:pPr>
-        <w:spacing w:after="20" w:line="120" w:lineRule="auto"/>
-      </w:pPr>
-    </w:p>
-    <w:p>
-      <w:pPr>
-        <w:spacing w:after="140" w:line="360" w:lineRule="exact"/>
+        <w:spacing w:after="100" w:line="360" w:lineRule="exact"/>
       </w:pPr>
       <w:r>
         <w:rPr>
@@ -4704,12 +4818,12 @@
           <w:color w:val="000000"/>
           <w:sz w:val="23"/>
         </w:rPr>
-        <w:t>逐帧模式在450个仿真动作槽中生成450个新动作块，再把覆盖同一时刻的预测融合。它在本轮选定模型上有效，但会增加推理负担，也保留旧预测带来的滞后。上一轮单点模型曾因频繁截断而失败，与这里成功并不矛盾：两轮模型、训练覆盖和执行方式共同决定结果。</w:t>
+        <w:t>表里也能看到，逐帧反馈并不是换上就好：旧step600从2/4变成1/4，新step1000也没有改善。它与训练得更充分的step2000、step3000组合后，才得到4/4。与此前每10步丢掉整个后半段不同，ensemble1会保留重叠预测；两种做法都重新看图，实际使用动作的方式却不一样。</w:t>
       </w:r>
     </w:p>
     <w:p>
       <w:pPr>
-        <w:spacing w:after="140" w:line="360" w:lineRule="exact"/>
+        <w:spacing w:after="100" w:line="360" w:lineRule="exact"/>
       </w:pPr>
       <w:r>
         <w:rPr>
@@ -4764,7 +4878,6 @@
     <w:p>
       <w:pPr>
         <w:pStyle w:val="Heading1"/>
-        <w:pageBreakBefore/>
       </w:pPr>
       <w:r>
         <w:rPr>
@@ -4778,7 +4891,7 @@
     </w:p>
     <w:p>
       <w:pPr>
-        <w:spacing w:after="140" w:line="360" w:lineRule="exact"/>
+        <w:spacing w:after="100" w:line="360" w:lineRule="exact"/>
       </w:pPr>
       <w:r>
         <w:rPr>
@@ -4787,7 +4900,7 @@
           <w:color w:val="000000"/>
           <w:sz w:val="23"/>
         </w:rPr>
-        <w:t>模型与执行方式冻结后，我们才运行预先保留的八个新位置，每点一次，不根据测试结果重新选模。位置是相对参考抓取点的XY偏移，物体尺寸、灰盒、相机与动力学保持固定。</w:t>
+        <w:t>确定模型与执行方式之后，我们才打开预先保留的八个位置，每点只试一次，也没有看完结果再回头选模型。下表的XY偏移都相对参考抓取点；其他场景条件保持原样。</w:t>
       </w:r>
     </w:p>
     <w:tbl>
@@ -4820,8 +4933,8 @@
             <w:tcW w:type="dxa" w:w="1247"/>
             <w:vAlign w:val="center"/>
             <w:tcMar>
-              <w:top w:w="100" w:type="dxa"/>
-              <w:bottom w:w="100" w:type="dxa"/>
+              <w:top w:w="80" w:type="dxa"/>
+              <w:bottom w:w="80" w:type="dxa"/>
               <w:left w:w="100" w:type="dxa"/>
               <w:right w:w="100" w:type="dxa"/>
             </w:tcMar>
@@ -4829,6 +4942,7 @@
           </w:tcPr>
           <w:p>
             <w:pPr>
+              <w:keepNext/>
               <w:spacing w:after="30" w:line="280" w:lineRule="exact"/>
               <w:jc w:val="center"/>
             </w:pPr>
@@ -4848,8 +4962,8 @@
             <w:tcW w:type="dxa" w:w="2948"/>
             <w:vAlign w:val="center"/>
             <w:tcMar>
-              <w:top w:w="100" w:type="dxa"/>
-              <w:bottom w:w="100" w:type="dxa"/>
+              <w:top w:w="80" w:type="dxa"/>
+              <w:bottom w:w="80" w:type="dxa"/>
               <w:left w:w="100" w:type="dxa"/>
               <w:right w:w="100" w:type="dxa"/>
             </w:tcMar>
@@ -4857,6 +4971,7 @@
           </w:tcPr>
           <w:p>
             <w:pPr>
+              <w:keepNext/>
               <w:spacing w:after="30" w:line="280" w:lineRule="exact"/>
             </w:pPr>
             <w:r>
@@ -4875,8 +4990,8 @@
             <w:tcW w:type="dxa" w:w="2835"/>
             <w:vAlign w:val="center"/>
             <w:tcMar>
-              <w:top w:w="100" w:type="dxa"/>
-              <w:bottom w:w="100" w:type="dxa"/>
+              <w:top w:w="80" w:type="dxa"/>
+              <w:bottom w:w="80" w:type="dxa"/>
               <w:left w:w="100" w:type="dxa"/>
               <w:right w:w="100" w:type="dxa"/>
             </w:tcMar>
@@ -4884,6 +4999,7 @@
           </w:tcPr>
           <w:p>
             <w:pPr>
+              <w:keepNext/>
               <w:spacing w:after="30" w:line="280" w:lineRule="exact"/>
             </w:pPr>
             <w:r>
@@ -4902,8 +5018,8 @@
             <w:tcW w:type="dxa" w:w="2494"/>
             <w:vAlign w:val="center"/>
             <w:tcMar>
-              <w:top w:w="100" w:type="dxa"/>
-              <w:bottom w:w="100" w:type="dxa"/>
+              <w:top w:w="80" w:type="dxa"/>
+              <w:bottom w:w="80" w:type="dxa"/>
               <w:left w:w="100" w:type="dxa"/>
               <w:right w:w="100" w:type="dxa"/>
             </w:tcMar>
@@ -4911,6 +5027,7 @@
           </w:tcPr>
           <w:p>
             <w:pPr>
+              <w:keepNext/>
               <w:spacing w:after="30" w:line="280" w:lineRule="exact"/>
             </w:pPr>
             <w:r>
@@ -4934,14 +5051,15 @@
             <w:tcW w:type="dxa" w:w="1247"/>
             <w:vAlign w:val="center"/>
             <w:tcMar>
-              <w:top w:w="100" w:type="dxa"/>
-              <w:bottom w:w="100" w:type="dxa"/>
+              <w:top w:w="80" w:type="dxa"/>
+              <w:bottom w:w="80" w:type="dxa"/>
               <w:left w:w="100" w:type="dxa"/>
               <w:right w:w="100" w:type="dxa"/>
             </w:tcMar>
           </w:tcPr>
           <w:p>
             <w:pPr>
+              <w:keepNext w:val="0"/>
               <w:spacing w:after="30" w:line="280" w:lineRule="exact"/>
               <w:jc w:val="center"/>
             </w:pPr>
@@ -4961,14 +5079,15 @@
             <w:tcW w:type="dxa" w:w="2948"/>
             <w:vAlign w:val="center"/>
             <w:tcMar>
-              <w:top w:w="100" w:type="dxa"/>
-              <w:bottom w:w="100" w:type="dxa"/>
+              <w:top w:w="80" w:type="dxa"/>
+              <w:bottom w:w="80" w:type="dxa"/>
               <w:left w:w="100" w:type="dxa"/>
               <w:right w:w="100" w:type="dxa"/>
             </w:tcMar>
           </w:tcPr>
           <w:p>
             <w:pPr>
+              <w:keepNext w:val="0"/>
               <w:spacing w:after="30" w:line="280" w:lineRule="exact"/>
             </w:pPr>
             <w:r>
@@ -4987,14 +5106,15 @@
             <w:tcW w:type="dxa" w:w="2835"/>
             <w:vAlign w:val="center"/>
             <w:tcMar>
-              <w:top w:w="100" w:type="dxa"/>
-              <w:bottom w:w="100" w:type="dxa"/>
+              <w:top w:w="80" w:type="dxa"/>
+              <w:bottom w:w="80" w:type="dxa"/>
               <w:left w:w="100" w:type="dxa"/>
               <w:right w:w="100" w:type="dxa"/>
             </w:tcMar>
           </w:tcPr>
           <w:p>
             <w:pPr>
+              <w:keepNext w:val="0"/>
               <w:spacing w:after="30" w:line="280" w:lineRule="exact"/>
             </w:pPr>
             <w:r>
@@ -5013,14 +5133,15 @@
             <w:tcW w:type="dxa" w:w="2494"/>
             <w:vAlign w:val="center"/>
             <w:tcMar>
-              <w:top w:w="100" w:type="dxa"/>
-              <w:bottom w:w="100" w:type="dxa"/>
+              <w:top w:w="80" w:type="dxa"/>
+              <w:bottom w:w="80" w:type="dxa"/>
               <w:left w:w="100" w:type="dxa"/>
               <w:right w:w="100" w:type="dxa"/>
             </w:tcMar>
           </w:tcPr>
           <w:p>
             <w:pPr>
+              <w:keepNext w:val="0"/>
               <w:spacing w:after="30" w:line="280" w:lineRule="exact"/>
             </w:pPr>
             <w:r>
@@ -5044,14 +5165,15 @@
             <w:tcW w:type="dxa" w:w="1247"/>
             <w:vAlign w:val="center"/>
             <w:tcMar>
-              <w:top w:w="100" w:type="dxa"/>
-              <w:bottom w:w="100" w:type="dxa"/>
+              <w:top w:w="80" w:type="dxa"/>
+              <w:bottom w:w="80" w:type="dxa"/>
               <w:left w:w="100" w:type="dxa"/>
               <w:right w:w="100" w:type="dxa"/>
             </w:tcMar>
           </w:tcPr>
           <w:p>
             <w:pPr>
+              <w:keepNext w:val="0"/>
               <w:spacing w:after="30" w:line="280" w:lineRule="exact"/>
               <w:jc w:val="center"/>
             </w:pPr>
@@ -5071,14 +5193,15 @@
             <w:tcW w:type="dxa" w:w="2948"/>
             <w:vAlign w:val="center"/>
             <w:tcMar>
-              <w:top w:w="100" w:type="dxa"/>
-              <w:bottom w:w="100" w:type="dxa"/>
+              <w:top w:w="80" w:type="dxa"/>
+              <w:bottom w:w="80" w:type="dxa"/>
               <w:left w:w="100" w:type="dxa"/>
               <w:right w:w="100" w:type="dxa"/>
             </w:tcMar>
           </w:tcPr>
           <w:p>
             <w:pPr>
+              <w:keepNext w:val="0"/>
               <w:spacing w:after="30" w:line="280" w:lineRule="exact"/>
             </w:pPr>
             <w:r>
@@ -5097,14 +5220,15 @@
             <w:tcW w:type="dxa" w:w="2835"/>
             <w:vAlign w:val="center"/>
             <w:tcMar>
-              <w:top w:w="100" w:type="dxa"/>
-              <w:bottom w:w="100" w:type="dxa"/>
+              <w:top w:w="80" w:type="dxa"/>
+              <w:bottom w:w="80" w:type="dxa"/>
               <w:left w:w="100" w:type="dxa"/>
               <w:right w:w="100" w:type="dxa"/>
             </w:tcMar>
           </w:tcPr>
           <w:p>
             <w:pPr>
+              <w:keepNext w:val="0"/>
               <w:spacing w:after="30" w:line="280" w:lineRule="exact"/>
             </w:pPr>
             <w:r>
@@ -5123,14 +5247,15 @@
             <w:tcW w:type="dxa" w:w="2494"/>
             <w:vAlign w:val="center"/>
             <w:tcMar>
-              <w:top w:w="100" w:type="dxa"/>
-              <w:bottom w:w="100" w:type="dxa"/>
+              <w:top w:w="80" w:type="dxa"/>
+              <w:bottom w:w="80" w:type="dxa"/>
               <w:left w:w="100" w:type="dxa"/>
               <w:right w:w="100" w:type="dxa"/>
             </w:tcMar>
           </w:tcPr>
           <w:p>
             <w:pPr>
+              <w:keepNext w:val="0"/>
               <w:spacing w:after="30" w:line="280" w:lineRule="exact"/>
             </w:pPr>
             <w:r>
@@ -5154,14 +5279,15 @@
             <w:tcW w:type="dxa" w:w="1247"/>
             <w:vAlign w:val="center"/>
             <w:tcMar>
-              <w:top w:w="100" w:type="dxa"/>
-              <w:bottom w:w="100" w:type="dxa"/>
+              <w:top w:w="80" w:type="dxa"/>
+              <w:bottom w:w="80" w:type="dxa"/>
               <w:left w:w="100" w:type="dxa"/>
               <w:right w:w="100" w:type="dxa"/>
             </w:tcMar>
           </w:tcPr>
           <w:p>
             <w:pPr>
+              <w:keepNext w:val="0"/>
               <w:spacing w:after="30" w:line="280" w:lineRule="exact"/>
               <w:jc w:val="center"/>
             </w:pPr>
@@ -5181,14 +5307,15 @@
             <w:tcW w:type="dxa" w:w="2948"/>
             <w:vAlign w:val="center"/>
             <w:tcMar>
-              <w:top w:w="100" w:type="dxa"/>
-              <w:bottom w:w="100" w:type="dxa"/>
+              <w:top w:w="80" w:type="dxa"/>
+              <w:bottom w:w="80" w:type="dxa"/>
               <w:left w:w="100" w:type="dxa"/>
               <w:right w:w="100" w:type="dxa"/>
             </w:tcMar>
           </w:tcPr>
           <w:p>
             <w:pPr>
+              <w:keepNext w:val="0"/>
               <w:spacing w:after="30" w:line="280" w:lineRule="exact"/>
             </w:pPr>
             <w:r>
@@ -5207,14 +5334,15 @@
             <w:tcW w:type="dxa" w:w="2835"/>
             <w:vAlign w:val="center"/>
             <w:tcMar>
-              <w:top w:w="100" w:type="dxa"/>
-              <w:bottom w:w="100" w:type="dxa"/>
+              <w:top w:w="80" w:type="dxa"/>
+              <w:bottom w:w="80" w:type="dxa"/>
               <w:left w:w="100" w:type="dxa"/>
               <w:right w:w="100" w:type="dxa"/>
             </w:tcMar>
           </w:tcPr>
           <w:p>
             <w:pPr>
+              <w:keepNext w:val="0"/>
               <w:spacing w:after="30" w:line="280" w:lineRule="exact"/>
             </w:pPr>
             <w:r>
@@ -5233,14 +5361,15 @@
             <w:tcW w:type="dxa" w:w="2494"/>
             <w:vAlign w:val="center"/>
             <w:tcMar>
-              <w:top w:w="100" w:type="dxa"/>
-              <w:bottom w:w="100" w:type="dxa"/>
+              <w:top w:w="80" w:type="dxa"/>
+              <w:bottom w:w="80" w:type="dxa"/>
               <w:left w:w="100" w:type="dxa"/>
               <w:right w:w="100" w:type="dxa"/>
             </w:tcMar>
           </w:tcPr>
           <w:p>
             <w:pPr>
+              <w:keepNext w:val="0"/>
               <w:spacing w:after="30" w:line="280" w:lineRule="exact"/>
             </w:pPr>
             <w:r>
@@ -5264,14 +5393,15 @@
             <w:tcW w:type="dxa" w:w="1247"/>
             <w:vAlign w:val="center"/>
             <w:tcMar>
-              <w:top w:w="100" w:type="dxa"/>
-              <w:bottom w:w="100" w:type="dxa"/>
+              <w:top w:w="80" w:type="dxa"/>
+              <w:bottom w:w="80" w:type="dxa"/>
               <w:left w:w="100" w:type="dxa"/>
               <w:right w:w="100" w:type="dxa"/>
             </w:tcMar>
           </w:tcPr>
           <w:p>
             <w:pPr>
+              <w:keepNext w:val="0"/>
               <w:spacing w:after="30" w:line="280" w:lineRule="exact"/>
               <w:jc w:val="center"/>
             </w:pPr>
@@ -5291,14 +5421,15 @@
             <w:tcW w:type="dxa" w:w="2948"/>
             <w:vAlign w:val="center"/>
             <w:tcMar>
-              <w:top w:w="100" w:type="dxa"/>
-              <w:bottom w:w="100" w:type="dxa"/>
+              <w:top w:w="80" w:type="dxa"/>
+              <w:bottom w:w="80" w:type="dxa"/>
               <w:left w:w="100" w:type="dxa"/>
               <w:right w:w="100" w:type="dxa"/>
             </w:tcMar>
           </w:tcPr>
           <w:p>
             <w:pPr>
+              <w:keepNext w:val="0"/>
               <w:spacing w:after="30" w:line="280" w:lineRule="exact"/>
             </w:pPr>
             <w:r>
@@ -5317,14 +5448,15 @@
             <w:tcW w:type="dxa" w:w="2835"/>
             <w:vAlign w:val="center"/>
             <w:tcMar>
-              <w:top w:w="100" w:type="dxa"/>
-              <w:bottom w:w="100" w:type="dxa"/>
+              <w:top w:w="80" w:type="dxa"/>
+              <w:bottom w:w="80" w:type="dxa"/>
               <w:left w:w="100" w:type="dxa"/>
               <w:right w:w="100" w:type="dxa"/>
             </w:tcMar>
           </w:tcPr>
           <w:p>
             <w:pPr>
+              <w:keepNext w:val="0"/>
               <w:spacing w:after="30" w:line="280" w:lineRule="exact"/>
             </w:pPr>
             <w:r>
@@ -5343,14 +5475,15 @@
             <w:tcW w:type="dxa" w:w="2494"/>
             <w:vAlign w:val="center"/>
             <w:tcMar>
-              <w:top w:w="100" w:type="dxa"/>
-              <w:bottom w:w="100" w:type="dxa"/>
+              <w:top w:w="80" w:type="dxa"/>
+              <w:bottom w:w="80" w:type="dxa"/>
               <w:left w:w="100" w:type="dxa"/>
               <w:right w:w="100" w:type="dxa"/>
             </w:tcMar>
           </w:tcPr>
           <w:p>
             <w:pPr>
+              <w:keepNext w:val="0"/>
               <w:spacing w:after="30" w:line="280" w:lineRule="exact"/>
             </w:pPr>
             <w:r>
@@ -5374,14 +5507,15 @@
             <w:tcW w:type="dxa" w:w="1247"/>
             <w:vAlign w:val="center"/>
             <w:tcMar>
-              <w:top w:w="100" w:type="dxa"/>
-              <w:bottom w:w="100" w:type="dxa"/>
+              <w:top w:w="80" w:type="dxa"/>
+              <w:bottom w:w="80" w:type="dxa"/>
               <w:left w:w="100" w:type="dxa"/>
               <w:right w:w="100" w:type="dxa"/>
             </w:tcMar>
           </w:tcPr>
           <w:p>
             <w:pPr>
+              <w:keepNext w:val="0"/>
               <w:spacing w:after="30" w:line="280" w:lineRule="exact"/>
               <w:jc w:val="center"/>
             </w:pPr>
@@ -5401,14 +5535,15 @@
             <w:tcW w:type="dxa" w:w="2948"/>
             <w:vAlign w:val="center"/>
             <w:tcMar>
-              <w:top w:w="100" w:type="dxa"/>
-              <w:bottom w:w="100" w:type="dxa"/>
+              <w:top w:w="80" w:type="dxa"/>
+              <w:bottom w:w="80" w:type="dxa"/>
               <w:left w:w="100" w:type="dxa"/>
               <w:right w:w="100" w:type="dxa"/>
             </w:tcMar>
           </w:tcPr>
           <w:p>
             <w:pPr>
+              <w:keepNext w:val="0"/>
               <w:spacing w:after="30" w:line="280" w:lineRule="exact"/>
             </w:pPr>
             <w:r>
@@ -5427,14 +5562,15 @@
             <w:tcW w:type="dxa" w:w="2835"/>
             <w:vAlign w:val="center"/>
             <w:tcMar>
-              <w:top w:w="100" w:type="dxa"/>
-              <w:bottom w:w="100" w:type="dxa"/>
+              <w:top w:w="80" w:type="dxa"/>
+              <w:bottom w:w="80" w:type="dxa"/>
               <w:left w:w="100" w:type="dxa"/>
               <w:right w:w="100" w:type="dxa"/>
             </w:tcMar>
           </w:tcPr>
           <w:p>
             <w:pPr>
+              <w:keepNext w:val="0"/>
               <w:spacing w:after="30" w:line="280" w:lineRule="exact"/>
             </w:pPr>
             <w:r>
@@ -5453,14 +5589,15 @@
             <w:tcW w:type="dxa" w:w="2494"/>
             <w:vAlign w:val="center"/>
             <w:tcMar>
-              <w:top w:w="100" w:type="dxa"/>
-              <w:bottom w:w="100" w:type="dxa"/>
+              <w:top w:w="80" w:type="dxa"/>
+              <w:bottom w:w="80" w:type="dxa"/>
               <w:left w:w="100" w:type="dxa"/>
               <w:right w:w="100" w:type="dxa"/>
             </w:tcMar>
           </w:tcPr>
           <w:p>
             <w:pPr>
+              <w:keepNext w:val="0"/>
               <w:spacing w:after="30" w:line="280" w:lineRule="exact"/>
             </w:pPr>
             <w:r>
@@ -5484,14 +5621,15 @@
             <w:tcW w:type="dxa" w:w="1247"/>
             <w:vAlign w:val="center"/>
             <w:tcMar>
-              <w:top w:w="100" w:type="dxa"/>
-              <w:bottom w:w="100" w:type="dxa"/>
+              <w:top w:w="80" w:type="dxa"/>
+              <w:bottom w:w="80" w:type="dxa"/>
               <w:left w:w="100" w:type="dxa"/>
               <w:right w:w="100" w:type="dxa"/>
             </w:tcMar>
           </w:tcPr>
           <w:p>
             <w:pPr>
+              <w:keepNext w:val="0"/>
               <w:spacing w:after="30" w:line="280" w:lineRule="exact"/>
               <w:jc w:val="center"/>
             </w:pPr>
@@ -5511,14 +5649,15 @@
             <w:tcW w:type="dxa" w:w="2948"/>
             <w:vAlign w:val="center"/>
             <w:tcMar>
-              <w:top w:w="100" w:type="dxa"/>
-              <w:bottom w:w="100" w:type="dxa"/>
+              <w:top w:w="80" w:type="dxa"/>
+              <w:bottom w:w="80" w:type="dxa"/>
               <w:left w:w="100" w:type="dxa"/>
               <w:right w:w="100" w:type="dxa"/>
             </w:tcMar>
           </w:tcPr>
           <w:p>
             <w:pPr>
+              <w:keepNext w:val="0"/>
               <w:spacing w:after="30" w:line="280" w:lineRule="exact"/>
             </w:pPr>
             <w:r>
@@ -5537,14 +5676,15 @@
             <w:tcW w:type="dxa" w:w="2835"/>
             <w:vAlign w:val="center"/>
             <w:tcMar>
-              <w:top w:w="100" w:type="dxa"/>
-              <w:bottom w:w="100" w:type="dxa"/>
+              <w:top w:w="80" w:type="dxa"/>
+              <w:bottom w:w="80" w:type="dxa"/>
               <w:left w:w="100" w:type="dxa"/>
               <w:right w:w="100" w:type="dxa"/>
             </w:tcMar>
           </w:tcPr>
           <w:p>
             <w:pPr>
+              <w:keepNext w:val="0"/>
               <w:spacing w:after="30" w:line="280" w:lineRule="exact"/>
             </w:pPr>
             <w:r>
@@ -5563,14 +5703,15 @@
             <w:tcW w:type="dxa" w:w="2494"/>
             <w:vAlign w:val="center"/>
             <w:tcMar>
-              <w:top w:w="100" w:type="dxa"/>
-              <w:bottom w:w="100" w:type="dxa"/>
+              <w:top w:w="80" w:type="dxa"/>
+              <w:bottom w:w="80" w:type="dxa"/>
               <w:left w:w="100" w:type="dxa"/>
               <w:right w:w="100" w:type="dxa"/>
             </w:tcMar>
           </w:tcPr>
           <w:p>
             <w:pPr>
+              <w:keepNext w:val="0"/>
               <w:spacing w:after="30" w:line="280" w:lineRule="exact"/>
             </w:pPr>
             <w:r>
@@ -5594,14 +5735,15 @@
             <w:tcW w:type="dxa" w:w="1247"/>
             <w:vAlign w:val="center"/>
             <w:tcMar>
-              <w:top w:w="100" w:type="dxa"/>
-              <w:bottom w:w="100" w:type="dxa"/>
+              <w:top w:w="80" w:type="dxa"/>
+              <w:bottom w:w="80" w:type="dxa"/>
               <w:left w:w="100" w:type="dxa"/>
               <w:right w:w="100" w:type="dxa"/>
             </w:tcMar>
           </w:tcPr>
           <w:p>
             <w:pPr>
+              <w:keepNext w:val="0"/>
               <w:spacing w:after="30" w:line="280" w:lineRule="exact"/>
               <w:jc w:val="center"/>
             </w:pPr>
@@ -5621,14 +5763,15 @@
             <w:tcW w:type="dxa" w:w="2948"/>
             <w:vAlign w:val="center"/>
             <w:tcMar>
-              <w:top w:w="100" w:type="dxa"/>
-              <w:bottom w:w="100" w:type="dxa"/>
+              <w:top w:w="80" w:type="dxa"/>
+              <w:bottom w:w="80" w:type="dxa"/>
               <w:left w:w="100" w:type="dxa"/>
               <w:right w:w="100" w:type="dxa"/>
             </w:tcMar>
           </w:tcPr>
           <w:p>
             <w:pPr>
+              <w:keepNext w:val="0"/>
               <w:spacing w:after="30" w:line="280" w:lineRule="exact"/>
             </w:pPr>
             <w:r>
@@ -5647,14 +5790,15 @@
             <w:tcW w:type="dxa" w:w="2835"/>
             <w:vAlign w:val="center"/>
             <w:tcMar>
-              <w:top w:w="100" w:type="dxa"/>
-              <w:bottom w:w="100" w:type="dxa"/>
+              <w:top w:w="80" w:type="dxa"/>
+              <w:bottom w:w="80" w:type="dxa"/>
               <w:left w:w="100" w:type="dxa"/>
               <w:right w:w="100" w:type="dxa"/>
             </w:tcMar>
           </w:tcPr>
           <w:p>
             <w:pPr>
+              <w:keepNext w:val="0"/>
               <w:spacing w:after="30" w:line="280" w:lineRule="exact"/>
             </w:pPr>
             <w:r>
@@ -5673,14 +5817,15 @@
             <w:tcW w:type="dxa" w:w="2494"/>
             <w:vAlign w:val="center"/>
             <w:tcMar>
-              <w:top w:w="100" w:type="dxa"/>
-              <w:bottom w:w="100" w:type="dxa"/>
+              <w:top w:w="80" w:type="dxa"/>
+              <w:bottom w:w="80" w:type="dxa"/>
               <w:left w:w="100" w:type="dxa"/>
               <w:right w:w="100" w:type="dxa"/>
             </w:tcMar>
           </w:tcPr>
           <w:p>
             <w:pPr>
+              <w:keepNext w:val="0"/>
               <w:spacing w:after="30" w:line="280" w:lineRule="exact"/>
             </w:pPr>
             <w:r>
@@ -5704,14 +5849,15 @@
             <w:tcW w:type="dxa" w:w="1247"/>
             <w:vAlign w:val="center"/>
             <w:tcMar>
-              <w:top w:w="100" w:type="dxa"/>
-              <w:bottom w:w="100" w:type="dxa"/>
+              <w:top w:w="80" w:type="dxa"/>
+              <w:bottom w:w="80" w:type="dxa"/>
               <w:left w:w="100" w:type="dxa"/>
               <w:right w:w="100" w:type="dxa"/>
             </w:tcMar>
           </w:tcPr>
           <w:p>
             <w:pPr>
+              <w:keepNext w:val="0"/>
               <w:spacing w:after="30" w:line="280" w:lineRule="exact"/>
               <w:jc w:val="center"/>
             </w:pPr>
@@ -5731,14 +5877,15 @@
             <w:tcW w:type="dxa" w:w="2948"/>
             <w:vAlign w:val="center"/>
             <w:tcMar>
-              <w:top w:w="100" w:type="dxa"/>
-              <w:bottom w:w="100" w:type="dxa"/>
+              <w:top w:w="80" w:type="dxa"/>
+              <w:bottom w:w="80" w:type="dxa"/>
               <w:left w:w="100" w:type="dxa"/>
               <w:right w:w="100" w:type="dxa"/>
             </w:tcMar>
           </w:tcPr>
           <w:p>
             <w:pPr>
+              <w:keepNext w:val="0"/>
               <w:spacing w:after="30" w:line="280" w:lineRule="exact"/>
             </w:pPr>
             <w:r>
@@ -5757,14 +5904,15 @@
             <w:tcW w:type="dxa" w:w="2835"/>
             <w:vAlign w:val="center"/>
             <w:tcMar>
-              <w:top w:w="100" w:type="dxa"/>
-              <w:bottom w:w="100" w:type="dxa"/>
+              <w:top w:w="80" w:type="dxa"/>
+              <w:bottom w:w="80" w:type="dxa"/>
               <w:left w:w="100" w:type="dxa"/>
               <w:right w:w="100" w:type="dxa"/>
             </w:tcMar>
           </w:tcPr>
           <w:p>
             <w:pPr>
+              <w:keepNext w:val="0"/>
               <w:spacing w:after="30" w:line="280" w:lineRule="exact"/>
             </w:pPr>
             <w:r>
@@ -5783,14 +5931,15 @@
             <w:tcW w:type="dxa" w:w="2494"/>
             <w:vAlign w:val="center"/>
             <w:tcMar>
-              <w:top w:w="100" w:type="dxa"/>
-              <w:bottom w:w="100" w:type="dxa"/>
+              <w:top w:w="80" w:type="dxa"/>
+              <w:bottom w:w="80" w:type="dxa"/>
               <w:left w:w="100" w:type="dxa"/>
               <w:right w:w="100" w:type="dxa"/>
             </w:tcMar>
           </w:tcPr>
           <w:p>
             <w:pPr>
+              <w:keepNext w:val="0"/>
               <w:spacing w:after="30" w:line="280" w:lineRule="exact"/>
             </w:pPr>
             <w:r>
@@ -5808,12 +5957,7 @@
     </w:tbl>
     <w:p>
       <w:pPr>
-        <w:spacing w:after="20" w:line="120" w:lineRule="auto"/>
-      </w:pPr>
-    </w:p>
-    <w:p>
-      <w:pPr>
-        <w:spacing w:after="140" w:line="360" w:lineRule="exact"/>
+        <w:spacing w:after="100" w:line="360" w:lineRule="exact"/>
       </w:pPr>
       <w:r>
         <w:rPr>
@@ -5822,7 +5966,7 @@
           <w:color w:val="000000"/>
           <w:sz w:val="23"/>
         </w:rPr>
-        <w:t>八点共8/8，最大抬升96.78至105.94 mm；红块抬高时，双指连续接触维持68至73帧。用户随后追加(+10,0) mm位置，同一模型与模式单次成功1/1，单独记账，不并入事先冻结的八点评估。</w:t>
+        <w:t>八点都完成了入盒，最大抬升96.78至105.94 mm，抬高时双指连续接触维持68至73帧。之后又临时追加(+10,0) mm位置，用同一模型与模式单次测试，结果为1/1。这个点是在看过八点结果后追加的，因此另外记录。</w:t>
       </w:r>
     </w:p>
     <w:p>
@@ -5841,7 +5985,7 @@
     </w:p>
     <w:p>
       <w:pPr>
-        <w:spacing w:after="140" w:line="360" w:lineRule="exact"/>
+        <w:spacing w:after="100" w:line="360" w:lineRule="exact"/>
       </w:pPr>
       <w:r>
         <w:rPr>
@@ -5850,12 +5994,12 @@
           <w:color w:val="000000"/>
           <w:sz w:val="23"/>
         </w:rPr>
-        <w:t>完整成功要求红块抬升至少30 mm，八个角点XY投影均进入盒内，最终落稳盒底、速度小于0.05 m/s，且末态没有手指接触。我们另外检查抬高时双指持续接触至少3帧，避免用擦碰或推移解释“抓起”。</w:t>
+        <w:t>我们按几条具体条件判断抓放：红块抬升至少30 mm，八个角点的XY投影都进入盒内，最后落稳盒底、速度小于0.05 m/s，且手指已经离开。抬高时还要有至少3帧双指持续接触，确认它确实被夹起，而不是碰巧推了进去。</w:t>
       </w:r>
     </w:p>
     <w:p>
       <w:pPr>
-        <w:spacing w:after="140" w:line="360" w:lineRule="exact"/>
+        <w:spacing w:after="100" w:line="360" w:lineRule="exact"/>
       </w:pPr>
       <w:r>
         <w:rPr>
@@ -5864,7 +6008,7 @@
           <w:color w:val="000000"/>
           <w:sz w:val="23"/>
         </w:rPr>
-        <w:t>保存观察后重新调用冻结ACT，八点共3600个动作块、252万个动作值逐值一致；追加点也另行复算。初态相同而红块位置不同，首份预测不同。这些记录支持动作确由ACT根据观察生成，而不是直接重放一份固定教师动作。</w:t>
+        <w:t>还有一个需要回答的问题：它是否只是重放了教师轨迹？我们用保存的观察重新调用冻结ACT，八点共3600个动作块、252万个动作值与原记录逐值一致，追加点也另行复算。相同初态下改变红块位置，首份预测随之变化。连同接触与运动记录，这些检查把“动作由ACT预测”和“物体实际被抓放”两件事都对上了。</w:t>
       </w:r>
     </w:p>
     <w:p>
@@ -5883,7 +6027,7 @@
     </w:p>
     <w:p>
       <w:pPr>
-        <w:spacing w:after="140" w:line="360" w:lineRule="exact"/>
+        <w:spacing w:after="100" w:line="360" w:lineRule="exact"/>
       </w:pPr>
       <w:r>
         <w:rPr>
@@ -5892,12 +6036,12 @@
           <w:color w:val="000000"/>
           <w:sz w:val="23"/>
         </w:rPr>
-        <w:t>目前可以支持的结论是：该模型在这套仿真中，对训练网格范围内若干新XY位置具有局部适应能力。测试没有覆盖新物体、不同高度、相机移动、光照变化或真实接触；8/8也不是大规模成功率估计。原始50条真实演示是否曾覆盖相近位置，现有公开资料不能确认。</w:t>
+        <w:t>这次走到的是固定仿真场景内的局部XY位置适应：八点都在训练网格范围内，每点只试一次。换物体、变高度、移动相机、改变光照，以及真实接触都还没测；原始50条真实演示是否覆盖过附近位置也未知。因此8/8是这八次测试的结果，不是任意场景的成功率。</w:t>
       </w:r>
     </w:p>
     <w:p>
       <w:pPr>
-        <w:spacing w:after="140" w:line="360" w:lineRule="exact"/>
+        <w:spacing w:after="100" w:line="360" w:lineRule="exact"/>
       </w:pPr>
       <w:r>
         <w:rPr>
@@ -5906,13 +6050,12 @@
           <w:color w:val="000000"/>
           <w:sz w:val="23"/>
         </w:rPr>
-        <w:t>30 Hz指仿真控制时间，推理时仿真可以等待电脑，不能据此宣称笔记本已经达到每秒30次实时闭环。真实端的延迟与控制频率需要另测。</w:t>
+        <w:t>还有速度上的区别：30 Hz是仿真控制时间，推理时仿真可以等电脑。笔记本能否跟上真实机械臂，还要把采图、传输、推理和控制的墙钟延迟一起测出来。</w:t>
       </w:r>
     </w:p>
     <w:p>
       <w:pPr>
         <w:pStyle w:val="Heading1"/>
-        <w:pageBreakBefore/>
       </w:pPr>
       <w:r>
         <w:rPr>
@@ -5926,7 +6069,7 @@
     </w:p>
     <w:p>
       <w:pPr>
-        <w:spacing w:after="140" w:line="360" w:lineRule="exact"/>
+        <w:spacing w:after="100" w:line="360" w:lineRule="exact"/>
       </w:pPr>
       <w:r>
         <w:rPr>
@@ -5935,7 +6078,7 @@
           <w:color w:val="000000"/>
           <w:sz w:val="23"/>
         </w:rPr>
-        <w:t xml:space="preserve">先进入仓库的 </w:t>
+        <w:t xml:space="preserve">想沿这条路线复现，先进入仓库的 </w:t>
       </w:r>
       <w:r>
         <w:rPr>
@@ -5953,12 +6096,12 @@
           <w:color w:val="000000"/>
           <w:sz w:val="23"/>
         </w:rPr>
-        <w:t xml:space="preserve"> 目录。ACT环境与MuJoCo环境分开：前者采用Python3.12、Torch2.10.0+cu130、LeRobot0.6.1；后者使用MuJoCo3.17.0。锁定依赖和官方资产清单保存在各自目录，避免把另一套任务的版本混装进来。</w:t>
+        <w:t xml:space="preserve"> 目录。ACT环境使用Python3.12、Torch2.10.0+cu130、LeRobot0.6.1，MuJoCo环境使用3.17.0；各自目录保留了锁定依赖和官方资产清单。</w:t>
       </w:r>
     </w:p>
     <w:p>
       <w:pPr>
-        <w:spacing w:after="140" w:line="360" w:lineRule="exact"/>
+        <w:spacing w:after="100" w:line="360" w:lineRule="exact"/>
       </w:pPr>
       <w:r>
         <w:rPr>
@@ -5967,12 +6110,12 @@
           <w:color w:val="000000"/>
           <w:sz w:val="23"/>
         </w:rPr>
-        <w:t>重新训练本案例前，需要sim300六文件初始化，以及25训练＋4验证回合的轨迹、manifest和58个RGB数组。仅RGB约20.06 GiB，用memmap按需读入；这些缓存与206.7 MB权重没有装进普通Git源码。不要拿已经选定的step3000继续训练，再称为复现了同一条5000步实验。</w:t>
+        <w:t>先备齐sim300六文件初始化、25训练＋4验证回合的轨迹、manifest和58个RGB数组。仅RGB约20.06 GiB，用memmap按需读取；缓存和206.7 MB权重都在源码之外。重现这条5000步实验，应从sim300开始。</w:t>
       </w:r>
     </w:p>
     <w:p>
       <w:pPr>
-        <w:spacing w:after="140" w:line="360" w:lineRule="exact"/>
+        <w:spacing w:after="100" w:line="360" w:lineRule="exact"/>
       </w:pPr>
       <w:r>
         <w:rPr>
@@ -5981,7 +6124,7 @@
           <w:color w:val="000000"/>
           <w:sz w:val="23"/>
         </w:rPr>
-        <w:t>材料生成路线是：公开源数据→403帧物理教师→单点sim300适配；教师另扩为25位置→按动作前状态导出双RGB→多位置训练。公开权重重新起步可以作为新实验，但若未恢复历史真实续训1000步的初始化，就不保证得到本案例同一结果。详细命令见仓库“训练复现步骤”。</w:t>
+        <w:t>材料路线是：公开源数据→403帧物理教师→单点sim300适配；教师另扩为25位置→按动作前状态导出双RGB→多位置训练。历史sim300接续了真实续训1000步的权重，复现时要保留这一起点；直接从公开权重开始则另记为新实验。详细命令见仓库“训练复现步骤”。</w:t>
       </w:r>
     </w:p>
     <w:p>
@@ -5995,12 +6138,12 @@
           <w:color w:val="000000"/>
           <w:sz w:val="25"/>
         </w:rPr>
-        <w:t>先检查数据 再训练</w:t>
+        <w:t>先检查数据再开始训练</w:t>
       </w:r>
     </w:p>
     <w:p>
       <w:pPr>
-        <w:spacing w:after="140" w:line="360" w:lineRule="exact"/>
+        <w:spacing w:after="100" w:line="360" w:lineRule="exact"/>
       </w:pPr>
       <w:r>
         <w:rPr>
@@ -6009,7 +6152,7 @@
           <w:color w:val="000000"/>
           <w:sz w:val="23"/>
         </w:rPr>
-        <w:t>先按仓库复现指南准备两个变量：$Manifest指向25训练与4验证回合的manifest；$SourceModel指向完整sim300初始化目录。它们必须指向实际文件，不能拿最终step3000替代历史sim300。</w:t>
+        <w:t>按仓库复现指南设置两个变量：$Manifest指向25训练与4验证回合的manifest，$SourceModel指向完整sim300初始化目录。确认路径对应后，先运行数据检查：</w:t>
       </w:r>
     </w:p>
     <w:p>
@@ -6030,7 +6173,7 @@
     </w:p>
     <w:p>
       <w:pPr>
-        <w:spacing w:after="140" w:line="360" w:lineRule="exact"/>
+        <w:spacing w:after="100" w:line="360" w:lineRule="exact"/>
       </w:pPr>
       <w:r>
         <w:rPr>
@@ -6068,7 +6211,7 @@
     </w:p>
     <w:p>
       <w:pPr>
-        <w:spacing w:after="140" w:line="360" w:lineRule="exact"/>
+        <w:spacing w:after="100" w:line="360" w:lineRule="exact"/>
       </w:pPr>
       <w:r>
         <w:rPr>
@@ -6077,12 +6220,12 @@
           <w:color w:val="000000"/>
           <w:sz w:val="23"/>
         </w:rPr>
-        <w:t>日志看training_metrics.csv，模型看checkpoints/step_001000至step_005000/pretrained_model。prior-adaptation-steps只是累计来源记录，不恢复AdamW；这些模型保存点也不包含可无缝续训的完整优化器与随机状态。</w:t>
+        <w:t>训练后看training_metrics.csv，模型保存在checkpoints/step_001000至step_005000/pretrained_model。prior-adaptation-steps只记录来源累计步数；这里保存的是权重和处理器，没有完整优化器及随机状态，后续加载会重新建立AdamW。</w:t>
       </w:r>
     </w:p>
     <w:p>
       <w:pPr>
-        <w:spacing w:after="140" w:line="360" w:lineRule="exact"/>
+        <w:spacing w:after="100" w:line="360" w:lineRule="exact"/>
       </w:pPr>
       <w:r>
         <w:rPr>
@@ -6091,13 +6234,12 @@
           <w:color w:val="000000"/>
           <w:sz w:val="23"/>
         </w:rPr>
-        <w:t>长训完成后，逐候选运行原位与4个验证位置，按第6节规则选“模型＋模式”，冻结后才测试新的位置。不要把最低训练loss当成跳过闭环验证的理由。</w:t>
+        <w:t>接下来逐候选运行原位与4个验证位置，按第6节规则选“模型＋模式”，选定以后再试新的位置。这样才能知道自己复现的是动作拟合，还是完整的抓放。</w:t>
       </w:r>
     </w:p>
     <w:p>
       <w:pPr>
         <w:pStyle w:val="Heading1"/>
-        <w:pageBreakBefore/>
       </w:pPr>
       <w:r>
         <w:rPr>
@@ -6111,7 +6253,7 @@
     </w:p>
     <w:p>
       <w:pPr>
-        <w:spacing w:after="140" w:line="360" w:lineRule="exact"/>
+        <w:spacing w:after="100" w:line="360" w:lineRule="exact"/>
       </w:pPr>
       <w:r>
         <w:rPr>
@@ -6120,26 +6262,12 @@
           <w:color w:val="000000"/>
           <w:sz w:val="23"/>
         </w:rPr>
-        <w:t>这次结果的价值，在于把“能播放一段成功动画”推进成了“有训练来源、完整物理评分和留出位置结果的ACT闭环”。下一步的主要矛盾已经从单点抓不起来，转为如何保持这种能力，并判断它在新观察条件下还能成立多少。</w:t>
+        <w:t>现在我们已经越过了“原位抓不起来”这道坎，但还需要知道这份能力能保持多久、换些条件以后还能留下多少。下一轮先保住能工作的版本，再有顺序地扩大变化，比立刻把所有东西都改掉更容易找到问题。</w:t>
       </w:r>
     </w:p>
     <w:p>
       <w:pPr>
-        <w:pStyle w:val="Heading2"/>
-      </w:pPr>
-      <w:r>
-        <w:rPr>
-          <w:rFonts w:ascii="Arial" w:hAnsi="Arial" w:eastAsia="Microsoft YaHei"/>
-          <w:b/>
-          <w:color w:val="000000"/>
-          <w:sz w:val="25"/>
-        </w:rPr>
-        <w:t>先锁定能工作的版本</w:t>
-      </w:r>
-    </w:p>
-    <w:p>
-      <w:pPr>
-        <w:spacing w:after="140" w:line="360" w:lineRule="exact"/>
+        <w:spacing w:after="100" w:line="360" w:lineRule="exact"/>
       </w:pPr>
       <w:r>
         <w:rPr>
@@ -6148,26 +6276,12 @@
           <w:color w:val="000000"/>
           <w:sz w:val="23"/>
         </w:rPr>
-        <w:t>保留step3000、完整六文件处理器、时间融合系数、双相机命名、场景尺寸和测试位置。所有后续改动从这份基线比较，继续把原位与四位置验证放在前面。否则，相机、数据、权重和执行方式同时变化，出了问题就难以判断来源。</w:t>
+        <w:t>先保留step3000、完整六文件处理器、时间融合系数、双相机命名和当前场景，后续改动都与它比较。继续检查原位与四位置验证，也在新的测试位置上观察初态偏差带来的影响。失败要具体记到阶段：接近没对准、闭爪没夹住、抬升脱落，还是放置碰盒；知道失在哪一步，才知道该补什么示范。</w:t>
       </w:r>
     </w:p>
     <w:p>
       <w:pPr>
-        <w:pStyle w:val="Heading2"/>
-      </w:pPr>
-      <w:r>
-        <w:rPr>
-          <w:rFonts w:ascii="Arial" w:hAnsi="Arial" w:eastAsia="Microsoft YaHei"/>
-          <w:b/>
-          <w:color w:val="000000"/>
-          <w:sz w:val="25"/>
-        </w:rPr>
-        <w:t>再扩展最有价值的变化</w:t>
-      </w:r>
-    </w:p>
-    <w:p>
-      <w:pPr>
-        <w:spacing w:after="140" w:line="360" w:lineRule="exact"/>
+        <w:spacing w:after="100" w:line="360" w:lineRule="exact"/>
       </w:pPr>
       <w:r>
         <w:rPr>
@@ -6176,12 +6290,12 @@
           <w:color w:val="000000"/>
           <w:sz w:val="23"/>
         </w:rPr>
-        <w:t>后续仿真可优先增加未见位置与初态偏差，并记录分阶段失败：接近是否对准、闭爪是否形成双指接触、抬升是否脱落、放置是否碰盒。先根据失败类型补示范，再决定要不要延长训练，避免只看到loss下降就不断加步数。</w:t>
+        <w:t>接着再逐步加入相机高度、视角、背景和光照变化，每轮留出相应的验证条件。往真机走时，还要固定真实相机，完成标定与动作映射核对，并采集本机示范适配。仿真里哪怕画面看起来相似，这些准备也需要重新落实。</w:t>
       </w:r>
     </w:p>
     <w:p>
       <w:pPr>
-        <w:spacing w:after="140" w:line="360" w:lineRule="exact"/>
+        <w:spacing w:after="100" w:line="360" w:lineRule="exact"/>
       </w:pPr>
       <w:r>
         <w:rPr>
@@ -6190,21 +6304,7 @@
           <w:color w:val="000000"/>
           <w:sz w:val="23"/>
         </w:rPr>
-        <w:t>相机高度、视角、背景和光照的变化也应逐步加入训练与留出验证。它们是下一轮要验证的因素；本阶段没有完成这些实验，不能把位置8/8当作视觉域变化也已通过。若进入真实环境，应以固定好的真实相机采集本机示范适配，仿真相机拟合不等于实机标定。</w:t>
-      </w:r>
-    </w:p>
-    <w:p>
-      <w:pPr>
-        <w:pStyle w:val="Heading2"/>
-      </w:pPr>
-      <w:r>
-        <w:rPr>
-          <w:rFonts w:ascii="Arial" w:hAnsi="Arial" w:eastAsia="Microsoft YaHei"/>
-          <w:b/>
-          <w:color w:val="000000"/>
-          <w:sz w:val="25"/>
-        </w:rPr>
-        <w:t>每一轮保留一个能回答的问题</w:t>
+        <w:t>下面这张表，是这次排错以后我们会继续沿用的顺序：</w:t>
       </w:r>
     </w:p>
     <w:tbl>
@@ -6236,8 +6336,8 @@
             <w:tcW w:type="dxa" w:w="1814"/>
             <w:vAlign w:val="center"/>
             <w:tcMar>
-              <w:top w:w="100" w:type="dxa"/>
-              <w:bottom w:w="100" w:type="dxa"/>
+              <w:top w:w="80" w:type="dxa"/>
+              <w:bottom w:w="80" w:type="dxa"/>
               <w:left w:w="100" w:type="dxa"/>
               <w:right w:w="100" w:type="dxa"/>
             </w:tcMar>
@@ -6245,6 +6345,7 @@
           </w:tcPr>
           <w:p>
             <w:pPr>
+              <w:keepNext/>
               <w:spacing w:after="30" w:line="280" w:lineRule="exact"/>
             </w:pPr>
             <w:r>
@@ -6263,8 +6364,8 @@
             <w:tcW w:type="dxa" w:w="2835"/>
             <w:vAlign w:val="center"/>
             <w:tcMar>
-              <w:top w:w="100" w:type="dxa"/>
-              <w:bottom w:w="100" w:type="dxa"/>
+              <w:top w:w="80" w:type="dxa"/>
+              <w:bottom w:w="80" w:type="dxa"/>
               <w:left w:w="100" w:type="dxa"/>
               <w:right w:w="100" w:type="dxa"/>
             </w:tcMar>
@@ -6272,6 +6373,7 @@
           </w:tcPr>
           <w:p>
             <w:pPr>
+              <w:keepNext/>
               <w:spacing w:after="30" w:line="280" w:lineRule="exact"/>
             </w:pPr>
             <w:r>
@@ -6290,8 +6392,8 @@
             <w:tcW w:type="dxa" w:w="4876"/>
             <w:vAlign w:val="center"/>
             <w:tcMar>
-              <w:top w:w="100" w:type="dxa"/>
-              <w:bottom w:w="100" w:type="dxa"/>
+              <w:top w:w="80" w:type="dxa"/>
+              <w:bottom w:w="80" w:type="dxa"/>
               <w:left w:w="100" w:type="dxa"/>
               <w:right w:w="100" w:type="dxa"/>
             </w:tcMar>
@@ -6299,6 +6401,7 @@
           </w:tcPr>
           <w:p>
             <w:pPr>
+              <w:keepNext/>
               <w:spacing w:after="30" w:line="280" w:lineRule="exact"/>
             </w:pPr>
             <w:r>
@@ -6322,14 +6425,15 @@
             <w:tcW w:type="dxa" w:w="1814"/>
             <w:vAlign w:val="center"/>
             <w:tcMar>
-              <w:top w:w="100" w:type="dxa"/>
-              <w:bottom w:w="100" w:type="dxa"/>
+              <w:top w:w="80" w:type="dxa"/>
+              <w:bottom w:w="80" w:type="dxa"/>
               <w:left w:w="100" w:type="dxa"/>
               <w:right w:w="100" w:type="dxa"/>
             </w:tcMar>
           </w:tcPr>
           <w:p>
             <w:pPr>
+              <w:keepNext w:val="0"/>
               <w:spacing w:after="30" w:line="280" w:lineRule="exact"/>
             </w:pPr>
             <w:r>
@@ -6348,14 +6452,15 @@
             <w:tcW w:type="dxa" w:w="2835"/>
             <w:vAlign w:val="center"/>
             <w:tcMar>
-              <w:top w:w="100" w:type="dxa"/>
-              <w:bottom w:w="100" w:type="dxa"/>
+              <w:top w:w="80" w:type="dxa"/>
+              <w:bottom w:w="80" w:type="dxa"/>
               <w:left w:w="100" w:type="dxa"/>
               <w:right w:w="100" w:type="dxa"/>
             </w:tcMar>
           </w:tcPr>
           <w:p>
             <w:pPr>
+              <w:keepNext w:val="0"/>
               <w:spacing w:after="30" w:line="280" w:lineRule="exact"/>
             </w:pPr>
             <w:r>
@@ -6374,14 +6479,15 @@
             <w:tcW w:type="dxa" w:w="4876"/>
             <w:vAlign w:val="center"/>
             <w:tcMar>
-              <w:top w:w="100" w:type="dxa"/>
-              <w:bottom w:w="100" w:type="dxa"/>
+              <w:top w:w="80" w:type="dxa"/>
+              <w:bottom w:w="80" w:type="dxa"/>
               <w:left w:w="100" w:type="dxa"/>
               <w:right w:w="100" w:type="dxa"/>
             </w:tcMar>
           </w:tcPr>
           <w:p>
             <w:pPr>
+              <w:keepNext w:val="0"/>
               <w:spacing w:after="30" w:line="280" w:lineRule="exact"/>
             </w:pPr>
             <w:r>
@@ -6405,14 +6511,15 @@
             <w:tcW w:type="dxa" w:w="1814"/>
             <w:vAlign w:val="center"/>
             <w:tcMar>
-              <w:top w:w="100" w:type="dxa"/>
-              <w:bottom w:w="100" w:type="dxa"/>
+              <w:top w:w="80" w:type="dxa"/>
+              <w:bottom w:w="80" w:type="dxa"/>
               <w:left w:w="100" w:type="dxa"/>
               <w:right w:w="100" w:type="dxa"/>
             </w:tcMar>
           </w:tcPr>
           <w:p>
             <w:pPr>
+              <w:keepNext w:val="0"/>
               <w:spacing w:after="30" w:line="280" w:lineRule="exact"/>
             </w:pPr>
             <w:r>
@@ -6431,14 +6538,15 @@
             <w:tcW w:type="dxa" w:w="2835"/>
             <w:vAlign w:val="center"/>
             <w:tcMar>
-              <w:top w:w="100" w:type="dxa"/>
-              <w:bottom w:w="100" w:type="dxa"/>
+              <w:top w:w="80" w:type="dxa"/>
+              <w:bottom w:w="80" w:type="dxa"/>
               <w:left w:w="100" w:type="dxa"/>
               <w:right w:w="100" w:type="dxa"/>
             </w:tcMar>
           </w:tcPr>
           <w:p>
             <w:pPr>
+              <w:keepNext w:val="0"/>
               <w:spacing w:after="30" w:line="280" w:lineRule="exact"/>
             </w:pPr>
             <w:r>
@@ -6457,14 +6565,15 @@
             <w:tcW w:type="dxa" w:w="4876"/>
             <w:vAlign w:val="center"/>
             <w:tcMar>
-              <w:top w:w="100" w:type="dxa"/>
-              <w:bottom w:w="100" w:type="dxa"/>
+              <w:top w:w="80" w:type="dxa"/>
+              <w:bottom w:w="80" w:type="dxa"/>
               <w:left w:w="100" w:type="dxa"/>
               <w:right w:w="100" w:type="dxa"/>
             </w:tcMar>
           </w:tcPr>
           <w:p>
             <w:pPr>
+              <w:keepNext w:val="0"/>
               <w:spacing w:after="30" w:line="280" w:lineRule="exact"/>
             </w:pPr>
             <w:r>
@@ -6488,14 +6597,15 @@
             <w:tcW w:type="dxa" w:w="1814"/>
             <w:vAlign w:val="center"/>
             <w:tcMar>
-              <w:top w:w="100" w:type="dxa"/>
-              <w:bottom w:w="100" w:type="dxa"/>
+              <w:top w:w="80" w:type="dxa"/>
+              <w:bottom w:w="80" w:type="dxa"/>
               <w:left w:w="100" w:type="dxa"/>
               <w:right w:w="100" w:type="dxa"/>
             </w:tcMar>
           </w:tcPr>
           <w:p>
             <w:pPr>
+              <w:keepNext w:val="0"/>
               <w:spacing w:after="30" w:line="280" w:lineRule="exact"/>
             </w:pPr>
             <w:r>
@@ -6514,14 +6624,15 @@
             <w:tcW w:type="dxa" w:w="2835"/>
             <w:vAlign w:val="center"/>
             <w:tcMar>
-              <w:top w:w="100" w:type="dxa"/>
-              <w:bottom w:w="100" w:type="dxa"/>
+              <w:top w:w="80" w:type="dxa"/>
+              <w:bottom w:w="80" w:type="dxa"/>
               <w:left w:w="100" w:type="dxa"/>
               <w:right w:w="100" w:type="dxa"/>
             </w:tcMar>
           </w:tcPr>
           <w:p>
             <w:pPr>
+              <w:keepNext w:val="0"/>
               <w:spacing w:after="30" w:line="280" w:lineRule="exact"/>
             </w:pPr>
             <w:r>
@@ -6540,14 +6651,15 @@
             <w:tcW w:type="dxa" w:w="4876"/>
             <w:vAlign w:val="center"/>
             <w:tcMar>
-              <w:top w:w="100" w:type="dxa"/>
-              <w:bottom w:w="100" w:type="dxa"/>
+              <w:top w:w="80" w:type="dxa"/>
+              <w:bottom w:w="80" w:type="dxa"/>
               <w:left w:w="100" w:type="dxa"/>
               <w:right w:w="100" w:type="dxa"/>
             </w:tcMar>
           </w:tcPr>
           <w:p>
             <w:pPr>
+              <w:keepNext w:val="0"/>
               <w:spacing w:after="30" w:line="280" w:lineRule="exact"/>
             </w:pPr>
             <w:r>
@@ -6571,14 +6683,15 @@
             <w:tcW w:type="dxa" w:w="1814"/>
             <w:vAlign w:val="center"/>
             <w:tcMar>
-              <w:top w:w="100" w:type="dxa"/>
-              <w:bottom w:w="100" w:type="dxa"/>
+              <w:top w:w="80" w:type="dxa"/>
+              <w:bottom w:w="80" w:type="dxa"/>
               <w:left w:w="100" w:type="dxa"/>
               <w:right w:w="100" w:type="dxa"/>
             </w:tcMar>
           </w:tcPr>
           <w:p>
             <w:pPr>
+              <w:keepNext w:val="0"/>
               <w:spacing w:after="30" w:line="280" w:lineRule="exact"/>
             </w:pPr>
             <w:r>
@@ -6597,14 +6710,15 @@
             <w:tcW w:type="dxa" w:w="2835"/>
             <w:vAlign w:val="center"/>
             <w:tcMar>
-              <w:top w:w="100" w:type="dxa"/>
-              <w:bottom w:w="100" w:type="dxa"/>
+              <w:top w:w="80" w:type="dxa"/>
+              <w:bottom w:w="80" w:type="dxa"/>
               <w:left w:w="100" w:type="dxa"/>
               <w:right w:w="100" w:type="dxa"/>
             </w:tcMar>
           </w:tcPr>
           <w:p>
             <w:pPr>
+              <w:keepNext w:val="0"/>
               <w:spacing w:after="30" w:line="280" w:lineRule="exact"/>
             </w:pPr>
             <w:r>
@@ -6623,14 +6737,15 @@
             <w:tcW w:type="dxa" w:w="4876"/>
             <w:vAlign w:val="center"/>
             <w:tcMar>
-              <w:top w:w="100" w:type="dxa"/>
-              <w:bottom w:w="100" w:type="dxa"/>
+              <w:top w:w="80" w:type="dxa"/>
+              <w:bottom w:w="80" w:type="dxa"/>
               <w:left w:w="100" w:type="dxa"/>
               <w:right w:w="100" w:type="dxa"/>
             </w:tcMar>
           </w:tcPr>
           <w:p>
             <w:pPr>
+              <w:keepNext w:val="0"/>
               <w:spacing w:after="30" w:line="280" w:lineRule="exact"/>
             </w:pPr>
             <w:r>
@@ -6648,12 +6763,7 @@
     </w:tbl>
     <w:p>
       <w:pPr>
-        <w:spacing w:after="20" w:line="120" w:lineRule="auto"/>
-      </w:pPr>
-    </w:p>
-    <w:p>
-      <w:pPr>
-        <w:spacing w:after="140" w:line="360" w:lineRule="exact"/>
+        <w:spacing w:after="100" w:line="360" w:lineRule="exact"/>
       </w:pPr>
       <w:r>
         <w:rPr>
@@ -6662,13 +6772,12 @@
           <w:color w:val="000000"/>
           <w:sz w:val="23"/>
         </w:rPr>
-        <w:t>批量训练和自动评估可以提高效率，但判断仍应落在同一条证据链上：这次改变了什么，预期影响哪个失败阶段，用哪项指标判断有没有改善。当前记录已经给出一套有效的联合方案，尚未给出普遍最优参数。</w:t>
+        <w:t>以后再遇到抓不起来，我们会先拿出对应阶段的画面、预测动作和接触记录，而不是直接加训练步数。每次改动都尽量回答一个具体问题：这次改了哪里，希望修好哪一步，结果是否真的变好。这样留下来的参数和经验，下一次才用得上。</w:t>
       </w:r>
     </w:p>
     <w:p>
       <w:pPr>
         <w:pStyle w:val="Heading1"/>
-        <w:pageBreakBefore/>
       </w:pPr>
       <w:r>
         <w:rPr>
@@ -6683,7 +6792,7 @@
     <w:p>
       <w:pPr>
         <w:pStyle w:val="ListBullet"/>
-        <w:spacing w:after="140" w:line="360" w:lineRule="exact"/>
+        <w:spacing w:after="100" w:line="360" w:lineRule="exact"/>
       </w:pPr>
       <w:hyperlink r:id="rId25">
         <w:r>
@@ -6709,7 +6818,7 @@
     <w:p>
       <w:pPr>
         <w:pStyle w:val="ListBullet"/>
-        <w:spacing w:after="140" w:line="360" w:lineRule="exact"/>
+        <w:spacing w:after="100" w:line="360" w:lineRule="exact"/>
       </w:pPr>
       <w:hyperlink r:id="rId26">
         <w:r>
@@ -6735,7 +6844,7 @@
     <w:p>
       <w:pPr>
         <w:pStyle w:val="ListBullet"/>
-        <w:spacing w:after="140" w:line="360" w:lineRule="exact"/>
+        <w:spacing w:after="100" w:line="360" w:lineRule="exact"/>
       </w:pPr>
       <w:hyperlink r:id="rId27">
         <w:r>
@@ -6761,7 +6870,7 @@
     <w:p>
       <w:pPr>
         <w:pStyle w:val="ListBullet"/>
-        <w:spacing w:after="140" w:line="360" w:lineRule="exact"/>
+        <w:spacing w:after="100" w:line="360" w:lineRule="exact"/>
       </w:pPr>
       <w:hyperlink r:id="rId28">
         <w:r>
@@ -6787,7 +6896,7 @@
     <w:p>
       <w:pPr>
         <w:pStyle w:val="ListBullet"/>
-        <w:spacing w:after="140" w:line="360" w:lineRule="exact"/>
+        <w:spacing w:after="100" w:line="360" w:lineRule="exact"/>
       </w:pPr>
       <w:hyperlink r:id="rId29">
         <w:r>
@@ -6813,7 +6922,7 @@
     <w:p>
       <w:pPr>
         <w:pStyle w:val="ListBullet"/>
-        <w:spacing w:after="140" w:line="360" w:lineRule="exact"/>
+        <w:spacing w:after="100" w:line="360" w:lineRule="exact"/>
       </w:pPr>
       <w:hyperlink r:id="rId30">
         <w:r>
@@ -6839,7 +6948,7 @@
     <w:p>
       <w:pPr>
         <w:pStyle w:val="ListBullet"/>
-        <w:spacing w:after="140" w:line="360" w:lineRule="exact"/>
+        <w:spacing w:after="100" w:line="360" w:lineRule="exact"/>
       </w:pPr>
       <w:hyperlink r:id="rId31">
         <w:r>
@@ -6865,7 +6974,7 @@
     <w:p>
       <w:pPr>
         <w:pStyle w:val="ListBullet"/>
-        <w:spacing w:after="140" w:line="360" w:lineRule="exact"/>
+        <w:spacing w:after="100" w:line="360" w:lineRule="exact"/>
       </w:pPr>
       <w:hyperlink r:id="rId32">
         <w:r>
@@ -6891,7 +7000,7 @@
     <w:p>
       <w:pPr>
         <w:pStyle w:val="ListBullet"/>
-        <w:spacing w:after="140" w:line="360" w:lineRule="exact"/>
+        <w:spacing w:after="100" w:line="360" w:lineRule="exact"/>
       </w:pPr>
       <w:hyperlink r:id="rId33">
         <w:r>
@@ -6917,7 +7026,7 @@
     <w:p>
       <w:pPr>
         <w:pStyle w:val="ListBullet"/>
-        <w:spacing w:after="140" w:line="360" w:lineRule="exact"/>
+        <w:spacing w:after="100" w:line="360" w:lineRule="exact"/>
       </w:pPr>
       <w:hyperlink r:id="rId34">
         <w:r>
@@ -6943,7 +7052,7 @@
     <w:p>
       <w:pPr>
         <w:pStyle w:val="ListBullet"/>
-        <w:spacing w:after="140" w:line="360" w:lineRule="exact"/>
+        <w:spacing w:after="100" w:line="360" w:lineRule="exact"/>
       </w:pPr>
       <w:hyperlink r:id="rId35">
         <w:r>
@@ -6968,7 +7077,7 @@
     </w:p>
     <w:p>
       <w:pPr>
-        <w:spacing w:after="140" w:line="360" w:lineRule="exact"/>
+        <w:spacing w:after="100" w:line="360" w:lineRule="exact"/>
       </w:pPr>
       <w:r>
         <w:rPr>
@@ -6977,12 +7086,12 @@
           <w:color w:val="000000"/>
           <w:sz w:val="23"/>
         </w:rPr>
-        <w:t>行号链接固定到归档版本，避免后续仓库整理改变旧实验所指代码。ACT和LeRobot属于原作者的开源工作；本项目署名对应场景集成、数据适配、训练与执行迭代、验证和经验整理。公开数据与初始模型来自nikodembartnik，原始数据50回合、20,948帧。</w:t>
+        <w:t>源码行号固定到归档版本，便于把文中的改动与实现对上。ACT和LeRobot来自原作者的开源工作，公开数据与初始模型来自nikodembartnik，数据共50回合、20,948帧。我们在此基础上完成场景集成、数据适配、训练与执行迭代，并把验证和排错过程整理成这份记录。</w:t>
       </w:r>
     </w:p>
     <w:p>
       <w:pPr>
-        <w:spacing w:after="140" w:line="360" w:lineRule="exact"/>
+        <w:spacing w:after="100" w:line="360" w:lineRule="exact"/>
       </w:pPr>
       <w:r>
         <w:rPr>
@@ -6991,7 +7100,7 @@
           <w:color w:val="000000"/>
           <w:sz w:val="23"/>
         </w:rPr>
-        <w:t>本次排版与叙述更新没有重新训练模型、执行新的物理回合或改变原验证成绩。曲线和位置图均由已保存日志绘制。建议读者先读本报告理解迭代顺序，再按完整复现指南准备材料；报告中的历史成功率不是对另一台机器的结果承诺。</w:t>
+        <w:t>本文使用已有训练日志、物理回合和验证结果，曲线与位置图也由这些记录绘制。准备亲自复现时，可以先按前两节理解我们为什么改，再按复现指南备齐材料；遇到不同结果，就从对应阶段的输入、预测和执行记录查起。</w:t>
       </w:r>
     </w:p>
     <w:sectPr>
@@ -7420,7 +7529,7 @@
     <w:rsid w:val="00FC693F"/>
     <w:pPr>
       <w:widowControl/>
-      <w:spacing w:after="140" w:line="360" w:lineRule="exact"/>
+      <w:spacing w:after="100" w:line="360" w:lineRule="exact"/>
     </w:pPr>
     <w:rPr>
       <w:rFonts w:ascii="Arial" w:hAnsi="Arial" w:eastAsia="Microsoft YaHei"/>
@@ -7490,7 +7599,7 @@
       <w:keepNext/>
       <w:keepLines/>
       <w:widowControl/>
-      <w:spacing w:before="220" w:after="140" w:line="440" w:lineRule="exact"/>
+      <w:spacing w:before="200" w:after="100" w:line="440" w:lineRule="exact"/>
       <w:outlineLvl w:val="0"/>
     </w:pPr>
     <w:rPr>
@@ -7515,7 +7624,7 @@
       <w:keepNext/>
       <w:keepLines/>
       <w:widowControl/>
-      <w:spacing w:before="220" w:after="140" w:line="380" w:lineRule="exact"/>
+      <w:spacing w:before="200" w:after="100" w:line="380" w:lineRule="exact"/>
       <w:outlineLvl w:val="1"/>
     </w:pPr>
     <w:rPr>
@@ -7540,7 +7649,7 @@
       <w:keepNext/>
       <w:keepLines/>
       <w:widowControl/>
-      <w:spacing w:before="220" w:after="140" w:line="380" w:lineRule="exact"/>
+      <w:spacing w:before="200" w:after="100" w:line="380" w:lineRule="exact"/>
       <w:outlineLvl w:val="2"/>
     </w:pPr>
     <w:rPr>

</xml_diff>